<commit_message>
add project perspective & product function
</commit_message>
<xml_diff>
--- a/doc/task.docx
+++ b/doc/task.docx
@@ -1563,8 +1563,2305 @@
         <w:rPr>
           <w:sz w:val="28"/>
           <w:szCs w:val="28"/>
-        </w:rPr>
-      </w:pPr>
+          <w:rtl/>
+        </w:rPr>
+      </w:pPr>
+    </w:p>
+    <w:p>
+      <w:pPr>
+        <w:rPr>
+          <w:sz w:val="28"/>
+          <w:szCs w:val="28"/>
+          <w:rtl/>
+        </w:rPr>
+      </w:pPr>
+    </w:p>
+    <w:p>
+      <w:pPr>
+        <w:rPr>
+          <w:b/>
+          <w:bCs/>
+          <w:sz w:val="40"/>
+          <w:szCs w:val="40"/>
+        </w:rPr>
+      </w:pPr>
+      <w:r>
+        <w:rPr>
+          <w:b/>
+          <w:bCs/>
+          <w:sz w:val="40"/>
+          <w:szCs w:val="40"/>
+        </w:rPr>
+        <w:t>2. Overall Description</w:t>
+      </w:r>
+    </w:p>
+    <w:p>
+      <w:pPr>
+        <w:rPr>
+          <w:b/>
+          <w:bCs/>
+          <w:sz w:val="28"/>
+          <w:szCs w:val="28"/>
+        </w:rPr>
+      </w:pPr>
+      <w:r>
+        <w:rPr>
+          <w:b/>
+          <w:bCs/>
+          <w:sz w:val="28"/>
+          <w:szCs w:val="28"/>
+        </w:rPr>
+        <w:t>2.1 Product Perspective</w:t>
+      </w:r>
+    </w:p>
+    <w:p>
+      <w:pPr>
+        <w:rPr>
+          <w:sz w:val="28"/>
+          <w:szCs w:val="28"/>
+        </w:rPr>
+      </w:pPr>
+    </w:p>
+    <w:p>
+      <w:pPr>
+        <w:rPr>
+          <w:sz w:val="28"/>
+          <w:szCs w:val="28"/>
+        </w:rPr>
+      </w:pPr>
+      <w:r>
+        <w:rPr>
+          <w:sz w:val="28"/>
+          <w:szCs w:val="28"/>
+        </w:rPr>
+        <w:t>The Fit</w:t>
+      </w:r>
+      <w:r>
+        <w:rPr>
+          <w:sz w:val="28"/>
+          <w:szCs w:val="28"/>
+        </w:rPr>
+        <w:t>-</w:t>
+      </w:r>
+      <w:r>
+        <w:rPr>
+          <w:sz w:val="28"/>
+          <w:szCs w:val="28"/>
+        </w:rPr>
+        <w:t>Track System is a new, fully integrated web-based and mobile-enabled platform designed to manage gym operations, online coaching, and fitness-related e-commerce activities within a unified ecosystem.</w:t>
+      </w:r>
+    </w:p>
+    <w:p>
+      <w:pPr>
+        <w:rPr>
+          <w:sz w:val="28"/>
+          <w:szCs w:val="28"/>
+        </w:rPr>
+      </w:pPr>
+    </w:p>
+    <w:p>
+      <w:pPr>
+        <w:rPr>
+          <w:sz w:val="28"/>
+          <w:szCs w:val="28"/>
+        </w:rPr>
+      </w:pPr>
+      <w:r>
+        <w:rPr>
+          <w:sz w:val="28"/>
+          <w:szCs w:val="28"/>
+        </w:rPr>
+        <w:t>It is not an extension of any existing system, but rather a standalone solution that combines three core modules:</w:t>
+      </w:r>
+    </w:p>
+    <w:p>
+      <w:pPr>
+        <w:rPr>
+          <w:sz w:val="28"/>
+          <w:szCs w:val="28"/>
+        </w:rPr>
+      </w:pPr>
+    </w:p>
+    <w:p>
+      <w:pPr>
+        <w:pStyle w:val="ListParagraph"/>
+        <w:numPr>
+          <w:ilvl w:val="1"/>
+          <w:numId w:val="5"/>
+        </w:numPr>
+        <w:rPr>
+          <w:sz w:val="28"/>
+          <w:szCs w:val="28"/>
+        </w:rPr>
+      </w:pPr>
+      <w:r>
+        <w:rPr>
+          <w:b/>
+          <w:bCs/>
+          <w:sz w:val="28"/>
+          <w:szCs w:val="28"/>
+        </w:rPr>
+        <w:t>Gym Management Module</w:t>
+      </w:r>
+      <w:r>
+        <w:rPr>
+          <w:sz w:val="28"/>
+          <w:szCs w:val="28"/>
+        </w:rPr>
+        <w:t xml:space="preserve"> – Handles memberships, subscriptions, trainers, and schedules.</w:t>
+      </w:r>
+    </w:p>
+    <w:p>
+      <w:pPr>
+        <w:rPr>
+          <w:sz w:val="28"/>
+          <w:szCs w:val="28"/>
+        </w:rPr>
+      </w:pPr>
+    </w:p>
+    <w:p>
+      <w:pPr>
+        <w:pStyle w:val="ListParagraph"/>
+        <w:numPr>
+          <w:ilvl w:val="1"/>
+          <w:numId w:val="5"/>
+        </w:numPr>
+        <w:rPr>
+          <w:sz w:val="28"/>
+          <w:szCs w:val="28"/>
+        </w:rPr>
+      </w:pPr>
+      <w:r>
+        <w:rPr>
+          <w:b/>
+          <w:bCs/>
+          <w:sz w:val="28"/>
+          <w:szCs w:val="28"/>
+        </w:rPr>
+        <w:t xml:space="preserve"> </w:t>
+      </w:r>
+      <w:r>
+        <w:rPr>
+          <w:b/>
+          <w:bCs/>
+          <w:sz w:val="28"/>
+          <w:szCs w:val="28"/>
+        </w:rPr>
+        <w:t>Online Coaching Module</w:t>
+      </w:r>
+      <w:r>
+        <w:rPr>
+          <w:sz w:val="28"/>
+          <w:szCs w:val="28"/>
+        </w:rPr>
+        <w:t xml:space="preserve"> – Enables remote workout and nutrition planning, progress tracking, and communication between coaches and clients.</w:t>
+      </w:r>
+    </w:p>
+    <w:p>
+      <w:pPr>
+        <w:rPr>
+          <w:sz w:val="28"/>
+          <w:szCs w:val="28"/>
+        </w:rPr>
+      </w:pPr>
+    </w:p>
+    <w:p>
+      <w:pPr>
+        <w:pStyle w:val="ListParagraph"/>
+        <w:numPr>
+          <w:ilvl w:val="1"/>
+          <w:numId w:val="5"/>
+        </w:numPr>
+        <w:rPr>
+          <w:sz w:val="28"/>
+          <w:szCs w:val="28"/>
+        </w:rPr>
+      </w:pPr>
+      <w:r>
+        <w:rPr>
+          <w:b/>
+          <w:bCs/>
+          <w:sz w:val="28"/>
+          <w:szCs w:val="28"/>
+        </w:rPr>
+        <w:t>E</w:t>
+      </w:r>
+      <w:r>
+        <w:rPr>
+          <w:b/>
+          <w:bCs/>
+          <w:sz w:val="28"/>
+          <w:szCs w:val="28"/>
+        </w:rPr>
+        <w:t>-</w:t>
+      </w:r>
+      <w:r>
+        <w:rPr>
+          <w:b/>
+          <w:bCs/>
+          <w:sz w:val="28"/>
+          <w:szCs w:val="28"/>
+        </w:rPr>
+        <w:t>Commerce Module</w:t>
+      </w:r>
+      <w:r>
+        <w:rPr>
+          <w:sz w:val="28"/>
+          <w:szCs w:val="28"/>
+        </w:rPr>
+        <w:t xml:space="preserve"> – Allows users to browse and purchase fitness equipment, protein products, and supplements directly from the platform.</w:t>
+      </w:r>
+    </w:p>
+    <w:p>
+      <w:pPr>
+        <w:rPr>
+          <w:sz w:val="28"/>
+          <w:szCs w:val="28"/>
+        </w:rPr>
+      </w:pPr>
+    </w:p>
+    <w:p>
+      <w:pPr>
+        <w:rPr>
+          <w:sz w:val="28"/>
+          <w:szCs w:val="28"/>
+        </w:rPr>
+      </w:pPr>
+      <w:r>
+        <w:rPr>
+          <w:sz w:val="28"/>
+          <w:szCs w:val="28"/>
+        </w:rPr>
+        <w:t>The system operates as a client-server architecture, where:</w:t>
+      </w:r>
+    </w:p>
+    <w:p>
+      <w:pPr>
+        <w:rPr>
+          <w:sz w:val="28"/>
+          <w:szCs w:val="28"/>
+        </w:rPr>
+      </w:pPr>
+    </w:p>
+    <w:p>
+      <w:pPr>
+        <w:rPr>
+          <w:sz w:val="28"/>
+          <w:szCs w:val="28"/>
+        </w:rPr>
+      </w:pPr>
+      <w:r>
+        <w:rPr>
+          <w:sz w:val="28"/>
+          <w:szCs w:val="28"/>
+        </w:rPr>
+        <w:t>The Frontend (React.js and React Native) provides interactive web and mobile user interfaces.</w:t>
+      </w:r>
+    </w:p>
+    <w:p>
+      <w:pPr>
+        <w:rPr>
+          <w:sz w:val="28"/>
+          <w:szCs w:val="28"/>
+        </w:rPr>
+      </w:pPr>
+    </w:p>
+    <w:p>
+      <w:pPr>
+        <w:rPr>
+          <w:sz w:val="28"/>
+          <w:szCs w:val="28"/>
+        </w:rPr>
+      </w:pPr>
+      <w:r>
+        <w:rPr>
+          <w:sz w:val="28"/>
+          <w:szCs w:val="28"/>
+        </w:rPr>
+        <w:t>The Backend (ASP.NET Core Web API) manages business logic, authentication, and data processing.</w:t>
+      </w:r>
+    </w:p>
+    <w:p>
+      <w:pPr>
+        <w:rPr>
+          <w:sz w:val="28"/>
+          <w:szCs w:val="28"/>
+        </w:rPr>
+      </w:pPr>
+    </w:p>
+    <w:p>
+      <w:pPr>
+        <w:rPr>
+          <w:sz w:val="28"/>
+          <w:szCs w:val="28"/>
+        </w:rPr>
+      </w:pPr>
+      <w:r>
+        <w:rPr>
+          <w:sz w:val="28"/>
+          <w:szCs w:val="28"/>
+        </w:rPr>
+        <w:t>The Database (Microsoft SQL Server) stores user data, workout logs, product details, and transaction records.</w:t>
+      </w:r>
+    </w:p>
+    <w:p>
+      <w:pPr>
+        <w:rPr>
+          <w:sz w:val="28"/>
+          <w:szCs w:val="28"/>
+        </w:rPr>
+      </w:pPr>
+    </w:p>
+    <w:p>
+      <w:pPr>
+        <w:rPr>
+          <w:sz w:val="28"/>
+          <w:szCs w:val="28"/>
+        </w:rPr>
+      </w:pPr>
+      <w:r>
+        <w:rPr>
+          <w:sz w:val="28"/>
+          <w:szCs w:val="28"/>
+        </w:rPr>
+        <w:t>The AI Chatbot (OpenAI API integration) serves as an intelligent assistant that interacts with both coaches and members, providing personalized fitness tips, answering nutrition questions, and automating basic support requests.</w:t>
+      </w:r>
+    </w:p>
+    <w:p>
+      <w:pPr>
+        <w:rPr>
+          <w:sz w:val="28"/>
+          <w:szCs w:val="28"/>
+        </w:rPr>
+      </w:pPr>
+    </w:p>
+    <w:p>
+      <w:pPr>
+        <w:rPr>
+          <w:sz w:val="28"/>
+          <w:szCs w:val="28"/>
+        </w:rPr>
+      </w:pPr>
+      <w:r>
+        <w:rPr>
+          <w:sz w:val="28"/>
+          <w:szCs w:val="28"/>
+        </w:rPr>
+        <w:t>Additionally, the platform communicates with external payment gateways (Stripe/PayPal) for secure online transactions and supports JWT-based authentication to ensure data security and privacy.</w:t>
+      </w:r>
+    </w:p>
+    <w:p>
+      <w:pPr>
+        <w:rPr>
+          <w:sz w:val="28"/>
+          <w:szCs w:val="28"/>
+        </w:rPr>
+      </w:pPr>
+    </w:p>
+    <w:p>
+      <w:pPr>
+        <w:rPr>
+          <w:sz w:val="28"/>
+          <w:szCs w:val="28"/>
+        </w:rPr>
+      </w:pPr>
+      <w:r>
+        <w:rPr>
+          <w:sz w:val="28"/>
+          <w:szCs w:val="28"/>
+        </w:rPr>
+        <w:t>A high-level view of the Fit</w:t>
+      </w:r>
+      <w:r>
+        <w:rPr>
+          <w:sz w:val="28"/>
+          <w:szCs w:val="28"/>
+        </w:rPr>
+        <w:t>-</w:t>
+      </w:r>
+      <w:r>
+        <w:rPr>
+          <w:sz w:val="28"/>
+          <w:szCs w:val="28"/>
+        </w:rPr>
+        <w:t>Track ecosystem can be summarized as follows:</w:t>
+      </w:r>
+    </w:p>
+    <w:p>
+      <w:pPr>
+        <w:rPr>
+          <w:sz w:val="28"/>
+          <w:szCs w:val="28"/>
+        </w:rPr>
+      </w:pPr>
+    </w:p>
+    <w:p>
+      <w:pPr>
+        <w:rPr>
+          <w:sz w:val="28"/>
+          <w:szCs w:val="28"/>
+          <w:rtl/>
+        </w:rPr>
+      </w:pPr>
+      <w:r>
+        <w:rPr>
+          <w:sz w:val="28"/>
+          <w:szCs w:val="28"/>
+        </w:rPr>
+        <w:t>Users (Admin, Coach, Member) → interact via Web/Mobile UI (React.js / React Native) → send requests to ASP.NET Core API → data stored in SQL Server → AI queries handled through OpenAI API → optional connection to Payment Gateway APIs.</w:t>
+      </w:r>
+    </w:p>
+    <w:p>
+      <w:pPr>
+        <w:rPr>
+          <w:sz w:val="28"/>
+          <w:szCs w:val="28"/>
+          <w:lang w:val="en-GB"/>
+        </w:rPr>
+      </w:pPr>
+      <w:r>
+        <w:rPr>
+          <w:sz w:val="28"/>
+          <w:szCs w:val="28"/>
+          <w:lang w:val="en-GB"/>
+        </w:rPr>
+        <w:t>Here System Context Diagram:</w:t>
+      </w:r>
+    </w:p>
+    <w:p>
+      <w:pPr>
+        <w:rPr>
+          <w:sz w:val="28"/>
+          <w:szCs w:val="28"/>
+        </w:rPr>
+      </w:pPr>
+    </w:p>
+    <w:p>
+      <w:pPr>
+        <w:rPr>
+          <w:noProof/>
+          <w:sz w:val="28"/>
+          <w:szCs w:val="28"/>
+          <w:rtl/>
+        </w:rPr>
+      </w:pPr>
+      <w:r>
+        <w:rPr>
+          <w:noProof/>
+          <w:sz w:val="28"/>
+          <w:szCs w:val="28"/>
+        </w:rPr>
+        <w:drawing>
+          <wp:inline distT="0" distB="0" distL="0" distR="0" wp14:anchorId="3C3F32B5" wp14:editId="44B4ABCC">
+            <wp:extent cx="5943600" cy="3962400"/>
+            <wp:effectExtent l="0" t="0" r="0" b="0"/>
+            <wp:docPr id="1275792018" name="Picture 1" descr="A diagram of a web application&#10;&#10;AI-generated content may be incorrect."/>
+            <wp:cNvGraphicFramePr>
+              <a:graphicFrameLocks xmlns:a="http://schemas.openxmlformats.org/drawingml/2006/main" noChangeAspect="1"/>
+            </wp:cNvGraphicFramePr>
+            <a:graphic xmlns:a="http://schemas.openxmlformats.org/drawingml/2006/main">
+              <a:graphicData uri="http://schemas.openxmlformats.org/drawingml/2006/picture">
+                <pic:pic xmlns:pic="http://schemas.openxmlformats.org/drawingml/2006/picture">
+                  <pic:nvPicPr>
+                    <pic:cNvPr id="1275792018" name="Picture 1" descr="A diagram of a web application&#10;&#10;AI-generated content may be incorrect."/>
+                    <pic:cNvPicPr>
+                      <a:picLocks noChangeAspect="1" noChangeArrowheads="1"/>
+                    </pic:cNvPicPr>
+                  </pic:nvPicPr>
+                  <pic:blipFill>
+                    <a:blip r:embed="rId9">
+                      <a:extLst>
+                        <a:ext uri="{28A0092B-C50C-407E-A947-70E740481C1C}">
+                          <a14:useLocalDpi xmlns:a14="http://schemas.microsoft.com/office/drawing/2010/main" val="0"/>
+                        </a:ext>
+                      </a:extLst>
+                    </a:blip>
+                    <a:srcRect/>
+                    <a:stretch>
+                      <a:fillRect/>
+                    </a:stretch>
+                  </pic:blipFill>
+                  <pic:spPr bwMode="auto">
+                    <a:xfrm>
+                      <a:off x="0" y="0"/>
+                      <a:ext cx="5943600" cy="3962400"/>
+                    </a:xfrm>
+                    <a:prstGeom prst="rect">
+                      <a:avLst/>
+                    </a:prstGeom>
+                    <a:noFill/>
+                    <a:ln>
+                      <a:noFill/>
+                    </a:ln>
+                  </pic:spPr>
+                </pic:pic>
+              </a:graphicData>
+            </a:graphic>
+          </wp:inline>
+        </w:drawing>
+      </w:r>
+    </w:p>
+    <w:p>
+      <w:pPr>
+        <w:rPr>
+          <w:b/>
+          <w:bCs/>
+          <w:sz w:val="40"/>
+          <w:szCs w:val="40"/>
+          <w:lang w:bidi="ar-EG"/>
+        </w:rPr>
+      </w:pPr>
+      <w:r>
+        <w:rPr>
+          <w:b/>
+          <w:bCs/>
+          <w:sz w:val="40"/>
+          <w:szCs w:val="40"/>
+          <w:lang w:bidi="ar-EG"/>
+        </w:rPr>
+        <w:lastRenderedPageBreak/>
+        <w:t>2.2 Product Functions</w:t>
+      </w:r>
+    </w:p>
+    <w:p>
+      <w:pPr>
+        <w:rPr>
+          <w:sz w:val="28"/>
+          <w:szCs w:val="28"/>
+          <w:lang w:bidi="ar-EG"/>
+        </w:rPr>
+      </w:pPr>
+      <w:r>
+        <w:rPr>
+          <w:sz w:val="28"/>
+          <w:szCs w:val="28"/>
+          <w:lang w:bidi="ar-EG"/>
+        </w:rPr>
+        <w:t xml:space="preserve">The </w:t>
+      </w:r>
+      <w:r>
+        <w:rPr>
+          <w:b/>
+          <w:bCs/>
+          <w:sz w:val="28"/>
+          <w:szCs w:val="28"/>
+          <w:lang w:bidi="ar-EG"/>
+        </w:rPr>
+        <w:t>Fit</w:t>
+      </w:r>
+      <w:r>
+        <w:rPr>
+          <w:b/>
+          <w:bCs/>
+          <w:sz w:val="28"/>
+          <w:szCs w:val="28"/>
+          <w:lang w:bidi="ar-EG"/>
+        </w:rPr>
+        <w:t>-</w:t>
+      </w:r>
+      <w:r>
+        <w:rPr>
+          <w:b/>
+          <w:bCs/>
+          <w:sz w:val="28"/>
+          <w:szCs w:val="28"/>
+          <w:lang w:bidi="ar-EG"/>
+        </w:rPr>
+        <w:t>Track System</w:t>
+      </w:r>
+      <w:r>
+        <w:rPr>
+          <w:sz w:val="28"/>
+          <w:szCs w:val="28"/>
+          <w:lang w:bidi="ar-EG"/>
+        </w:rPr>
+        <w:t xml:space="preserve"> provides a comprehensive set of functions that collectively manage gym operations, online coaching, and e-commerce activities within a single platform.</w:t>
+      </w:r>
+      <w:r>
+        <w:rPr>
+          <w:sz w:val="28"/>
+          <w:szCs w:val="28"/>
+          <w:lang w:bidi="ar-EG"/>
+        </w:rPr>
+        <w:br/>
+        <w:t>The main functions of the system are summarized below:</w:t>
+      </w:r>
+    </w:p>
+    <w:p>
+      <w:pPr>
+        <w:rPr>
+          <w:sz w:val="28"/>
+          <w:szCs w:val="28"/>
+          <w:lang w:bidi="ar-EG"/>
+        </w:rPr>
+      </w:pPr>
+      <w:r>
+        <w:rPr>
+          <w:sz w:val="28"/>
+          <w:szCs w:val="28"/>
+          <w:lang w:bidi="ar-EG"/>
+        </w:rPr>
+        <w:pict w14:anchorId="5997551D">
+          <v:rect id="_x0000_i1086" style="width:0;height:1.5pt" o:hralign="center" o:hrstd="t" o:hr="t" fillcolor="#a0a0a0" stroked="f"/>
+        </w:pict>
+      </w:r>
+    </w:p>
+    <w:p>
+      <w:pPr>
+        <w:rPr>
+          <w:b/>
+          <w:bCs/>
+          <w:sz w:val="28"/>
+          <w:szCs w:val="28"/>
+          <w:lang w:bidi="ar-EG"/>
+        </w:rPr>
+      </w:pPr>
+      <w:r>
+        <w:rPr>
+          <w:rFonts w:ascii="Segoe UI Emoji" w:hAnsi="Segoe UI Emoji" w:cs="Segoe UI Emoji"/>
+          <w:b/>
+          <w:bCs/>
+          <w:sz w:val="28"/>
+          <w:szCs w:val="28"/>
+          <w:lang w:bidi="ar-EG"/>
+        </w:rPr>
+        <w:t>🧍</w:t>
+      </w:r>
+      <w:r>
+        <w:rPr>
+          <w:b/>
+          <w:bCs/>
+          <w:sz w:val="28"/>
+          <w:szCs w:val="28"/>
+          <w:lang w:bidi="ar-EG"/>
+        </w:rPr>
+        <w:t>‍</w:t>
+      </w:r>
+      <w:r>
+        <w:rPr>
+          <w:rFonts w:ascii="Segoe UI Emoji" w:hAnsi="Segoe UI Emoji" w:cs="Segoe UI Emoji"/>
+          <w:b/>
+          <w:bCs/>
+          <w:sz w:val="28"/>
+          <w:szCs w:val="28"/>
+          <w:lang w:bidi="ar-EG"/>
+        </w:rPr>
+        <w:t>♂️</w:t>
+      </w:r>
+      <w:r>
+        <w:rPr>
+          <w:b/>
+          <w:bCs/>
+          <w:sz w:val="28"/>
+          <w:szCs w:val="28"/>
+          <w:lang w:bidi="ar-EG"/>
+        </w:rPr>
+        <w:t xml:space="preserve"> 1. User Management</w:t>
+      </w:r>
+    </w:p>
+    <w:p>
+      <w:pPr>
+        <w:numPr>
+          <w:ilvl w:val="0"/>
+          <w:numId w:val="7"/>
+        </w:numPr>
+        <w:rPr>
+          <w:sz w:val="28"/>
+          <w:szCs w:val="28"/>
+          <w:lang w:bidi="ar-EG"/>
+        </w:rPr>
+      </w:pPr>
+      <w:r>
+        <w:rPr>
+          <w:sz w:val="28"/>
+          <w:szCs w:val="28"/>
+          <w:lang w:bidi="ar-EG"/>
+        </w:rPr>
+        <w:t>Allows users (Admin, Coach, Member) to register, log in, and manage their profiles.</w:t>
+      </w:r>
+    </w:p>
+    <w:p>
+      <w:pPr>
+        <w:numPr>
+          <w:ilvl w:val="0"/>
+          <w:numId w:val="7"/>
+        </w:numPr>
+        <w:rPr>
+          <w:sz w:val="28"/>
+          <w:szCs w:val="28"/>
+          <w:lang w:bidi="ar-EG"/>
+        </w:rPr>
+      </w:pPr>
+      <w:r>
+        <w:rPr>
+          <w:sz w:val="28"/>
+          <w:szCs w:val="28"/>
+          <w:lang w:bidi="ar-EG"/>
+        </w:rPr>
+        <w:t xml:space="preserve">Supports </w:t>
+      </w:r>
+      <w:r>
+        <w:rPr>
+          <w:b/>
+          <w:bCs/>
+          <w:sz w:val="28"/>
+          <w:szCs w:val="28"/>
+          <w:lang w:bidi="ar-EG"/>
+        </w:rPr>
+        <w:t>role-based access control</w:t>
+      </w:r>
+      <w:r>
+        <w:rPr>
+          <w:sz w:val="28"/>
+          <w:szCs w:val="28"/>
+          <w:lang w:bidi="ar-EG"/>
+        </w:rPr>
+        <w:t xml:space="preserve"> — each user type has different permissions.</w:t>
+      </w:r>
+    </w:p>
+    <w:p>
+      <w:pPr>
+        <w:numPr>
+          <w:ilvl w:val="0"/>
+          <w:numId w:val="7"/>
+        </w:numPr>
+        <w:rPr>
+          <w:sz w:val="28"/>
+          <w:szCs w:val="28"/>
+          <w:lang w:bidi="ar-EG"/>
+        </w:rPr>
+      </w:pPr>
+      <w:r>
+        <w:rPr>
+          <w:sz w:val="28"/>
+          <w:szCs w:val="28"/>
+          <w:lang w:bidi="ar-EG"/>
+        </w:rPr>
+        <w:t xml:space="preserve">Enables password reset and authentication using </w:t>
+      </w:r>
+      <w:r>
+        <w:rPr>
+          <w:b/>
+          <w:bCs/>
+          <w:sz w:val="28"/>
+          <w:szCs w:val="28"/>
+          <w:lang w:bidi="ar-EG"/>
+        </w:rPr>
+        <w:t>JWT</w:t>
+      </w:r>
+      <w:r>
+        <w:rPr>
+          <w:sz w:val="28"/>
+          <w:szCs w:val="28"/>
+          <w:lang w:bidi="ar-EG"/>
+        </w:rPr>
+        <w:t xml:space="preserve"> tokens.</w:t>
+      </w:r>
+    </w:p>
+    <w:p>
+      <w:pPr>
+        <w:rPr>
+          <w:sz w:val="28"/>
+          <w:szCs w:val="28"/>
+          <w:lang w:bidi="ar-EG"/>
+        </w:rPr>
+      </w:pPr>
+      <w:r>
+        <w:rPr>
+          <w:sz w:val="28"/>
+          <w:szCs w:val="28"/>
+          <w:lang w:bidi="ar-EG"/>
+        </w:rPr>
+        <w:pict w14:anchorId="1DA91E8A">
+          <v:rect id="_x0000_i1087" style="width:0;height:1.5pt" o:hralign="center" o:hrstd="t" o:hr="t" fillcolor="#a0a0a0" stroked="f"/>
+        </w:pict>
+      </w:r>
+    </w:p>
+    <w:p>
+      <w:pPr>
+        <w:rPr>
+          <w:b/>
+          <w:bCs/>
+          <w:sz w:val="28"/>
+          <w:szCs w:val="28"/>
+          <w:lang w:bidi="ar-EG"/>
+        </w:rPr>
+      </w:pPr>
+      <w:r>
+        <w:rPr>
+          <w:rFonts w:ascii="Segoe UI Emoji" w:hAnsi="Segoe UI Emoji" w:cs="Segoe UI Emoji"/>
+          <w:b/>
+          <w:bCs/>
+          <w:sz w:val="28"/>
+          <w:szCs w:val="28"/>
+          <w:lang w:bidi="ar-EG"/>
+        </w:rPr>
+        <w:t>🏋️</w:t>
+      </w:r>
+      <w:r>
+        <w:rPr>
+          <w:b/>
+          <w:bCs/>
+          <w:sz w:val="28"/>
+          <w:szCs w:val="28"/>
+          <w:lang w:bidi="ar-EG"/>
+        </w:rPr>
+        <w:t>‍</w:t>
+      </w:r>
+      <w:r>
+        <w:rPr>
+          <w:rFonts w:ascii="Segoe UI Emoji" w:hAnsi="Segoe UI Emoji" w:cs="Segoe UI Emoji"/>
+          <w:b/>
+          <w:bCs/>
+          <w:sz w:val="28"/>
+          <w:szCs w:val="28"/>
+          <w:lang w:bidi="ar-EG"/>
+        </w:rPr>
+        <w:t>♀️</w:t>
+      </w:r>
+      <w:r>
+        <w:rPr>
+          <w:b/>
+          <w:bCs/>
+          <w:sz w:val="28"/>
+          <w:szCs w:val="28"/>
+          <w:lang w:bidi="ar-EG"/>
+        </w:rPr>
+        <w:t xml:space="preserve"> 2. Membership &amp; Gym Management</w:t>
+      </w:r>
+    </w:p>
+    <w:p>
+      <w:pPr>
+        <w:numPr>
+          <w:ilvl w:val="0"/>
+          <w:numId w:val="8"/>
+        </w:numPr>
+        <w:rPr>
+          <w:sz w:val="28"/>
+          <w:szCs w:val="28"/>
+          <w:lang w:bidi="ar-EG"/>
+        </w:rPr>
+      </w:pPr>
+      <w:r>
+        <w:rPr>
+          <w:sz w:val="28"/>
+          <w:szCs w:val="28"/>
+          <w:lang w:bidi="ar-EG"/>
+        </w:rPr>
+        <w:t>Admin can create and manage gym branches, membership plans, and subscriptions.</w:t>
+      </w:r>
+    </w:p>
+    <w:p>
+      <w:pPr>
+        <w:numPr>
+          <w:ilvl w:val="0"/>
+          <w:numId w:val="8"/>
+        </w:numPr>
+        <w:rPr>
+          <w:sz w:val="28"/>
+          <w:szCs w:val="28"/>
+          <w:lang w:bidi="ar-EG"/>
+        </w:rPr>
+      </w:pPr>
+      <w:r>
+        <w:rPr>
+          <w:sz w:val="28"/>
+          <w:szCs w:val="28"/>
+          <w:lang w:bidi="ar-EG"/>
+        </w:rPr>
+        <w:t>Coaches can track attendance, assign plans, and monitor client performance.</w:t>
+      </w:r>
+    </w:p>
+    <w:p>
+      <w:pPr>
+        <w:numPr>
+          <w:ilvl w:val="0"/>
+          <w:numId w:val="8"/>
+        </w:numPr>
+        <w:rPr>
+          <w:sz w:val="28"/>
+          <w:szCs w:val="28"/>
+          <w:lang w:bidi="ar-EG"/>
+        </w:rPr>
+      </w:pPr>
+      <w:r>
+        <w:rPr>
+          <w:sz w:val="28"/>
+          <w:szCs w:val="28"/>
+          <w:lang w:bidi="ar-EG"/>
+        </w:rPr>
+        <w:t>Members can renew or upgrade their subscriptions online.</w:t>
+      </w:r>
+    </w:p>
+    <w:p>
+      <w:pPr>
+        <w:rPr>
+          <w:sz w:val="28"/>
+          <w:szCs w:val="28"/>
+          <w:lang w:bidi="ar-EG"/>
+        </w:rPr>
+      </w:pPr>
+      <w:r>
+        <w:rPr>
+          <w:sz w:val="28"/>
+          <w:szCs w:val="28"/>
+          <w:lang w:bidi="ar-EG"/>
+        </w:rPr>
+        <w:pict w14:anchorId="7C056846">
+          <v:rect id="_x0000_i1088" style="width:0;height:1.5pt" o:hralign="center" o:hrstd="t" o:hr="t" fillcolor="#a0a0a0" stroked="f"/>
+        </w:pict>
+      </w:r>
+    </w:p>
+    <w:p>
+      <w:pPr>
+        <w:rPr>
+          <w:b/>
+          <w:bCs/>
+          <w:sz w:val="28"/>
+          <w:szCs w:val="28"/>
+          <w:lang w:bidi="ar-EG"/>
+        </w:rPr>
+      </w:pPr>
+      <w:r>
+        <w:rPr>
+          <w:rFonts w:ascii="Segoe UI Emoji" w:hAnsi="Segoe UI Emoji" w:cs="Segoe UI Emoji"/>
+          <w:b/>
+          <w:bCs/>
+          <w:sz w:val="28"/>
+          <w:szCs w:val="28"/>
+          <w:lang w:bidi="ar-EG"/>
+        </w:rPr>
+        <w:t>💪</w:t>
+      </w:r>
+      <w:r>
+        <w:rPr>
+          <w:b/>
+          <w:bCs/>
+          <w:sz w:val="28"/>
+          <w:szCs w:val="28"/>
+          <w:lang w:bidi="ar-EG"/>
+        </w:rPr>
+        <w:t xml:space="preserve"> 3. Workout &amp; Nutrition Planning</w:t>
+      </w:r>
+    </w:p>
+    <w:p>
+      <w:pPr>
+        <w:numPr>
+          <w:ilvl w:val="0"/>
+          <w:numId w:val="9"/>
+        </w:numPr>
+        <w:rPr>
+          <w:sz w:val="28"/>
+          <w:szCs w:val="28"/>
+          <w:lang w:bidi="ar-EG"/>
+        </w:rPr>
+      </w:pPr>
+      <w:r>
+        <w:rPr>
+          <w:sz w:val="28"/>
+          <w:szCs w:val="28"/>
+          <w:lang w:bidi="ar-EG"/>
+        </w:rPr>
+        <w:t xml:space="preserve">Coaches can design </w:t>
+      </w:r>
+      <w:r>
+        <w:rPr>
+          <w:b/>
+          <w:bCs/>
+          <w:sz w:val="28"/>
+          <w:szCs w:val="28"/>
+          <w:lang w:bidi="ar-EG"/>
+        </w:rPr>
+        <w:t xml:space="preserve">custom </w:t>
+      </w:r>
+      <w:proofErr w:type="gramStart"/>
+      <w:r>
+        <w:rPr>
+          <w:b/>
+          <w:bCs/>
+          <w:sz w:val="28"/>
+          <w:szCs w:val="28"/>
+          <w:lang w:bidi="ar-EG"/>
+        </w:rPr>
+        <w:t>workout</w:t>
+      </w:r>
+      <w:proofErr w:type="gramEnd"/>
+      <w:r>
+        <w:rPr>
+          <w:b/>
+          <w:bCs/>
+          <w:sz w:val="28"/>
+          <w:szCs w:val="28"/>
+          <w:lang w:bidi="ar-EG"/>
+        </w:rPr>
+        <w:t xml:space="preserve"> and diet plans</w:t>
+      </w:r>
+      <w:r>
+        <w:rPr>
+          <w:sz w:val="28"/>
+          <w:szCs w:val="28"/>
+          <w:lang w:bidi="ar-EG"/>
+        </w:rPr>
+        <w:t xml:space="preserve"> for each client.</w:t>
+      </w:r>
+    </w:p>
+    <w:p>
+      <w:pPr>
+        <w:numPr>
+          <w:ilvl w:val="0"/>
+          <w:numId w:val="9"/>
+        </w:numPr>
+        <w:rPr>
+          <w:sz w:val="28"/>
+          <w:szCs w:val="28"/>
+          <w:lang w:bidi="ar-EG"/>
+        </w:rPr>
+      </w:pPr>
+      <w:r>
+        <w:rPr>
+          <w:sz w:val="28"/>
+          <w:szCs w:val="28"/>
+          <w:lang w:bidi="ar-EG"/>
+        </w:rPr>
+        <w:t>Members can view and log their daily progress and calories.</w:t>
+      </w:r>
+    </w:p>
+    <w:p>
+      <w:pPr>
+        <w:numPr>
+          <w:ilvl w:val="0"/>
+          <w:numId w:val="9"/>
+        </w:numPr>
+        <w:rPr>
+          <w:sz w:val="28"/>
+          <w:szCs w:val="28"/>
+          <w:lang w:bidi="ar-EG"/>
+        </w:rPr>
+      </w:pPr>
+      <w:r>
+        <w:rPr>
+          <w:sz w:val="28"/>
+          <w:szCs w:val="28"/>
+          <w:lang w:bidi="ar-EG"/>
+        </w:rPr>
+        <w:t>The system automatically tracks progress using workout history and updates analytics dashboards.</w:t>
+      </w:r>
+    </w:p>
+    <w:p>
+      <w:pPr>
+        <w:rPr>
+          <w:sz w:val="28"/>
+          <w:szCs w:val="28"/>
+          <w:lang w:bidi="ar-EG"/>
+        </w:rPr>
+      </w:pPr>
+      <w:r>
+        <w:rPr>
+          <w:sz w:val="28"/>
+          <w:szCs w:val="28"/>
+          <w:lang w:bidi="ar-EG"/>
+        </w:rPr>
+        <w:lastRenderedPageBreak/>
+        <w:pict w14:anchorId="767E44F4">
+          <v:rect id="_x0000_i1089" style="width:0;height:1.5pt" o:hralign="center" o:hrstd="t" o:hr="t" fillcolor="#a0a0a0" stroked="f"/>
+        </w:pict>
+      </w:r>
+    </w:p>
+    <w:p>
+      <w:pPr>
+        <w:rPr>
+          <w:b/>
+          <w:bCs/>
+          <w:sz w:val="28"/>
+          <w:szCs w:val="28"/>
+          <w:lang w:bidi="ar-EG"/>
+        </w:rPr>
+      </w:pPr>
+      <w:r>
+        <w:rPr>
+          <w:rFonts w:ascii="Segoe UI Emoji" w:hAnsi="Segoe UI Emoji" w:cs="Segoe UI Emoji"/>
+          <w:b/>
+          <w:bCs/>
+          <w:sz w:val="28"/>
+          <w:szCs w:val="28"/>
+          <w:lang w:bidi="ar-EG"/>
+        </w:rPr>
+        <w:t>💬</w:t>
+      </w:r>
+      <w:r>
+        <w:rPr>
+          <w:b/>
+          <w:bCs/>
+          <w:sz w:val="28"/>
+          <w:szCs w:val="28"/>
+          <w:lang w:bidi="ar-EG"/>
+        </w:rPr>
+        <w:t xml:space="preserve"> 4. Communication &amp; AI Chatbot Assistance</w:t>
+      </w:r>
+    </w:p>
+    <w:p>
+      <w:pPr>
+        <w:numPr>
+          <w:ilvl w:val="0"/>
+          <w:numId w:val="10"/>
+        </w:numPr>
+        <w:rPr>
+          <w:sz w:val="28"/>
+          <w:szCs w:val="28"/>
+          <w:lang w:bidi="ar-EG"/>
+        </w:rPr>
+      </w:pPr>
+      <w:r>
+        <w:rPr>
+          <w:sz w:val="28"/>
+          <w:szCs w:val="28"/>
+          <w:lang w:bidi="ar-EG"/>
+        </w:rPr>
+        <w:t xml:space="preserve">Real-time chat system between </w:t>
+      </w:r>
+      <w:r>
+        <w:rPr>
+          <w:b/>
+          <w:bCs/>
+          <w:sz w:val="28"/>
+          <w:szCs w:val="28"/>
+          <w:lang w:bidi="ar-EG"/>
+        </w:rPr>
+        <w:t>coaches and members</w:t>
+      </w:r>
+      <w:r>
+        <w:rPr>
+          <w:sz w:val="28"/>
+          <w:szCs w:val="28"/>
+          <w:lang w:bidi="ar-EG"/>
+        </w:rPr>
+        <w:t xml:space="preserve"> for guidance.</w:t>
+      </w:r>
+    </w:p>
+    <w:p>
+      <w:pPr>
+        <w:numPr>
+          <w:ilvl w:val="0"/>
+          <w:numId w:val="10"/>
+        </w:numPr>
+        <w:rPr>
+          <w:sz w:val="28"/>
+          <w:szCs w:val="28"/>
+          <w:lang w:bidi="ar-EG"/>
+        </w:rPr>
+      </w:pPr>
+      <w:r>
+        <w:rPr>
+          <w:sz w:val="28"/>
+          <w:szCs w:val="28"/>
+          <w:lang w:bidi="ar-EG"/>
+        </w:rPr>
+        <w:t xml:space="preserve">Integrated </w:t>
+      </w:r>
+      <w:r>
+        <w:rPr>
+          <w:b/>
+          <w:bCs/>
+          <w:sz w:val="28"/>
+          <w:szCs w:val="28"/>
+          <w:lang w:bidi="ar-EG"/>
+        </w:rPr>
+        <w:t>AI-powered chatbot (Fit</w:t>
+      </w:r>
+      <w:r>
+        <w:rPr>
+          <w:b/>
+          <w:bCs/>
+          <w:sz w:val="28"/>
+          <w:szCs w:val="28"/>
+          <w:lang w:bidi="ar-EG"/>
+        </w:rPr>
+        <w:t>-</w:t>
+      </w:r>
+      <w:r>
+        <w:rPr>
+          <w:b/>
+          <w:bCs/>
+          <w:sz w:val="28"/>
+          <w:szCs w:val="28"/>
+          <w:lang w:bidi="ar-EG"/>
+        </w:rPr>
+        <w:t>Bot)</w:t>
+      </w:r>
+      <w:r>
+        <w:rPr>
+          <w:sz w:val="28"/>
+          <w:szCs w:val="28"/>
+          <w:lang w:bidi="ar-EG"/>
+        </w:rPr>
+        <w:t xml:space="preserve"> helps users with:</w:t>
+      </w:r>
+    </w:p>
+    <w:p>
+      <w:pPr>
+        <w:numPr>
+          <w:ilvl w:val="1"/>
+          <w:numId w:val="10"/>
+        </w:numPr>
+        <w:rPr>
+          <w:sz w:val="28"/>
+          <w:szCs w:val="28"/>
+          <w:lang w:bidi="ar-EG"/>
+        </w:rPr>
+      </w:pPr>
+      <w:r>
+        <w:rPr>
+          <w:sz w:val="28"/>
+          <w:szCs w:val="28"/>
+          <w:lang w:bidi="ar-EG"/>
+        </w:rPr>
+        <w:t>Fitness advice and nutrition tips.</w:t>
+      </w:r>
+    </w:p>
+    <w:p>
+      <w:pPr>
+        <w:numPr>
+          <w:ilvl w:val="1"/>
+          <w:numId w:val="10"/>
+        </w:numPr>
+        <w:rPr>
+          <w:sz w:val="28"/>
+          <w:szCs w:val="28"/>
+          <w:lang w:bidi="ar-EG"/>
+        </w:rPr>
+      </w:pPr>
+      <w:r>
+        <w:rPr>
+          <w:sz w:val="28"/>
+          <w:szCs w:val="28"/>
+          <w:lang w:bidi="ar-EG"/>
+        </w:rPr>
+        <w:t>Exercise recommendations.</w:t>
+      </w:r>
+    </w:p>
+    <w:p>
+      <w:pPr>
+        <w:numPr>
+          <w:ilvl w:val="1"/>
+          <w:numId w:val="10"/>
+        </w:numPr>
+        <w:rPr>
+          <w:sz w:val="28"/>
+          <w:szCs w:val="28"/>
+          <w:lang w:bidi="ar-EG"/>
+        </w:rPr>
+      </w:pPr>
+      <w:r>
+        <w:rPr>
+          <w:sz w:val="28"/>
+          <w:szCs w:val="28"/>
+          <w:lang w:bidi="ar-EG"/>
+        </w:rPr>
+        <w:t>Instant Q&amp;A and support.</w:t>
+      </w:r>
+    </w:p>
+    <w:p>
+      <w:pPr>
+        <w:rPr>
+          <w:sz w:val="28"/>
+          <w:szCs w:val="28"/>
+          <w:lang w:bidi="ar-EG"/>
+        </w:rPr>
+      </w:pPr>
+      <w:r>
+        <w:rPr>
+          <w:sz w:val="28"/>
+          <w:szCs w:val="28"/>
+          <w:lang w:bidi="ar-EG"/>
+        </w:rPr>
+        <w:pict w14:anchorId="65284AD6">
+          <v:rect id="_x0000_i1090" style="width:0;height:1.5pt" o:hralign="center" o:hrstd="t" o:hr="t" fillcolor="#a0a0a0" stroked="f"/>
+        </w:pict>
+      </w:r>
+    </w:p>
+    <w:p>
+      <w:pPr>
+        <w:rPr>
+          <w:b/>
+          <w:bCs/>
+          <w:sz w:val="28"/>
+          <w:szCs w:val="28"/>
+          <w:lang w:bidi="ar-EG"/>
+        </w:rPr>
+      </w:pPr>
+      <w:r>
+        <w:rPr>
+          <w:rFonts w:ascii="Segoe UI Emoji" w:hAnsi="Segoe UI Emoji" w:cs="Segoe UI Emoji"/>
+          <w:b/>
+          <w:bCs/>
+          <w:sz w:val="28"/>
+          <w:szCs w:val="28"/>
+          <w:lang w:bidi="ar-EG"/>
+        </w:rPr>
+        <w:t>💳</w:t>
+      </w:r>
+      <w:r>
+        <w:rPr>
+          <w:b/>
+          <w:bCs/>
+          <w:sz w:val="28"/>
+          <w:szCs w:val="28"/>
+          <w:lang w:bidi="ar-EG"/>
+        </w:rPr>
+        <w:t xml:space="preserve"> 5. Payment &amp; Subscription Processing</w:t>
+      </w:r>
+    </w:p>
+    <w:p>
+      <w:pPr>
+        <w:numPr>
+          <w:ilvl w:val="0"/>
+          <w:numId w:val="11"/>
+        </w:numPr>
+        <w:rPr>
+          <w:sz w:val="28"/>
+          <w:szCs w:val="28"/>
+          <w:lang w:bidi="ar-EG"/>
+        </w:rPr>
+      </w:pPr>
+      <w:r>
+        <w:rPr>
+          <w:sz w:val="28"/>
+          <w:szCs w:val="28"/>
+          <w:lang w:bidi="ar-EG"/>
+        </w:rPr>
+        <w:t xml:space="preserve">Supports </w:t>
+      </w:r>
+      <w:r>
+        <w:rPr>
+          <w:b/>
+          <w:bCs/>
+          <w:sz w:val="28"/>
+          <w:szCs w:val="28"/>
+          <w:lang w:bidi="ar-EG"/>
+        </w:rPr>
+        <w:t>online payments</w:t>
+      </w:r>
+      <w:r>
+        <w:rPr>
+          <w:sz w:val="28"/>
+          <w:szCs w:val="28"/>
+          <w:lang w:bidi="ar-EG"/>
+        </w:rPr>
+        <w:t xml:space="preserve"> via Stripe or PayPal.</w:t>
+      </w:r>
+    </w:p>
+    <w:p>
+      <w:pPr>
+        <w:numPr>
+          <w:ilvl w:val="0"/>
+          <w:numId w:val="11"/>
+        </w:numPr>
+        <w:rPr>
+          <w:sz w:val="28"/>
+          <w:szCs w:val="28"/>
+          <w:lang w:bidi="ar-EG"/>
+        </w:rPr>
+      </w:pPr>
+      <w:r>
+        <w:rPr>
+          <w:sz w:val="28"/>
+          <w:szCs w:val="28"/>
+          <w:lang w:bidi="ar-EG"/>
+        </w:rPr>
+        <w:t>Auto-</w:t>
+      </w:r>
+      <w:proofErr w:type="gramStart"/>
+      <w:r>
+        <w:rPr>
+          <w:sz w:val="28"/>
+          <w:szCs w:val="28"/>
+          <w:lang w:bidi="ar-EG"/>
+        </w:rPr>
+        <w:t>generates</w:t>
+      </w:r>
+      <w:proofErr w:type="gramEnd"/>
+      <w:r>
+        <w:rPr>
+          <w:sz w:val="28"/>
+          <w:szCs w:val="28"/>
+          <w:lang w:bidi="ar-EG"/>
+        </w:rPr>
+        <w:t xml:space="preserve"> invoices and payment receipts.</w:t>
+      </w:r>
+    </w:p>
+    <w:p>
+      <w:pPr>
+        <w:numPr>
+          <w:ilvl w:val="0"/>
+          <w:numId w:val="11"/>
+        </w:numPr>
+        <w:rPr>
+          <w:sz w:val="28"/>
+          <w:szCs w:val="28"/>
+          <w:lang w:bidi="ar-EG"/>
+        </w:rPr>
+      </w:pPr>
+      <w:r>
+        <w:rPr>
+          <w:sz w:val="28"/>
+          <w:szCs w:val="28"/>
+          <w:lang w:bidi="ar-EG"/>
+        </w:rPr>
+        <w:t>Tracks renewal dates, cancellations, and billing history.</w:t>
+      </w:r>
+    </w:p>
+    <w:p>
+      <w:pPr>
+        <w:rPr>
+          <w:sz w:val="28"/>
+          <w:szCs w:val="28"/>
+          <w:lang w:bidi="ar-EG"/>
+        </w:rPr>
+      </w:pPr>
+      <w:r>
+        <w:rPr>
+          <w:sz w:val="28"/>
+          <w:szCs w:val="28"/>
+          <w:lang w:bidi="ar-EG"/>
+        </w:rPr>
+        <w:pict w14:anchorId="55CBD9DE">
+          <v:rect id="_x0000_i1091" style="width:0;height:1.5pt" o:hralign="center" o:hrstd="t" o:hr="t" fillcolor="#a0a0a0" stroked="f"/>
+        </w:pict>
+      </w:r>
+    </w:p>
+    <w:p>
+      <w:pPr>
+        <w:rPr>
+          <w:b/>
+          <w:bCs/>
+          <w:sz w:val="28"/>
+          <w:szCs w:val="28"/>
+          <w:lang w:bidi="ar-EG"/>
+        </w:rPr>
+      </w:pPr>
+      <w:r>
+        <w:rPr>
+          <w:rFonts w:ascii="Segoe UI Emoji" w:hAnsi="Segoe UI Emoji" w:cs="Segoe UI Emoji"/>
+          <w:b/>
+          <w:bCs/>
+          <w:sz w:val="28"/>
+          <w:szCs w:val="28"/>
+          <w:lang w:bidi="ar-EG"/>
+        </w:rPr>
+        <w:t>🛒</w:t>
+      </w:r>
+      <w:r>
+        <w:rPr>
+          <w:b/>
+          <w:bCs/>
+          <w:sz w:val="28"/>
+          <w:szCs w:val="28"/>
+          <w:lang w:bidi="ar-EG"/>
+        </w:rPr>
+        <w:t xml:space="preserve"> 6. E-Commerce Module</w:t>
+      </w:r>
+    </w:p>
+    <w:p>
+      <w:pPr>
+        <w:numPr>
+          <w:ilvl w:val="0"/>
+          <w:numId w:val="12"/>
+        </w:numPr>
+        <w:rPr>
+          <w:sz w:val="28"/>
+          <w:szCs w:val="28"/>
+          <w:lang w:bidi="ar-EG"/>
+        </w:rPr>
+      </w:pPr>
+      <w:r>
+        <w:rPr>
+          <w:sz w:val="28"/>
+          <w:szCs w:val="28"/>
+          <w:lang w:bidi="ar-EG"/>
+        </w:rPr>
+        <w:t xml:space="preserve">Allows users to browse, search, and purchase </w:t>
+      </w:r>
+      <w:r>
+        <w:rPr>
+          <w:b/>
+          <w:bCs/>
+          <w:sz w:val="28"/>
+          <w:szCs w:val="28"/>
+          <w:lang w:bidi="ar-EG"/>
+        </w:rPr>
+        <w:t>gym equipment</w:t>
+      </w:r>
+      <w:r>
+        <w:rPr>
+          <w:sz w:val="28"/>
+          <w:szCs w:val="28"/>
+          <w:lang w:bidi="ar-EG"/>
+        </w:rPr>
+        <w:t xml:space="preserve">, </w:t>
+      </w:r>
+      <w:r>
+        <w:rPr>
+          <w:b/>
+          <w:bCs/>
+          <w:sz w:val="28"/>
+          <w:szCs w:val="28"/>
+          <w:lang w:bidi="ar-EG"/>
+        </w:rPr>
+        <w:t>supplements</w:t>
+      </w:r>
+      <w:r>
+        <w:rPr>
+          <w:sz w:val="28"/>
+          <w:szCs w:val="28"/>
+          <w:lang w:bidi="ar-EG"/>
+        </w:rPr>
+        <w:t xml:space="preserve">, and </w:t>
+      </w:r>
+      <w:r>
+        <w:rPr>
+          <w:b/>
+          <w:bCs/>
+          <w:sz w:val="28"/>
+          <w:szCs w:val="28"/>
+          <w:lang w:bidi="ar-EG"/>
+        </w:rPr>
+        <w:t>protein products</w:t>
+      </w:r>
+      <w:r>
+        <w:rPr>
+          <w:sz w:val="28"/>
+          <w:szCs w:val="28"/>
+          <w:lang w:bidi="ar-EG"/>
+        </w:rPr>
+        <w:t>.</w:t>
+      </w:r>
+    </w:p>
+    <w:p>
+      <w:pPr>
+        <w:numPr>
+          <w:ilvl w:val="0"/>
+          <w:numId w:val="12"/>
+        </w:numPr>
+        <w:rPr>
+          <w:sz w:val="28"/>
+          <w:szCs w:val="28"/>
+          <w:lang w:bidi="ar-EG"/>
+        </w:rPr>
+      </w:pPr>
+      <w:r>
+        <w:rPr>
+          <w:sz w:val="28"/>
+          <w:szCs w:val="28"/>
+          <w:lang w:bidi="ar-EG"/>
+        </w:rPr>
+        <w:t>Integrates with inventory management for product availability.</w:t>
+      </w:r>
+    </w:p>
+    <w:p>
+      <w:pPr>
+        <w:numPr>
+          <w:ilvl w:val="0"/>
+          <w:numId w:val="12"/>
+        </w:numPr>
+        <w:rPr>
+          <w:sz w:val="28"/>
+          <w:szCs w:val="28"/>
+          <w:lang w:bidi="ar-EG"/>
+        </w:rPr>
+      </w:pPr>
+      <w:r>
+        <w:rPr>
+          <w:sz w:val="28"/>
+          <w:szCs w:val="28"/>
+          <w:lang w:bidi="ar-EG"/>
+        </w:rPr>
+        <w:t>Secure checkout system with order tracking and status updates.</w:t>
+      </w:r>
+    </w:p>
+    <w:p>
+      <w:pPr>
+        <w:rPr>
+          <w:sz w:val="28"/>
+          <w:szCs w:val="28"/>
+          <w:lang w:bidi="ar-EG"/>
+        </w:rPr>
+      </w:pPr>
+      <w:r>
+        <w:rPr>
+          <w:sz w:val="28"/>
+          <w:szCs w:val="28"/>
+          <w:lang w:bidi="ar-EG"/>
+        </w:rPr>
+        <w:pict w14:anchorId="08720998">
+          <v:rect id="_x0000_i1092" style="width:0;height:1.5pt" o:hralign="center" o:hrstd="t" o:hr="t" fillcolor="#a0a0a0" stroked="f"/>
+        </w:pict>
+      </w:r>
+    </w:p>
+    <w:p>
+      <w:pPr>
+        <w:rPr>
+          <w:b/>
+          <w:bCs/>
+          <w:sz w:val="28"/>
+          <w:szCs w:val="28"/>
+          <w:lang w:bidi="ar-EG"/>
+        </w:rPr>
+      </w:pPr>
+      <w:r>
+        <w:rPr>
+          <w:rFonts w:ascii="Segoe UI Emoji" w:hAnsi="Segoe UI Emoji" w:cs="Segoe UI Emoji"/>
+          <w:b/>
+          <w:bCs/>
+          <w:sz w:val="28"/>
+          <w:szCs w:val="28"/>
+          <w:lang w:bidi="ar-EG"/>
+        </w:rPr>
+        <w:t>📊</w:t>
+      </w:r>
+      <w:r>
+        <w:rPr>
+          <w:b/>
+          <w:bCs/>
+          <w:sz w:val="28"/>
+          <w:szCs w:val="28"/>
+          <w:lang w:bidi="ar-EG"/>
+        </w:rPr>
+        <w:t xml:space="preserve"> 7. Reporting &amp; Analytics</w:t>
+      </w:r>
+    </w:p>
+    <w:p>
+      <w:pPr>
+        <w:numPr>
+          <w:ilvl w:val="0"/>
+          <w:numId w:val="13"/>
+        </w:numPr>
+        <w:rPr>
+          <w:sz w:val="28"/>
+          <w:szCs w:val="28"/>
+          <w:lang w:bidi="ar-EG"/>
+        </w:rPr>
+      </w:pPr>
+      <w:r>
+        <w:rPr>
+          <w:sz w:val="28"/>
+          <w:szCs w:val="28"/>
+          <w:lang w:bidi="ar-EG"/>
+        </w:rPr>
+        <w:t xml:space="preserve">Provides detailed reports for </w:t>
+      </w:r>
+      <w:r>
+        <w:rPr>
+          <w:b/>
+          <w:bCs/>
+          <w:sz w:val="28"/>
+          <w:szCs w:val="28"/>
+          <w:lang w:bidi="ar-EG"/>
+        </w:rPr>
+        <w:t>Admin and Coaches</w:t>
+      </w:r>
+      <w:r>
+        <w:rPr>
+          <w:sz w:val="28"/>
+          <w:szCs w:val="28"/>
+          <w:lang w:bidi="ar-EG"/>
+        </w:rPr>
+        <w:t>:</w:t>
+      </w:r>
+    </w:p>
+    <w:p>
+      <w:pPr>
+        <w:numPr>
+          <w:ilvl w:val="1"/>
+          <w:numId w:val="13"/>
+        </w:numPr>
+        <w:rPr>
+          <w:sz w:val="28"/>
+          <w:szCs w:val="28"/>
+          <w:lang w:bidi="ar-EG"/>
+        </w:rPr>
+      </w:pPr>
+      <w:r>
+        <w:rPr>
+          <w:sz w:val="28"/>
+          <w:szCs w:val="28"/>
+          <w:lang w:bidi="ar-EG"/>
+        </w:rPr>
+        <w:t>Revenue and sales statistics.</w:t>
+      </w:r>
+    </w:p>
+    <w:p>
+      <w:pPr>
+        <w:numPr>
+          <w:ilvl w:val="1"/>
+          <w:numId w:val="13"/>
+        </w:numPr>
+        <w:rPr>
+          <w:sz w:val="28"/>
+          <w:szCs w:val="28"/>
+          <w:lang w:bidi="ar-EG"/>
+        </w:rPr>
+      </w:pPr>
+      <w:r>
+        <w:rPr>
+          <w:sz w:val="28"/>
+          <w:szCs w:val="28"/>
+          <w:lang w:bidi="ar-EG"/>
+        </w:rPr>
+        <w:t>Membership activity and engagement rate.</w:t>
+      </w:r>
+    </w:p>
+    <w:p>
+      <w:pPr>
+        <w:numPr>
+          <w:ilvl w:val="1"/>
+          <w:numId w:val="13"/>
+        </w:numPr>
+        <w:rPr>
+          <w:sz w:val="28"/>
+          <w:szCs w:val="28"/>
+          <w:lang w:bidi="ar-EG"/>
+        </w:rPr>
+      </w:pPr>
+      <w:r>
+        <w:rPr>
+          <w:sz w:val="28"/>
+          <w:szCs w:val="28"/>
+          <w:lang w:bidi="ar-EG"/>
+        </w:rPr>
+        <w:lastRenderedPageBreak/>
+        <w:t>Fitness progress analysis for each member.</w:t>
+      </w:r>
+    </w:p>
+    <w:p>
+      <w:pPr>
+        <w:rPr>
+          <w:sz w:val="28"/>
+          <w:szCs w:val="28"/>
+          <w:lang w:bidi="ar-EG"/>
+        </w:rPr>
+      </w:pPr>
+      <w:r>
+        <w:rPr>
+          <w:sz w:val="28"/>
+          <w:szCs w:val="28"/>
+          <w:lang w:bidi="ar-EG"/>
+        </w:rPr>
+        <w:pict w14:anchorId="19E6CDEF">
+          <v:rect id="_x0000_i1093" style="width:0;height:1.5pt" o:hralign="center" o:hrstd="t" o:hr="t" fillcolor="#a0a0a0" stroked="f"/>
+        </w:pict>
+      </w:r>
+    </w:p>
+    <w:p>
+      <w:pPr>
+        <w:rPr>
+          <w:b/>
+          <w:bCs/>
+          <w:sz w:val="28"/>
+          <w:szCs w:val="28"/>
+          <w:lang w:bidi="ar-EG"/>
+        </w:rPr>
+      </w:pPr>
+      <w:r>
+        <w:rPr>
+          <w:rFonts w:ascii="Segoe UI Emoji" w:hAnsi="Segoe UI Emoji" w:cs="Segoe UI Emoji"/>
+          <w:b/>
+          <w:bCs/>
+          <w:sz w:val="28"/>
+          <w:szCs w:val="28"/>
+          <w:lang w:bidi="ar-EG"/>
+        </w:rPr>
+        <w:t>🔔</w:t>
+      </w:r>
+      <w:r>
+        <w:rPr>
+          <w:b/>
+          <w:bCs/>
+          <w:sz w:val="28"/>
+          <w:szCs w:val="28"/>
+          <w:lang w:bidi="ar-EG"/>
+        </w:rPr>
+        <w:t xml:space="preserve"> 8. Notifications &amp; Alerts</w:t>
+      </w:r>
+    </w:p>
+    <w:p>
+      <w:pPr>
+        <w:numPr>
+          <w:ilvl w:val="0"/>
+          <w:numId w:val="14"/>
+        </w:numPr>
+        <w:rPr>
+          <w:sz w:val="28"/>
+          <w:szCs w:val="28"/>
+          <w:lang w:bidi="ar-EG"/>
+        </w:rPr>
+      </w:pPr>
+      <w:r>
+        <w:rPr>
+          <w:sz w:val="28"/>
+          <w:szCs w:val="28"/>
+          <w:lang w:bidi="ar-EG"/>
+        </w:rPr>
+        <w:t>System generates automated notifications for:</w:t>
+      </w:r>
+    </w:p>
+    <w:p>
+      <w:pPr>
+        <w:numPr>
+          <w:ilvl w:val="1"/>
+          <w:numId w:val="14"/>
+        </w:numPr>
+        <w:rPr>
+          <w:sz w:val="28"/>
+          <w:szCs w:val="28"/>
+          <w:lang w:bidi="ar-EG"/>
+        </w:rPr>
+      </w:pPr>
+      <w:r>
+        <w:rPr>
+          <w:sz w:val="28"/>
+          <w:szCs w:val="28"/>
+          <w:lang w:bidi="ar-EG"/>
+        </w:rPr>
+        <w:t>Payment reminders.</w:t>
+      </w:r>
+    </w:p>
+    <w:p>
+      <w:pPr>
+        <w:numPr>
+          <w:ilvl w:val="1"/>
+          <w:numId w:val="14"/>
+        </w:numPr>
+        <w:rPr>
+          <w:sz w:val="28"/>
+          <w:szCs w:val="28"/>
+          <w:lang w:bidi="ar-EG"/>
+        </w:rPr>
+      </w:pPr>
+      <w:r>
+        <w:rPr>
+          <w:sz w:val="28"/>
+          <w:szCs w:val="28"/>
+          <w:lang w:bidi="ar-EG"/>
+        </w:rPr>
+        <w:t>Training updates.</w:t>
+      </w:r>
+    </w:p>
+    <w:p>
+      <w:pPr>
+        <w:numPr>
+          <w:ilvl w:val="1"/>
+          <w:numId w:val="14"/>
+        </w:numPr>
+        <w:rPr>
+          <w:sz w:val="28"/>
+          <w:szCs w:val="28"/>
+          <w:lang w:bidi="ar-EG"/>
+        </w:rPr>
+      </w:pPr>
+      <w:r>
+        <w:rPr>
+          <w:sz w:val="28"/>
+          <w:szCs w:val="28"/>
+          <w:lang w:bidi="ar-EG"/>
+        </w:rPr>
+        <w:t>Chat messages and plan changes.</w:t>
+      </w:r>
+    </w:p>
+    <w:p>
+      <w:pPr>
+        <w:numPr>
+          <w:ilvl w:val="0"/>
+          <w:numId w:val="14"/>
+        </w:numPr>
+        <w:rPr>
+          <w:sz w:val="28"/>
+          <w:szCs w:val="28"/>
+          <w:lang w:bidi="ar-EG"/>
+        </w:rPr>
+      </w:pPr>
+      <w:r>
+        <w:rPr>
+          <w:sz w:val="28"/>
+          <w:szCs w:val="28"/>
+          <w:lang w:bidi="ar-EG"/>
+        </w:rPr>
+        <w:t xml:space="preserve">Supports both </w:t>
+      </w:r>
+      <w:r>
+        <w:rPr>
+          <w:b/>
+          <w:bCs/>
+          <w:sz w:val="28"/>
+          <w:szCs w:val="28"/>
+          <w:lang w:bidi="ar-EG"/>
+        </w:rPr>
+        <w:t>in-app</w:t>
+      </w:r>
+      <w:r>
+        <w:rPr>
+          <w:sz w:val="28"/>
+          <w:szCs w:val="28"/>
+          <w:lang w:bidi="ar-EG"/>
+        </w:rPr>
+        <w:t xml:space="preserve"> and </w:t>
+      </w:r>
+      <w:r>
+        <w:rPr>
+          <w:b/>
+          <w:bCs/>
+          <w:sz w:val="28"/>
+          <w:szCs w:val="28"/>
+          <w:lang w:bidi="ar-EG"/>
+        </w:rPr>
+        <w:t>email notifications</w:t>
+      </w:r>
+      <w:r>
+        <w:rPr>
+          <w:sz w:val="28"/>
+          <w:szCs w:val="28"/>
+          <w:lang w:bidi="ar-EG"/>
+        </w:rPr>
+        <w:t>.</w:t>
+      </w:r>
+    </w:p>
+    <w:p>
+      <w:pPr>
+        <w:rPr>
+          <w:sz w:val="28"/>
+          <w:szCs w:val="28"/>
+          <w:lang w:bidi="ar-EG"/>
+        </w:rPr>
+      </w:pPr>
+      <w:r>
+        <w:rPr>
+          <w:sz w:val="28"/>
+          <w:szCs w:val="28"/>
+          <w:lang w:bidi="ar-EG"/>
+        </w:rPr>
+        <w:pict w14:anchorId="467708C4">
+          <v:rect id="_x0000_i1094" style="width:0;height:1.5pt" o:hralign="center" o:hrstd="t" o:hr="t" fillcolor="#a0a0a0" stroked="f"/>
+        </w:pict>
+      </w:r>
+    </w:p>
+    <w:p>
+      <w:pPr>
+        <w:rPr>
+          <w:b/>
+          <w:bCs/>
+          <w:sz w:val="28"/>
+          <w:szCs w:val="28"/>
+          <w:lang w:bidi="ar-EG"/>
+        </w:rPr>
+      </w:pPr>
+      <w:r>
+        <w:rPr>
+          <w:rFonts w:ascii="Segoe UI Emoji" w:hAnsi="Segoe UI Emoji" w:cs="Segoe UI Emoji"/>
+          <w:b/>
+          <w:bCs/>
+          <w:sz w:val="28"/>
+          <w:szCs w:val="28"/>
+          <w:lang w:bidi="ar-EG"/>
+        </w:rPr>
+        <w:t>🧩</w:t>
+      </w:r>
+      <w:r>
+        <w:rPr>
+          <w:b/>
+          <w:bCs/>
+          <w:sz w:val="28"/>
+          <w:szCs w:val="28"/>
+          <w:lang w:bidi="ar-EG"/>
+        </w:rPr>
+        <w:t xml:space="preserve"> 9. System Administration</w:t>
+      </w:r>
+    </w:p>
+    <w:p>
+      <w:pPr>
+        <w:numPr>
+          <w:ilvl w:val="0"/>
+          <w:numId w:val="15"/>
+        </w:numPr>
+        <w:rPr>
+          <w:sz w:val="28"/>
+          <w:szCs w:val="28"/>
+          <w:lang w:bidi="ar-EG"/>
+        </w:rPr>
+      </w:pPr>
+      <w:r>
+        <w:rPr>
+          <w:sz w:val="28"/>
+          <w:szCs w:val="28"/>
+          <w:lang w:bidi="ar-EG"/>
+        </w:rPr>
+        <w:t>Admin can manage:</w:t>
+      </w:r>
+    </w:p>
+    <w:p>
+      <w:pPr>
+        <w:numPr>
+          <w:ilvl w:val="1"/>
+          <w:numId w:val="15"/>
+        </w:numPr>
+        <w:rPr>
+          <w:sz w:val="28"/>
+          <w:szCs w:val="28"/>
+          <w:lang w:bidi="ar-EG"/>
+        </w:rPr>
+      </w:pPr>
+      <w:r>
+        <w:rPr>
+          <w:sz w:val="28"/>
+          <w:szCs w:val="28"/>
+          <w:lang w:bidi="ar-EG"/>
+        </w:rPr>
+        <w:t>Users and permissions.</w:t>
+      </w:r>
+    </w:p>
+    <w:p>
+      <w:pPr>
+        <w:numPr>
+          <w:ilvl w:val="1"/>
+          <w:numId w:val="15"/>
+        </w:numPr>
+        <w:rPr>
+          <w:sz w:val="28"/>
+          <w:szCs w:val="28"/>
+          <w:lang w:bidi="ar-EG"/>
+        </w:rPr>
+      </w:pPr>
+      <w:r>
+        <w:rPr>
+          <w:sz w:val="28"/>
+          <w:szCs w:val="28"/>
+          <w:lang w:bidi="ar-EG"/>
+        </w:rPr>
+        <w:t>Product catalogs.</w:t>
+      </w:r>
+    </w:p>
+    <w:p>
+      <w:pPr>
+        <w:numPr>
+          <w:ilvl w:val="1"/>
+          <w:numId w:val="15"/>
+        </w:numPr>
+        <w:rPr>
+          <w:sz w:val="28"/>
+          <w:szCs w:val="28"/>
+          <w:lang w:bidi="ar-EG"/>
+        </w:rPr>
+      </w:pPr>
+      <w:r>
+        <w:rPr>
+          <w:sz w:val="28"/>
+          <w:szCs w:val="28"/>
+          <w:lang w:bidi="ar-EG"/>
+        </w:rPr>
+        <w:t>Global configurations (pricing, offers, etc.).</w:t>
+      </w:r>
+    </w:p>
+    <w:p>
+      <w:pPr>
+        <w:rPr>
+          <w:sz w:val="28"/>
+          <w:szCs w:val="28"/>
+          <w:lang w:bidi="ar-EG"/>
+        </w:rPr>
+      </w:pPr>
+      <w:r>
+        <w:rPr>
+          <w:sz w:val="28"/>
+          <w:szCs w:val="28"/>
+          <w:lang w:bidi="ar-EG"/>
+        </w:rPr>
+        <w:pict w14:anchorId="5F9810DB">
+          <v:rect id="_x0000_i1095" style="width:0;height:1.5pt" o:hralign="center" o:hrstd="t" o:hr="t" fillcolor="#a0a0a0" stroked="f"/>
+        </w:pict>
+      </w:r>
+    </w:p>
+    <w:p>
+      <w:pPr>
+        <w:rPr>
+          <w:sz w:val="28"/>
+          <w:szCs w:val="28"/>
+          <w:lang w:bidi="ar-EG"/>
+        </w:rPr>
+      </w:pPr>
+      <w:r>
+        <w:rPr>
+          <w:b/>
+          <w:bCs/>
+          <w:sz w:val="28"/>
+          <w:szCs w:val="28"/>
+          <w:lang w:bidi="ar-EG"/>
+        </w:rPr>
+        <w:t>In summary:</w:t>
+      </w:r>
+      <w:r>
+        <w:rPr>
+          <w:sz w:val="28"/>
+          <w:szCs w:val="28"/>
+          <w:lang w:bidi="ar-EG"/>
+        </w:rPr>
+        <w:br/>
+        <w:t>Fit</w:t>
+      </w:r>
+      <w:r>
+        <w:rPr>
+          <w:sz w:val="28"/>
+          <w:szCs w:val="28"/>
+          <w:lang w:bidi="ar-EG"/>
+        </w:rPr>
+        <w:t>-</w:t>
+      </w:r>
+      <w:r>
+        <w:rPr>
+          <w:sz w:val="28"/>
+          <w:szCs w:val="28"/>
+          <w:lang w:bidi="ar-EG"/>
+        </w:rPr>
+        <w:t xml:space="preserve">Track functions as a multi-module platform that unifies </w:t>
+      </w:r>
+      <w:r>
+        <w:rPr>
+          <w:b/>
+          <w:bCs/>
+          <w:sz w:val="28"/>
+          <w:szCs w:val="28"/>
+          <w:lang w:bidi="ar-EG"/>
+        </w:rPr>
+        <w:t>gym management</w:t>
+      </w:r>
+      <w:r>
+        <w:rPr>
+          <w:sz w:val="28"/>
+          <w:szCs w:val="28"/>
+          <w:lang w:bidi="ar-EG"/>
+        </w:rPr>
+        <w:t xml:space="preserve">, </w:t>
+      </w:r>
+      <w:r>
+        <w:rPr>
+          <w:b/>
+          <w:bCs/>
+          <w:sz w:val="28"/>
+          <w:szCs w:val="28"/>
+          <w:lang w:bidi="ar-EG"/>
+        </w:rPr>
+        <w:t>online fitness coaching</w:t>
+      </w:r>
+      <w:r>
+        <w:rPr>
+          <w:sz w:val="28"/>
+          <w:szCs w:val="28"/>
+          <w:lang w:bidi="ar-EG"/>
+        </w:rPr>
+        <w:t xml:space="preserve">, </w:t>
+      </w:r>
+      <w:r>
+        <w:rPr>
+          <w:b/>
+          <w:bCs/>
+          <w:sz w:val="28"/>
+          <w:szCs w:val="28"/>
+          <w:lang w:bidi="ar-EG"/>
+        </w:rPr>
+        <w:t>AI-powered support</w:t>
+      </w:r>
+      <w:r>
+        <w:rPr>
+          <w:sz w:val="28"/>
+          <w:szCs w:val="28"/>
+          <w:lang w:bidi="ar-EG"/>
+        </w:rPr>
+        <w:t xml:space="preserve">, and </w:t>
+      </w:r>
+      <w:r>
+        <w:rPr>
+          <w:b/>
+          <w:bCs/>
+          <w:sz w:val="28"/>
+          <w:szCs w:val="28"/>
+          <w:lang w:bidi="ar-EG"/>
+        </w:rPr>
+        <w:t>e-commerce</w:t>
+      </w:r>
+      <w:r>
+        <w:rPr>
+          <w:sz w:val="28"/>
+          <w:szCs w:val="28"/>
+          <w:lang w:bidi="ar-EG"/>
+        </w:rPr>
+        <w:t xml:space="preserve"> — ensuring seamless interaction between admins, coaches, and members.</w:t>
+      </w:r>
+    </w:p>
+    <w:p>
+      <w:pPr>
+        <w:rPr>
+          <w:rFonts w:hint="cs"/>
+          <w:sz w:val="28"/>
+          <w:szCs w:val="28"/>
+          <w:rtl/>
+          <w:lang w:bidi="ar-EG"/>
+        </w:rPr>
+      </w:pPr>
+      <w:r>
+        <w:rPr>
+          <w:rFonts w:hint="cs"/>
+          <w:noProof/>
+          <w:sz w:val="28"/>
+          <w:szCs w:val="28"/>
+          <w:lang w:bidi="ar-EG"/>
+        </w:rPr>
+        <w:lastRenderedPageBreak/>
+        <w:drawing>
+          <wp:inline distT="0" distB="0" distL="0" distR="0" wp14:anchorId="3D7DF86E" wp14:editId="1F6EDFE4">
+            <wp:extent cx="5478780" cy="8221980"/>
+            <wp:effectExtent l="0" t="0" r="7620" b="7620"/>
+            <wp:docPr id="208785557" name="Picture 2"/>
+            <wp:cNvGraphicFramePr>
+              <a:graphicFrameLocks xmlns:a="http://schemas.openxmlformats.org/drawingml/2006/main" noChangeAspect="1"/>
+            </wp:cNvGraphicFramePr>
+            <a:graphic xmlns:a="http://schemas.openxmlformats.org/drawingml/2006/main">
+              <a:graphicData uri="http://schemas.openxmlformats.org/drawingml/2006/picture">
+                <pic:pic xmlns:pic="http://schemas.openxmlformats.org/drawingml/2006/picture">
+                  <pic:nvPicPr>
+                    <pic:cNvPr id="0" name="Picture 82"/>
+                    <pic:cNvPicPr>
+                      <a:picLocks noChangeAspect="1" noChangeArrowheads="1"/>
+                    </pic:cNvPicPr>
+                  </pic:nvPicPr>
+                  <pic:blipFill>
+                    <a:blip r:embed="rId10">
+                      <a:extLst>
+                        <a:ext uri="{28A0092B-C50C-407E-A947-70E740481C1C}">
+                          <a14:useLocalDpi xmlns:a14="http://schemas.microsoft.com/office/drawing/2010/main" val="0"/>
+                        </a:ext>
+                      </a:extLst>
+                    </a:blip>
+                    <a:srcRect/>
+                    <a:stretch>
+                      <a:fillRect/>
+                    </a:stretch>
+                  </pic:blipFill>
+                  <pic:spPr bwMode="auto">
+                    <a:xfrm>
+                      <a:off x="0" y="0"/>
+                      <a:ext cx="5478780" cy="8221980"/>
+                    </a:xfrm>
+                    <a:prstGeom prst="rect">
+                      <a:avLst/>
+                    </a:prstGeom>
+                    <a:noFill/>
+                    <a:ln>
+                      <a:noFill/>
+                    </a:ln>
+                  </pic:spPr>
+                </pic:pic>
+              </a:graphicData>
+            </a:graphic>
+          </wp:inline>
+        </w:drawing>
+      </w:r>
     </w:p>
     <w:sectPr>
       <w:pgSz w:w="12240" w:h="15840"/>
@@ -1728,6 +4025,304 @@
     </w:lvl>
   </w:abstractNum>
   <w:abstractNum w:abstractNumId="1" w15:restartNumberingAfterBreak="0">
+    <w:nsid w:val="0BF60B6B"/>
+    <w:multiLevelType w:val="multilevel"/>
+    <w:tmpl w:val="7F70591E"/>
+    <w:lvl w:ilvl="0">
+      <w:start w:val="1"/>
+      <w:numFmt w:val="bullet"/>
+      <w:lvlText w:val=""/>
+      <w:lvlJc w:val="left"/>
+      <w:pPr>
+        <w:tabs>
+          <w:tab w:val="num" w:pos="720"/>
+        </w:tabs>
+        <w:ind w:left="720" w:hanging="360"/>
+      </w:pPr>
+      <w:rPr>
+        <w:rFonts w:ascii="Symbol" w:hAnsi="Symbol" w:hint="default"/>
+        <w:sz w:val="20"/>
+      </w:rPr>
+    </w:lvl>
+    <w:lvl w:ilvl="1">
+      <w:start w:val="1"/>
+      <w:numFmt w:val="bullet"/>
+      <w:lvlText w:val="o"/>
+      <w:lvlJc w:val="left"/>
+      <w:pPr>
+        <w:tabs>
+          <w:tab w:val="num" w:pos="1440"/>
+        </w:tabs>
+        <w:ind w:left="1440" w:hanging="360"/>
+      </w:pPr>
+      <w:rPr>
+        <w:rFonts w:ascii="Courier New" w:hAnsi="Courier New" w:hint="default"/>
+        <w:sz w:val="20"/>
+      </w:rPr>
+    </w:lvl>
+    <w:lvl w:ilvl="2" w:tentative="1">
+      <w:start w:val="1"/>
+      <w:numFmt w:val="bullet"/>
+      <w:lvlText w:val=""/>
+      <w:lvlJc w:val="left"/>
+      <w:pPr>
+        <w:tabs>
+          <w:tab w:val="num" w:pos="2160"/>
+        </w:tabs>
+        <w:ind w:left="2160" w:hanging="360"/>
+      </w:pPr>
+      <w:rPr>
+        <w:rFonts w:ascii="Wingdings" w:hAnsi="Wingdings" w:hint="default"/>
+        <w:sz w:val="20"/>
+      </w:rPr>
+    </w:lvl>
+    <w:lvl w:ilvl="3" w:tentative="1">
+      <w:start w:val="1"/>
+      <w:numFmt w:val="bullet"/>
+      <w:lvlText w:val=""/>
+      <w:lvlJc w:val="left"/>
+      <w:pPr>
+        <w:tabs>
+          <w:tab w:val="num" w:pos="2880"/>
+        </w:tabs>
+        <w:ind w:left="2880" w:hanging="360"/>
+      </w:pPr>
+      <w:rPr>
+        <w:rFonts w:ascii="Wingdings" w:hAnsi="Wingdings" w:hint="default"/>
+        <w:sz w:val="20"/>
+      </w:rPr>
+    </w:lvl>
+    <w:lvl w:ilvl="4" w:tentative="1">
+      <w:start w:val="1"/>
+      <w:numFmt w:val="bullet"/>
+      <w:lvlText w:val=""/>
+      <w:lvlJc w:val="left"/>
+      <w:pPr>
+        <w:tabs>
+          <w:tab w:val="num" w:pos="3600"/>
+        </w:tabs>
+        <w:ind w:left="3600" w:hanging="360"/>
+      </w:pPr>
+      <w:rPr>
+        <w:rFonts w:ascii="Wingdings" w:hAnsi="Wingdings" w:hint="default"/>
+        <w:sz w:val="20"/>
+      </w:rPr>
+    </w:lvl>
+    <w:lvl w:ilvl="5" w:tentative="1">
+      <w:start w:val="1"/>
+      <w:numFmt w:val="bullet"/>
+      <w:lvlText w:val=""/>
+      <w:lvlJc w:val="left"/>
+      <w:pPr>
+        <w:tabs>
+          <w:tab w:val="num" w:pos="4320"/>
+        </w:tabs>
+        <w:ind w:left="4320" w:hanging="360"/>
+      </w:pPr>
+      <w:rPr>
+        <w:rFonts w:ascii="Wingdings" w:hAnsi="Wingdings" w:hint="default"/>
+        <w:sz w:val="20"/>
+      </w:rPr>
+    </w:lvl>
+    <w:lvl w:ilvl="6" w:tentative="1">
+      <w:start w:val="1"/>
+      <w:numFmt w:val="bullet"/>
+      <w:lvlText w:val=""/>
+      <w:lvlJc w:val="left"/>
+      <w:pPr>
+        <w:tabs>
+          <w:tab w:val="num" w:pos="5040"/>
+        </w:tabs>
+        <w:ind w:left="5040" w:hanging="360"/>
+      </w:pPr>
+      <w:rPr>
+        <w:rFonts w:ascii="Wingdings" w:hAnsi="Wingdings" w:hint="default"/>
+        <w:sz w:val="20"/>
+      </w:rPr>
+    </w:lvl>
+    <w:lvl w:ilvl="7" w:tentative="1">
+      <w:start w:val="1"/>
+      <w:numFmt w:val="bullet"/>
+      <w:lvlText w:val=""/>
+      <w:lvlJc w:val="left"/>
+      <w:pPr>
+        <w:tabs>
+          <w:tab w:val="num" w:pos="5760"/>
+        </w:tabs>
+        <w:ind w:left="5760" w:hanging="360"/>
+      </w:pPr>
+      <w:rPr>
+        <w:rFonts w:ascii="Wingdings" w:hAnsi="Wingdings" w:hint="default"/>
+        <w:sz w:val="20"/>
+      </w:rPr>
+    </w:lvl>
+    <w:lvl w:ilvl="8" w:tentative="1">
+      <w:start w:val="1"/>
+      <w:numFmt w:val="bullet"/>
+      <w:lvlText w:val=""/>
+      <w:lvlJc w:val="left"/>
+      <w:pPr>
+        <w:tabs>
+          <w:tab w:val="num" w:pos="6480"/>
+        </w:tabs>
+        <w:ind w:left="6480" w:hanging="360"/>
+      </w:pPr>
+      <w:rPr>
+        <w:rFonts w:ascii="Wingdings" w:hAnsi="Wingdings" w:hint="default"/>
+        <w:sz w:val="20"/>
+      </w:rPr>
+    </w:lvl>
+  </w:abstractNum>
+  <w:abstractNum w:abstractNumId="2" w15:restartNumberingAfterBreak="0">
+    <w:nsid w:val="128654FC"/>
+    <w:multiLevelType w:val="multilevel"/>
+    <w:tmpl w:val="3B3A77CC"/>
+    <w:lvl w:ilvl="0">
+      <w:start w:val="1"/>
+      <w:numFmt w:val="bullet"/>
+      <w:lvlText w:val=""/>
+      <w:lvlJc w:val="left"/>
+      <w:pPr>
+        <w:tabs>
+          <w:tab w:val="num" w:pos="720"/>
+        </w:tabs>
+        <w:ind w:left="720" w:hanging="360"/>
+      </w:pPr>
+      <w:rPr>
+        <w:rFonts w:ascii="Symbol" w:hAnsi="Symbol" w:hint="default"/>
+        <w:sz w:val="20"/>
+      </w:rPr>
+    </w:lvl>
+    <w:lvl w:ilvl="1" w:tentative="1">
+      <w:start w:val="1"/>
+      <w:numFmt w:val="bullet"/>
+      <w:lvlText w:val="o"/>
+      <w:lvlJc w:val="left"/>
+      <w:pPr>
+        <w:tabs>
+          <w:tab w:val="num" w:pos="1440"/>
+        </w:tabs>
+        <w:ind w:left="1440" w:hanging="360"/>
+      </w:pPr>
+      <w:rPr>
+        <w:rFonts w:ascii="Courier New" w:hAnsi="Courier New" w:hint="default"/>
+        <w:sz w:val="20"/>
+      </w:rPr>
+    </w:lvl>
+    <w:lvl w:ilvl="2" w:tentative="1">
+      <w:start w:val="1"/>
+      <w:numFmt w:val="bullet"/>
+      <w:lvlText w:val=""/>
+      <w:lvlJc w:val="left"/>
+      <w:pPr>
+        <w:tabs>
+          <w:tab w:val="num" w:pos="2160"/>
+        </w:tabs>
+        <w:ind w:left="2160" w:hanging="360"/>
+      </w:pPr>
+      <w:rPr>
+        <w:rFonts w:ascii="Wingdings" w:hAnsi="Wingdings" w:hint="default"/>
+        <w:sz w:val="20"/>
+      </w:rPr>
+    </w:lvl>
+    <w:lvl w:ilvl="3" w:tentative="1">
+      <w:start w:val="1"/>
+      <w:numFmt w:val="bullet"/>
+      <w:lvlText w:val=""/>
+      <w:lvlJc w:val="left"/>
+      <w:pPr>
+        <w:tabs>
+          <w:tab w:val="num" w:pos="2880"/>
+        </w:tabs>
+        <w:ind w:left="2880" w:hanging="360"/>
+      </w:pPr>
+      <w:rPr>
+        <w:rFonts w:ascii="Wingdings" w:hAnsi="Wingdings" w:hint="default"/>
+        <w:sz w:val="20"/>
+      </w:rPr>
+    </w:lvl>
+    <w:lvl w:ilvl="4" w:tentative="1">
+      <w:start w:val="1"/>
+      <w:numFmt w:val="bullet"/>
+      <w:lvlText w:val=""/>
+      <w:lvlJc w:val="left"/>
+      <w:pPr>
+        <w:tabs>
+          <w:tab w:val="num" w:pos="3600"/>
+        </w:tabs>
+        <w:ind w:left="3600" w:hanging="360"/>
+      </w:pPr>
+      <w:rPr>
+        <w:rFonts w:ascii="Wingdings" w:hAnsi="Wingdings" w:hint="default"/>
+        <w:sz w:val="20"/>
+      </w:rPr>
+    </w:lvl>
+    <w:lvl w:ilvl="5" w:tentative="1">
+      <w:start w:val="1"/>
+      <w:numFmt w:val="bullet"/>
+      <w:lvlText w:val=""/>
+      <w:lvlJc w:val="left"/>
+      <w:pPr>
+        <w:tabs>
+          <w:tab w:val="num" w:pos="4320"/>
+        </w:tabs>
+        <w:ind w:left="4320" w:hanging="360"/>
+      </w:pPr>
+      <w:rPr>
+        <w:rFonts w:ascii="Wingdings" w:hAnsi="Wingdings" w:hint="default"/>
+        <w:sz w:val="20"/>
+      </w:rPr>
+    </w:lvl>
+    <w:lvl w:ilvl="6" w:tentative="1">
+      <w:start w:val="1"/>
+      <w:numFmt w:val="bullet"/>
+      <w:lvlText w:val=""/>
+      <w:lvlJc w:val="left"/>
+      <w:pPr>
+        <w:tabs>
+          <w:tab w:val="num" w:pos="5040"/>
+        </w:tabs>
+        <w:ind w:left="5040" w:hanging="360"/>
+      </w:pPr>
+      <w:rPr>
+        <w:rFonts w:ascii="Wingdings" w:hAnsi="Wingdings" w:hint="default"/>
+        <w:sz w:val="20"/>
+      </w:rPr>
+    </w:lvl>
+    <w:lvl w:ilvl="7" w:tentative="1">
+      <w:start w:val="1"/>
+      <w:numFmt w:val="bullet"/>
+      <w:lvlText w:val=""/>
+      <w:lvlJc w:val="left"/>
+      <w:pPr>
+        <w:tabs>
+          <w:tab w:val="num" w:pos="5760"/>
+        </w:tabs>
+        <w:ind w:left="5760" w:hanging="360"/>
+      </w:pPr>
+      <w:rPr>
+        <w:rFonts w:ascii="Wingdings" w:hAnsi="Wingdings" w:hint="default"/>
+        <w:sz w:val="20"/>
+      </w:rPr>
+    </w:lvl>
+    <w:lvl w:ilvl="8" w:tentative="1">
+      <w:start w:val="1"/>
+      <w:numFmt w:val="bullet"/>
+      <w:lvlText w:val=""/>
+      <w:lvlJc w:val="left"/>
+      <w:pPr>
+        <w:tabs>
+          <w:tab w:val="num" w:pos="6480"/>
+        </w:tabs>
+        <w:ind w:left="6480" w:hanging="360"/>
+      </w:pPr>
+      <w:rPr>
+        <w:rFonts w:ascii="Wingdings" w:hAnsi="Wingdings" w:hint="default"/>
+        <w:sz w:val="20"/>
+      </w:rPr>
+    </w:lvl>
+  </w:abstractNum>
+  <w:abstractNum w:abstractNumId="3" w15:restartNumberingAfterBreak="0">
     <w:nsid w:val="17DB689E"/>
     <w:multiLevelType w:val="multilevel"/>
     <w:tmpl w:val="57DAD6FC"/>
@@ -1848,7 +4443,454 @@
       </w:rPr>
     </w:lvl>
   </w:abstractNum>
-  <w:abstractNum w:abstractNumId="2" w15:restartNumberingAfterBreak="0">
+  <w:abstractNum w:abstractNumId="4" w15:restartNumberingAfterBreak="0">
+    <w:nsid w:val="22512D99"/>
+    <w:multiLevelType w:val="multilevel"/>
+    <w:tmpl w:val="DF961E8A"/>
+    <w:lvl w:ilvl="0">
+      <w:start w:val="1"/>
+      <w:numFmt w:val="bullet"/>
+      <w:lvlText w:val=""/>
+      <w:lvlJc w:val="left"/>
+      <w:pPr>
+        <w:tabs>
+          <w:tab w:val="num" w:pos="720"/>
+        </w:tabs>
+        <w:ind w:left="720" w:hanging="360"/>
+      </w:pPr>
+      <w:rPr>
+        <w:rFonts w:ascii="Symbol" w:hAnsi="Symbol" w:hint="default"/>
+        <w:sz w:val="20"/>
+      </w:rPr>
+    </w:lvl>
+    <w:lvl w:ilvl="1">
+      <w:start w:val="1"/>
+      <w:numFmt w:val="bullet"/>
+      <w:lvlText w:val="o"/>
+      <w:lvlJc w:val="left"/>
+      <w:pPr>
+        <w:tabs>
+          <w:tab w:val="num" w:pos="1440"/>
+        </w:tabs>
+        <w:ind w:left="1440" w:hanging="360"/>
+      </w:pPr>
+      <w:rPr>
+        <w:rFonts w:ascii="Courier New" w:hAnsi="Courier New" w:hint="default"/>
+        <w:sz w:val="20"/>
+      </w:rPr>
+    </w:lvl>
+    <w:lvl w:ilvl="2" w:tentative="1">
+      <w:start w:val="1"/>
+      <w:numFmt w:val="bullet"/>
+      <w:lvlText w:val=""/>
+      <w:lvlJc w:val="left"/>
+      <w:pPr>
+        <w:tabs>
+          <w:tab w:val="num" w:pos="2160"/>
+        </w:tabs>
+        <w:ind w:left="2160" w:hanging="360"/>
+      </w:pPr>
+      <w:rPr>
+        <w:rFonts w:ascii="Wingdings" w:hAnsi="Wingdings" w:hint="default"/>
+        <w:sz w:val="20"/>
+      </w:rPr>
+    </w:lvl>
+    <w:lvl w:ilvl="3" w:tentative="1">
+      <w:start w:val="1"/>
+      <w:numFmt w:val="bullet"/>
+      <w:lvlText w:val=""/>
+      <w:lvlJc w:val="left"/>
+      <w:pPr>
+        <w:tabs>
+          <w:tab w:val="num" w:pos="2880"/>
+        </w:tabs>
+        <w:ind w:left="2880" w:hanging="360"/>
+      </w:pPr>
+      <w:rPr>
+        <w:rFonts w:ascii="Wingdings" w:hAnsi="Wingdings" w:hint="default"/>
+        <w:sz w:val="20"/>
+      </w:rPr>
+    </w:lvl>
+    <w:lvl w:ilvl="4" w:tentative="1">
+      <w:start w:val="1"/>
+      <w:numFmt w:val="bullet"/>
+      <w:lvlText w:val=""/>
+      <w:lvlJc w:val="left"/>
+      <w:pPr>
+        <w:tabs>
+          <w:tab w:val="num" w:pos="3600"/>
+        </w:tabs>
+        <w:ind w:left="3600" w:hanging="360"/>
+      </w:pPr>
+      <w:rPr>
+        <w:rFonts w:ascii="Wingdings" w:hAnsi="Wingdings" w:hint="default"/>
+        <w:sz w:val="20"/>
+      </w:rPr>
+    </w:lvl>
+    <w:lvl w:ilvl="5" w:tentative="1">
+      <w:start w:val="1"/>
+      <w:numFmt w:val="bullet"/>
+      <w:lvlText w:val=""/>
+      <w:lvlJc w:val="left"/>
+      <w:pPr>
+        <w:tabs>
+          <w:tab w:val="num" w:pos="4320"/>
+        </w:tabs>
+        <w:ind w:left="4320" w:hanging="360"/>
+      </w:pPr>
+      <w:rPr>
+        <w:rFonts w:ascii="Wingdings" w:hAnsi="Wingdings" w:hint="default"/>
+        <w:sz w:val="20"/>
+      </w:rPr>
+    </w:lvl>
+    <w:lvl w:ilvl="6" w:tentative="1">
+      <w:start w:val="1"/>
+      <w:numFmt w:val="bullet"/>
+      <w:lvlText w:val=""/>
+      <w:lvlJc w:val="left"/>
+      <w:pPr>
+        <w:tabs>
+          <w:tab w:val="num" w:pos="5040"/>
+        </w:tabs>
+        <w:ind w:left="5040" w:hanging="360"/>
+      </w:pPr>
+      <w:rPr>
+        <w:rFonts w:ascii="Wingdings" w:hAnsi="Wingdings" w:hint="default"/>
+        <w:sz w:val="20"/>
+      </w:rPr>
+    </w:lvl>
+    <w:lvl w:ilvl="7" w:tentative="1">
+      <w:start w:val="1"/>
+      <w:numFmt w:val="bullet"/>
+      <w:lvlText w:val=""/>
+      <w:lvlJc w:val="left"/>
+      <w:pPr>
+        <w:tabs>
+          <w:tab w:val="num" w:pos="5760"/>
+        </w:tabs>
+        <w:ind w:left="5760" w:hanging="360"/>
+      </w:pPr>
+      <w:rPr>
+        <w:rFonts w:ascii="Wingdings" w:hAnsi="Wingdings" w:hint="default"/>
+        <w:sz w:val="20"/>
+      </w:rPr>
+    </w:lvl>
+    <w:lvl w:ilvl="8" w:tentative="1">
+      <w:start w:val="1"/>
+      <w:numFmt w:val="bullet"/>
+      <w:lvlText w:val=""/>
+      <w:lvlJc w:val="left"/>
+      <w:pPr>
+        <w:tabs>
+          <w:tab w:val="num" w:pos="6480"/>
+        </w:tabs>
+        <w:ind w:left="6480" w:hanging="360"/>
+      </w:pPr>
+      <w:rPr>
+        <w:rFonts w:ascii="Wingdings" w:hAnsi="Wingdings" w:hint="default"/>
+        <w:sz w:val="20"/>
+      </w:rPr>
+    </w:lvl>
+  </w:abstractNum>
+  <w:abstractNum w:abstractNumId="5" w15:restartNumberingAfterBreak="0">
+    <w:nsid w:val="26EB4456"/>
+    <w:multiLevelType w:val="multilevel"/>
+    <w:tmpl w:val="A64AE48A"/>
+    <w:lvl w:ilvl="0">
+      <w:start w:val="1"/>
+      <w:numFmt w:val="bullet"/>
+      <w:lvlText w:val=""/>
+      <w:lvlJc w:val="left"/>
+      <w:pPr>
+        <w:tabs>
+          <w:tab w:val="num" w:pos="720"/>
+        </w:tabs>
+        <w:ind w:left="720" w:hanging="360"/>
+      </w:pPr>
+      <w:rPr>
+        <w:rFonts w:ascii="Symbol" w:hAnsi="Symbol" w:hint="default"/>
+        <w:sz w:val="20"/>
+      </w:rPr>
+    </w:lvl>
+    <w:lvl w:ilvl="1" w:tentative="1">
+      <w:start w:val="1"/>
+      <w:numFmt w:val="bullet"/>
+      <w:lvlText w:val="o"/>
+      <w:lvlJc w:val="left"/>
+      <w:pPr>
+        <w:tabs>
+          <w:tab w:val="num" w:pos="1440"/>
+        </w:tabs>
+        <w:ind w:left="1440" w:hanging="360"/>
+      </w:pPr>
+      <w:rPr>
+        <w:rFonts w:ascii="Courier New" w:hAnsi="Courier New" w:hint="default"/>
+        <w:sz w:val="20"/>
+      </w:rPr>
+    </w:lvl>
+    <w:lvl w:ilvl="2" w:tentative="1">
+      <w:start w:val="1"/>
+      <w:numFmt w:val="bullet"/>
+      <w:lvlText w:val=""/>
+      <w:lvlJc w:val="left"/>
+      <w:pPr>
+        <w:tabs>
+          <w:tab w:val="num" w:pos="2160"/>
+        </w:tabs>
+        <w:ind w:left="2160" w:hanging="360"/>
+      </w:pPr>
+      <w:rPr>
+        <w:rFonts w:ascii="Wingdings" w:hAnsi="Wingdings" w:hint="default"/>
+        <w:sz w:val="20"/>
+      </w:rPr>
+    </w:lvl>
+    <w:lvl w:ilvl="3" w:tentative="1">
+      <w:start w:val="1"/>
+      <w:numFmt w:val="bullet"/>
+      <w:lvlText w:val=""/>
+      <w:lvlJc w:val="left"/>
+      <w:pPr>
+        <w:tabs>
+          <w:tab w:val="num" w:pos="2880"/>
+        </w:tabs>
+        <w:ind w:left="2880" w:hanging="360"/>
+      </w:pPr>
+      <w:rPr>
+        <w:rFonts w:ascii="Wingdings" w:hAnsi="Wingdings" w:hint="default"/>
+        <w:sz w:val="20"/>
+      </w:rPr>
+    </w:lvl>
+    <w:lvl w:ilvl="4" w:tentative="1">
+      <w:start w:val="1"/>
+      <w:numFmt w:val="bullet"/>
+      <w:lvlText w:val=""/>
+      <w:lvlJc w:val="left"/>
+      <w:pPr>
+        <w:tabs>
+          <w:tab w:val="num" w:pos="3600"/>
+        </w:tabs>
+        <w:ind w:left="3600" w:hanging="360"/>
+      </w:pPr>
+      <w:rPr>
+        <w:rFonts w:ascii="Wingdings" w:hAnsi="Wingdings" w:hint="default"/>
+        <w:sz w:val="20"/>
+      </w:rPr>
+    </w:lvl>
+    <w:lvl w:ilvl="5" w:tentative="1">
+      <w:start w:val="1"/>
+      <w:numFmt w:val="bullet"/>
+      <w:lvlText w:val=""/>
+      <w:lvlJc w:val="left"/>
+      <w:pPr>
+        <w:tabs>
+          <w:tab w:val="num" w:pos="4320"/>
+        </w:tabs>
+        <w:ind w:left="4320" w:hanging="360"/>
+      </w:pPr>
+      <w:rPr>
+        <w:rFonts w:ascii="Wingdings" w:hAnsi="Wingdings" w:hint="default"/>
+        <w:sz w:val="20"/>
+      </w:rPr>
+    </w:lvl>
+    <w:lvl w:ilvl="6" w:tentative="1">
+      <w:start w:val="1"/>
+      <w:numFmt w:val="bullet"/>
+      <w:lvlText w:val=""/>
+      <w:lvlJc w:val="left"/>
+      <w:pPr>
+        <w:tabs>
+          <w:tab w:val="num" w:pos="5040"/>
+        </w:tabs>
+        <w:ind w:left="5040" w:hanging="360"/>
+      </w:pPr>
+      <w:rPr>
+        <w:rFonts w:ascii="Wingdings" w:hAnsi="Wingdings" w:hint="default"/>
+        <w:sz w:val="20"/>
+      </w:rPr>
+    </w:lvl>
+    <w:lvl w:ilvl="7" w:tentative="1">
+      <w:start w:val="1"/>
+      <w:numFmt w:val="bullet"/>
+      <w:lvlText w:val=""/>
+      <w:lvlJc w:val="left"/>
+      <w:pPr>
+        <w:tabs>
+          <w:tab w:val="num" w:pos="5760"/>
+        </w:tabs>
+        <w:ind w:left="5760" w:hanging="360"/>
+      </w:pPr>
+      <w:rPr>
+        <w:rFonts w:ascii="Wingdings" w:hAnsi="Wingdings" w:hint="default"/>
+        <w:sz w:val="20"/>
+      </w:rPr>
+    </w:lvl>
+    <w:lvl w:ilvl="8" w:tentative="1">
+      <w:start w:val="1"/>
+      <w:numFmt w:val="bullet"/>
+      <w:lvlText w:val=""/>
+      <w:lvlJc w:val="left"/>
+      <w:pPr>
+        <w:tabs>
+          <w:tab w:val="num" w:pos="6480"/>
+        </w:tabs>
+        <w:ind w:left="6480" w:hanging="360"/>
+      </w:pPr>
+      <w:rPr>
+        <w:rFonts w:ascii="Wingdings" w:hAnsi="Wingdings" w:hint="default"/>
+        <w:sz w:val="20"/>
+      </w:rPr>
+    </w:lvl>
+  </w:abstractNum>
+  <w:abstractNum w:abstractNumId="6" w15:restartNumberingAfterBreak="0">
+    <w:nsid w:val="2BF048D8"/>
+    <w:multiLevelType w:val="multilevel"/>
+    <w:tmpl w:val="6FD4945A"/>
+    <w:lvl w:ilvl="0">
+      <w:start w:val="1"/>
+      <w:numFmt w:val="bullet"/>
+      <w:lvlText w:val=""/>
+      <w:lvlJc w:val="left"/>
+      <w:pPr>
+        <w:tabs>
+          <w:tab w:val="num" w:pos="720"/>
+        </w:tabs>
+        <w:ind w:left="720" w:hanging="360"/>
+      </w:pPr>
+      <w:rPr>
+        <w:rFonts w:ascii="Symbol" w:hAnsi="Symbol" w:hint="default"/>
+        <w:sz w:val="20"/>
+      </w:rPr>
+    </w:lvl>
+    <w:lvl w:ilvl="1">
+      <w:start w:val="1"/>
+      <w:numFmt w:val="bullet"/>
+      <w:lvlText w:val="o"/>
+      <w:lvlJc w:val="left"/>
+      <w:pPr>
+        <w:tabs>
+          <w:tab w:val="num" w:pos="1440"/>
+        </w:tabs>
+        <w:ind w:left="1440" w:hanging="360"/>
+      </w:pPr>
+      <w:rPr>
+        <w:rFonts w:ascii="Courier New" w:hAnsi="Courier New" w:hint="default"/>
+        <w:sz w:val="20"/>
+      </w:rPr>
+    </w:lvl>
+    <w:lvl w:ilvl="2" w:tentative="1">
+      <w:start w:val="1"/>
+      <w:numFmt w:val="bullet"/>
+      <w:lvlText w:val=""/>
+      <w:lvlJc w:val="left"/>
+      <w:pPr>
+        <w:tabs>
+          <w:tab w:val="num" w:pos="2160"/>
+        </w:tabs>
+        <w:ind w:left="2160" w:hanging="360"/>
+      </w:pPr>
+      <w:rPr>
+        <w:rFonts w:ascii="Wingdings" w:hAnsi="Wingdings" w:hint="default"/>
+        <w:sz w:val="20"/>
+      </w:rPr>
+    </w:lvl>
+    <w:lvl w:ilvl="3" w:tentative="1">
+      <w:start w:val="1"/>
+      <w:numFmt w:val="bullet"/>
+      <w:lvlText w:val=""/>
+      <w:lvlJc w:val="left"/>
+      <w:pPr>
+        <w:tabs>
+          <w:tab w:val="num" w:pos="2880"/>
+        </w:tabs>
+        <w:ind w:left="2880" w:hanging="360"/>
+      </w:pPr>
+      <w:rPr>
+        <w:rFonts w:ascii="Wingdings" w:hAnsi="Wingdings" w:hint="default"/>
+        <w:sz w:val="20"/>
+      </w:rPr>
+    </w:lvl>
+    <w:lvl w:ilvl="4" w:tentative="1">
+      <w:start w:val="1"/>
+      <w:numFmt w:val="bullet"/>
+      <w:lvlText w:val=""/>
+      <w:lvlJc w:val="left"/>
+      <w:pPr>
+        <w:tabs>
+          <w:tab w:val="num" w:pos="3600"/>
+        </w:tabs>
+        <w:ind w:left="3600" w:hanging="360"/>
+      </w:pPr>
+      <w:rPr>
+        <w:rFonts w:ascii="Wingdings" w:hAnsi="Wingdings" w:hint="default"/>
+        <w:sz w:val="20"/>
+      </w:rPr>
+    </w:lvl>
+    <w:lvl w:ilvl="5" w:tentative="1">
+      <w:start w:val="1"/>
+      <w:numFmt w:val="bullet"/>
+      <w:lvlText w:val=""/>
+      <w:lvlJc w:val="left"/>
+      <w:pPr>
+        <w:tabs>
+          <w:tab w:val="num" w:pos="4320"/>
+        </w:tabs>
+        <w:ind w:left="4320" w:hanging="360"/>
+      </w:pPr>
+      <w:rPr>
+        <w:rFonts w:ascii="Wingdings" w:hAnsi="Wingdings" w:hint="default"/>
+        <w:sz w:val="20"/>
+      </w:rPr>
+    </w:lvl>
+    <w:lvl w:ilvl="6" w:tentative="1">
+      <w:start w:val="1"/>
+      <w:numFmt w:val="bullet"/>
+      <w:lvlText w:val=""/>
+      <w:lvlJc w:val="left"/>
+      <w:pPr>
+        <w:tabs>
+          <w:tab w:val="num" w:pos="5040"/>
+        </w:tabs>
+        <w:ind w:left="5040" w:hanging="360"/>
+      </w:pPr>
+      <w:rPr>
+        <w:rFonts w:ascii="Wingdings" w:hAnsi="Wingdings" w:hint="default"/>
+        <w:sz w:val="20"/>
+      </w:rPr>
+    </w:lvl>
+    <w:lvl w:ilvl="7" w:tentative="1">
+      <w:start w:val="1"/>
+      <w:numFmt w:val="bullet"/>
+      <w:lvlText w:val=""/>
+      <w:lvlJc w:val="left"/>
+      <w:pPr>
+        <w:tabs>
+          <w:tab w:val="num" w:pos="5760"/>
+        </w:tabs>
+        <w:ind w:left="5760" w:hanging="360"/>
+      </w:pPr>
+      <w:rPr>
+        <w:rFonts w:ascii="Wingdings" w:hAnsi="Wingdings" w:hint="default"/>
+        <w:sz w:val="20"/>
+      </w:rPr>
+    </w:lvl>
+    <w:lvl w:ilvl="8" w:tentative="1">
+      <w:start w:val="1"/>
+      <w:numFmt w:val="bullet"/>
+      <w:lvlText w:val=""/>
+      <w:lvlJc w:val="left"/>
+      <w:pPr>
+        <w:tabs>
+          <w:tab w:val="num" w:pos="6480"/>
+        </w:tabs>
+        <w:ind w:left="6480" w:hanging="360"/>
+      </w:pPr>
+      <w:rPr>
+        <w:rFonts w:ascii="Wingdings" w:hAnsi="Wingdings" w:hint="default"/>
+        <w:sz w:val="20"/>
+      </w:rPr>
+    </w:lvl>
+  </w:abstractNum>
+  <w:abstractNum w:abstractNumId="7" w15:restartNumberingAfterBreak="0">
     <w:nsid w:val="3F18494B"/>
     <w:multiLevelType w:val="hybridMultilevel"/>
     <w:tmpl w:val="A68CD09E"/>
@@ -1937,7 +4979,7 @@
       </w:pPr>
     </w:lvl>
   </w:abstractNum>
-  <w:abstractNum w:abstractNumId="3" w15:restartNumberingAfterBreak="0">
+  <w:abstractNum w:abstractNumId="8" w15:restartNumberingAfterBreak="0">
     <w:nsid w:val="3FBB2526"/>
     <w:multiLevelType w:val="multilevel"/>
     <w:tmpl w:val="AD2ADADC"/>
@@ -2086,10 +5128,606 @@
       </w:rPr>
     </w:lvl>
   </w:abstractNum>
-  <w:abstractNum w:abstractNumId="4" w15:restartNumberingAfterBreak="0">
+  <w:abstractNum w:abstractNumId="9" w15:restartNumberingAfterBreak="0">
+    <w:nsid w:val="558E6BC9"/>
+    <w:multiLevelType w:val="multilevel"/>
+    <w:tmpl w:val="90BAC220"/>
+    <w:lvl w:ilvl="0">
+      <w:start w:val="1"/>
+      <w:numFmt w:val="bullet"/>
+      <w:lvlText w:val=""/>
+      <w:lvlJc w:val="left"/>
+      <w:pPr>
+        <w:tabs>
+          <w:tab w:val="num" w:pos="720"/>
+        </w:tabs>
+        <w:ind w:left="720" w:hanging="360"/>
+      </w:pPr>
+      <w:rPr>
+        <w:rFonts w:ascii="Symbol" w:hAnsi="Symbol" w:hint="default"/>
+        <w:sz w:val="20"/>
+      </w:rPr>
+    </w:lvl>
+    <w:lvl w:ilvl="1" w:tentative="1">
+      <w:start w:val="1"/>
+      <w:numFmt w:val="bullet"/>
+      <w:lvlText w:val="o"/>
+      <w:lvlJc w:val="left"/>
+      <w:pPr>
+        <w:tabs>
+          <w:tab w:val="num" w:pos="1440"/>
+        </w:tabs>
+        <w:ind w:left="1440" w:hanging="360"/>
+      </w:pPr>
+      <w:rPr>
+        <w:rFonts w:ascii="Courier New" w:hAnsi="Courier New" w:hint="default"/>
+        <w:sz w:val="20"/>
+      </w:rPr>
+    </w:lvl>
+    <w:lvl w:ilvl="2" w:tentative="1">
+      <w:start w:val="1"/>
+      <w:numFmt w:val="bullet"/>
+      <w:lvlText w:val=""/>
+      <w:lvlJc w:val="left"/>
+      <w:pPr>
+        <w:tabs>
+          <w:tab w:val="num" w:pos="2160"/>
+        </w:tabs>
+        <w:ind w:left="2160" w:hanging="360"/>
+      </w:pPr>
+      <w:rPr>
+        <w:rFonts w:ascii="Wingdings" w:hAnsi="Wingdings" w:hint="default"/>
+        <w:sz w:val="20"/>
+      </w:rPr>
+    </w:lvl>
+    <w:lvl w:ilvl="3" w:tentative="1">
+      <w:start w:val="1"/>
+      <w:numFmt w:val="bullet"/>
+      <w:lvlText w:val=""/>
+      <w:lvlJc w:val="left"/>
+      <w:pPr>
+        <w:tabs>
+          <w:tab w:val="num" w:pos="2880"/>
+        </w:tabs>
+        <w:ind w:left="2880" w:hanging="360"/>
+      </w:pPr>
+      <w:rPr>
+        <w:rFonts w:ascii="Wingdings" w:hAnsi="Wingdings" w:hint="default"/>
+        <w:sz w:val="20"/>
+      </w:rPr>
+    </w:lvl>
+    <w:lvl w:ilvl="4" w:tentative="1">
+      <w:start w:val="1"/>
+      <w:numFmt w:val="bullet"/>
+      <w:lvlText w:val=""/>
+      <w:lvlJc w:val="left"/>
+      <w:pPr>
+        <w:tabs>
+          <w:tab w:val="num" w:pos="3600"/>
+        </w:tabs>
+        <w:ind w:left="3600" w:hanging="360"/>
+      </w:pPr>
+      <w:rPr>
+        <w:rFonts w:ascii="Wingdings" w:hAnsi="Wingdings" w:hint="default"/>
+        <w:sz w:val="20"/>
+      </w:rPr>
+    </w:lvl>
+    <w:lvl w:ilvl="5" w:tentative="1">
+      <w:start w:val="1"/>
+      <w:numFmt w:val="bullet"/>
+      <w:lvlText w:val=""/>
+      <w:lvlJc w:val="left"/>
+      <w:pPr>
+        <w:tabs>
+          <w:tab w:val="num" w:pos="4320"/>
+        </w:tabs>
+        <w:ind w:left="4320" w:hanging="360"/>
+      </w:pPr>
+      <w:rPr>
+        <w:rFonts w:ascii="Wingdings" w:hAnsi="Wingdings" w:hint="default"/>
+        <w:sz w:val="20"/>
+      </w:rPr>
+    </w:lvl>
+    <w:lvl w:ilvl="6" w:tentative="1">
+      <w:start w:val="1"/>
+      <w:numFmt w:val="bullet"/>
+      <w:lvlText w:val=""/>
+      <w:lvlJc w:val="left"/>
+      <w:pPr>
+        <w:tabs>
+          <w:tab w:val="num" w:pos="5040"/>
+        </w:tabs>
+        <w:ind w:left="5040" w:hanging="360"/>
+      </w:pPr>
+      <w:rPr>
+        <w:rFonts w:ascii="Wingdings" w:hAnsi="Wingdings" w:hint="default"/>
+        <w:sz w:val="20"/>
+      </w:rPr>
+    </w:lvl>
+    <w:lvl w:ilvl="7" w:tentative="1">
+      <w:start w:val="1"/>
+      <w:numFmt w:val="bullet"/>
+      <w:lvlText w:val=""/>
+      <w:lvlJc w:val="left"/>
+      <w:pPr>
+        <w:tabs>
+          <w:tab w:val="num" w:pos="5760"/>
+        </w:tabs>
+        <w:ind w:left="5760" w:hanging="360"/>
+      </w:pPr>
+      <w:rPr>
+        <w:rFonts w:ascii="Wingdings" w:hAnsi="Wingdings" w:hint="default"/>
+        <w:sz w:val="20"/>
+      </w:rPr>
+    </w:lvl>
+    <w:lvl w:ilvl="8" w:tentative="1">
+      <w:start w:val="1"/>
+      <w:numFmt w:val="bullet"/>
+      <w:lvlText w:val=""/>
+      <w:lvlJc w:val="left"/>
+      <w:pPr>
+        <w:tabs>
+          <w:tab w:val="num" w:pos="6480"/>
+        </w:tabs>
+        <w:ind w:left="6480" w:hanging="360"/>
+      </w:pPr>
+      <w:rPr>
+        <w:rFonts w:ascii="Wingdings" w:hAnsi="Wingdings" w:hint="default"/>
+        <w:sz w:val="20"/>
+      </w:rPr>
+    </w:lvl>
+  </w:abstractNum>
+  <w:abstractNum w:abstractNumId="10" w15:restartNumberingAfterBreak="0">
+    <w:nsid w:val="5645566A"/>
+    <w:multiLevelType w:val="multilevel"/>
+    <w:tmpl w:val="BBF63E64"/>
+    <w:lvl w:ilvl="0">
+      <w:start w:val="1"/>
+      <w:numFmt w:val="bullet"/>
+      <w:lvlText w:val=""/>
+      <w:lvlJc w:val="left"/>
+      <w:pPr>
+        <w:tabs>
+          <w:tab w:val="num" w:pos="720"/>
+        </w:tabs>
+        <w:ind w:left="720" w:hanging="360"/>
+      </w:pPr>
+      <w:rPr>
+        <w:rFonts w:ascii="Symbol" w:hAnsi="Symbol" w:hint="default"/>
+        <w:sz w:val="20"/>
+      </w:rPr>
+    </w:lvl>
+    <w:lvl w:ilvl="1" w:tentative="1">
+      <w:start w:val="1"/>
+      <w:numFmt w:val="bullet"/>
+      <w:lvlText w:val="o"/>
+      <w:lvlJc w:val="left"/>
+      <w:pPr>
+        <w:tabs>
+          <w:tab w:val="num" w:pos="1440"/>
+        </w:tabs>
+        <w:ind w:left="1440" w:hanging="360"/>
+      </w:pPr>
+      <w:rPr>
+        <w:rFonts w:ascii="Courier New" w:hAnsi="Courier New" w:hint="default"/>
+        <w:sz w:val="20"/>
+      </w:rPr>
+    </w:lvl>
+    <w:lvl w:ilvl="2" w:tentative="1">
+      <w:start w:val="1"/>
+      <w:numFmt w:val="bullet"/>
+      <w:lvlText w:val=""/>
+      <w:lvlJc w:val="left"/>
+      <w:pPr>
+        <w:tabs>
+          <w:tab w:val="num" w:pos="2160"/>
+        </w:tabs>
+        <w:ind w:left="2160" w:hanging="360"/>
+      </w:pPr>
+      <w:rPr>
+        <w:rFonts w:ascii="Wingdings" w:hAnsi="Wingdings" w:hint="default"/>
+        <w:sz w:val="20"/>
+      </w:rPr>
+    </w:lvl>
+    <w:lvl w:ilvl="3" w:tentative="1">
+      <w:start w:val="1"/>
+      <w:numFmt w:val="bullet"/>
+      <w:lvlText w:val=""/>
+      <w:lvlJc w:val="left"/>
+      <w:pPr>
+        <w:tabs>
+          <w:tab w:val="num" w:pos="2880"/>
+        </w:tabs>
+        <w:ind w:left="2880" w:hanging="360"/>
+      </w:pPr>
+      <w:rPr>
+        <w:rFonts w:ascii="Wingdings" w:hAnsi="Wingdings" w:hint="default"/>
+        <w:sz w:val="20"/>
+      </w:rPr>
+    </w:lvl>
+    <w:lvl w:ilvl="4" w:tentative="1">
+      <w:start w:val="1"/>
+      <w:numFmt w:val="bullet"/>
+      <w:lvlText w:val=""/>
+      <w:lvlJc w:val="left"/>
+      <w:pPr>
+        <w:tabs>
+          <w:tab w:val="num" w:pos="3600"/>
+        </w:tabs>
+        <w:ind w:left="3600" w:hanging="360"/>
+      </w:pPr>
+      <w:rPr>
+        <w:rFonts w:ascii="Wingdings" w:hAnsi="Wingdings" w:hint="default"/>
+        <w:sz w:val="20"/>
+      </w:rPr>
+    </w:lvl>
+    <w:lvl w:ilvl="5" w:tentative="1">
+      <w:start w:val="1"/>
+      <w:numFmt w:val="bullet"/>
+      <w:lvlText w:val=""/>
+      <w:lvlJc w:val="left"/>
+      <w:pPr>
+        <w:tabs>
+          <w:tab w:val="num" w:pos="4320"/>
+        </w:tabs>
+        <w:ind w:left="4320" w:hanging="360"/>
+      </w:pPr>
+      <w:rPr>
+        <w:rFonts w:ascii="Wingdings" w:hAnsi="Wingdings" w:hint="default"/>
+        <w:sz w:val="20"/>
+      </w:rPr>
+    </w:lvl>
+    <w:lvl w:ilvl="6" w:tentative="1">
+      <w:start w:val="1"/>
+      <w:numFmt w:val="bullet"/>
+      <w:lvlText w:val=""/>
+      <w:lvlJc w:val="left"/>
+      <w:pPr>
+        <w:tabs>
+          <w:tab w:val="num" w:pos="5040"/>
+        </w:tabs>
+        <w:ind w:left="5040" w:hanging="360"/>
+      </w:pPr>
+      <w:rPr>
+        <w:rFonts w:ascii="Wingdings" w:hAnsi="Wingdings" w:hint="default"/>
+        <w:sz w:val="20"/>
+      </w:rPr>
+    </w:lvl>
+    <w:lvl w:ilvl="7" w:tentative="1">
+      <w:start w:val="1"/>
+      <w:numFmt w:val="bullet"/>
+      <w:lvlText w:val=""/>
+      <w:lvlJc w:val="left"/>
+      <w:pPr>
+        <w:tabs>
+          <w:tab w:val="num" w:pos="5760"/>
+        </w:tabs>
+        <w:ind w:left="5760" w:hanging="360"/>
+      </w:pPr>
+      <w:rPr>
+        <w:rFonts w:ascii="Wingdings" w:hAnsi="Wingdings" w:hint="default"/>
+        <w:sz w:val="20"/>
+      </w:rPr>
+    </w:lvl>
+    <w:lvl w:ilvl="8" w:tentative="1">
+      <w:start w:val="1"/>
+      <w:numFmt w:val="bullet"/>
+      <w:lvlText w:val=""/>
+      <w:lvlJc w:val="left"/>
+      <w:pPr>
+        <w:tabs>
+          <w:tab w:val="num" w:pos="6480"/>
+        </w:tabs>
+        <w:ind w:left="6480" w:hanging="360"/>
+      </w:pPr>
+      <w:rPr>
+        <w:rFonts w:ascii="Wingdings" w:hAnsi="Wingdings" w:hint="default"/>
+        <w:sz w:val="20"/>
+      </w:rPr>
+    </w:lvl>
+  </w:abstractNum>
+  <w:abstractNum w:abstractNumId="11" w15:restartNumberingAfterBreak="0">
+    <w:nsid w:val="578A0129"/>
+    <w:multiLevelType w:val="multilevel"/>
+    <w:tmpl w:val="54F47686"/>
+    <w:lvl w:ilvl="0">
+      <w:start w:val="1"/>
+      <w:numFmt w:val="bullet"/>
+      <w:lvlText w:val=""/>
+      <w:lvlJc w:val="left"/>
+      <w:pPr>
+        <w:tabs>
+          <w:tab w:val="num" w:pos="720"/>
+        </w:tabs>
+        <w:ind w:left="720" w:hanging="360"/>
+      </w:pPr>
+      <w:rPr>
+        <w:rFonts w:ascii="Symbol" w:hAnsi="Symbol" w:hint="default"/>
+        <w:sz w:val="20"/>
+      </w:rPr>
+    </w:lvl>
+    <w:lvl w:ilvl="1" w:tentative="1">
+      <w:start w:val="1"/>
+      <w:numFmt w:val="bullet"/>
+      <w:lvlText w:val="o"/>
+      <w:lvlJc w:val="left"/>
+      <w:pPr>
+        <w:tabs>
+          <w:tab w:val="num" w:pos="1440"/>
+        </w:tabs>
+        <w:ind w:left="1440" w:hanging="360"/>
+      </w:pPr>
+      <w:rPr>
+        <w:rFonts w:ascii="Courier New" w:hAnsi="Courier New" w:hint="default"/>
+        <w:sz w:val="20"/>
+      </w:rPr>
+    </w:lvl>
+    <w:lvl w:ilvl="2" w:tentative="1">
+      <w:start w:val="1"/>
+      <w:numFmt w:val="bullet"/>
+      <w:lvlText w:val=""/>
+      <w:lvlJc w:val="left"/>
+      <w:pPr>
+        <w:tabs>
+          <w:tab w:val="num" w:pos="2160"/>
+        </w:tabs>
+        <w:ind w:left="2160" w:hanging="360"/>
+      </w:pPr>
+      <w:rPr>
+        <w:rFonts w:ascii="Wingdings" w:hAnsi="Wingdings" w:hint="default"/>
+        <w:sz w:val="20"/>
+      </w:rPr>
+    </w:lvl>
+    <w:lvl w:ilvl="3" w:tentative="1">
+      <w:start w:val="1"/>
+      <w:numFmt w:val="bullet"/>
+      <w:lvlText w:val=""/>
+      <w:lvlJc w:val="left"/>
+      <w:pPr>
+        <w:tabs>
+          <w:tab w:val="num" w:pos="2880"/>
+        </w:tabs>
+        <w:ind w:left="2880" w:hanging="360"/>
+      </w:pPr>
+      <w:rPr>
+        <w:rFonts w:ascii="Wingdings" w:hAnsi="Wingdings" w:hint="default"/>
+        <w:sz w:val="20"/>
+      </w:rPr>
+    </w:lvl>
+    <w:lvl w:ilvl="4" w:tentative="1">
+      <w:start w:val="1"/>
+      <w:numFmt w:val="bullet"/>
+      <w:lvlText w:val=""/>
+      <w:lvlJc w:val="left"/>
+      <w:pPr>
+        <w:tabs>
+          <w:tab w:val="num" w:pos="3600"/>
+        </w:tabs>
+        <w:ind w:left="3600" w:hanging="360"/>
+      </w:pPr>
+      <w:rPr>
+        <w:rFonts w:ascii="Wingdings" w:hAnsi="Wingdings" w:hint="default"/>
+        <w:sz w:val="20"/>
+      </w:rPr>
+    </w:lvl>
+    <w:lvl w:ilvl="5" w:tentative="1">
+      <w:start w:val="1"/>
+      <w:numFmt w:val="bullet"/>
+      <w:lvlText w:val=""/>
+      <w:lvlJc w:val="left"/>
+      <w:pPr>
+        <w:tabs>
+          <w:tab w:val="num" w:pos="4320"/>
+        </w:tabs>
+        <w:ind w:left="4320" w:hanging="360"/>
+      </w:pPr>
+      <w:rPr>
+        <w:rFonts w:ascii="Wingdings" w:hAnsi="Wingdings" w:hint="default"/>
+        <w:sz w:val="20"/>
+      </w:rPr>
+    </w:lvl>
+    <w:lvl w:ilvl="6" w:tentative="1">
+      <w:start w:val="1"/>
+      <w:numFmt w:val="bullet"/>
+      <w:lvlText w:val=""/>
+      <w:lvlJc w:val="left"/>
+      <w:pPr>
+        <w:tabs>
+          <w:tab w:val="num" w:pos="5040"/>
+        </w:tabs>
+        <w:ind w:left="5040" w:hanging="360"/>
+      </w:pPr>
+      <w:rPr>
+        <w:rFonts w:ascii="Wingdings" w:hAnsi="Wingdings" w:hint="default"/>
+        <w:sz w:val="20"/>
+      </w:rPr>
+    </w:lvl>
+    <w:lvl w:ilvl="7" w:tentative="1">
+      <w:start w:val="1"/>
+      <w:numFmt w:val="bullet"/>
+      <w:lvlText w:val=""/>
+      <w:lvlJc w:val="left"/>
+      <w:pPr>
+        <w:tabs>
+          <w:tab w:val="num" w:pos="5760"/>
+        </w:tabs>
+        <w:ind w:left="5760" w:hanging="360"/>
+      </w:pPr>
+      <w:rPr>
+        <w:rFonts w:ascii="Wingdings" w:hAnsi="Wingdings" w:hint="default"/>
+        <w:sz w:val="20"/>
+      </w:rPr>
+    </w:lvl>
+    <w:lvl w:ilvl="8" w:tentative="1">
+      <w:start w:val="1"/>
+      <w:numFmt w:val="bullet"/>
+      <w:lvlText w:val=""/>
+      <w:lvlJc w:val="left"/>
+      <w:pPr>
+        <w:tabs>
+          <w:tab w:val="num" w:pos="6480"/>
+        </w:tabs>
+        <w:ind w:left="6480" w:hanging="360"/>
+      </w:pPr>
+      <w:rPr>
+        <w:rFonts w:ascii="Wingdings" w:hAnsi="Wingdings" w:hint="default"/>
+        <w:sz w:val="20"/>
+      </w:rPr>
+    </w:lvl>
+  </w:abstractNum>
+  <w:abstractNum w:abstractNumId="12" w15:restartNumberingAfterBreak="0">
+    <w:nsid w:val="6B642698"/>
+    <w:multiLevelType w:val="multilevel"/>
+    <w:tmpl w:val="BA70F120"/>
+    <w:lvl w:ilvl="0">
+      <w:start w:val="1"/>
+      <w:numFmt w:val="bullet"/>
+      <w:lvlText w:val=""/>
+      <w:lvlJc w:val="left"/>
+      <w:pPr>
+        <w:tabs>
+          <w:tab w:val="num" w:pos="720"/>
+        </w:tabs>
+        <w:ind w:left="720" w:hanging="360"/>
+      </w:pPr>
+      <w:rPr>
+        <w:rFonts w:ascii="Symbol" w:hAnsi="Symbol" w:hint="default"/>
+        <w:sz w:val="20"/>
+      </w:rPr>
+    </w:lvl>
+    <w:lvl w:ilvl="1">
+      <w:start w:val="1"/>
+      <w:numFmt w:val="bullet"/>
+      <w:lvlText w:val="o"/>
+      <w:lvlJc w:val="left"/>
+      <w:pPr>
+        <w:tabs>
+          <w:tab w:val="num" w:pos="1440"/>
+        </w:tabs>
+        <w:ind w:left="1440" w:hanging="360"/>
+      </w:pPr>
+      <w:rPr>
+        <w:rFonts w:ascii="Courier New" w:hAnsi="Courier New" w:hint="default"/>
+        <w:sz w:val="20"/>
+      </w:rPr>
+    </w:lvl>
+    <w:lvl w:ilvl="2" w:tentative="1">
+      <w:start w:val="1"/>
+      <w:numFmt w:val="bullet"/>
+      <w:lvlText w:val=""/>
+      <w:lvlJc w:val="left"/>
+      <w:pPr>
+        <w:tabs>
+          <w:tab w:val="num" w:pos="2160"/>
+        </w:tabs>
+        <w:ind w:left="2160" w:hanging="360"/>
+      </w:pPr>
+      <w:rPr>
+        <w:rFonts w:ascii="Wingdings" w:hAnsi="Wingdings" w:hint="default"/>
+        <w:sz w:val="20"/>
+      </w:rPr>
+    </w:lvl>
+    <w:lvl w:ilvl="3" w:tentative="1">
+      <w:start w:val="1"/>
+      <w:numFmt w:val="bullet"/>
+      <w:lvlText w:val=""/>
+      <w:lvlJc w:val="left"/>
+      <w:pPr>
+        <w:tabs>
+          <w:tab w:val="num" w:pos="2880"/>
+        </w:tabs>
+        <w:ind w:left="2880" w:hanging="360"/>
+      </w:pPr>
+      <w:rPr>
+        <w:rFonts w:ascii="Wingdings" w:hAnsi="Wingdings" w:hint="default"/>
+        <w:sz w:val="20"/>
+      </w:rPr>
+    </w:lvl>
+    <w:lvl w:ilvl="4" w:tentative="1">
+      <w:start w:val="1"/>
+      <w:numFmt w:val="bullet"/>
+      <w:lvlText w:val=""/>
+      <w:lvlJc w:val="left"/>
+      <w:pPr>
+        <w:tabs>
+          <w:tab w:val="num" w:pos="3600"/>
+        </w:tabs>
+        <w:ind w:left="3600" w:hanging="360"/>
+      </w:pPr>
+      <w:rPr>
+        <w:rFonts w:ascii="Wingdings" w:hAnsi="Wingdings" w:hint="default"/>
+        <w:sz w:val="20"/>
+      </w:rPr>
+    </w:lvl>
+    <w:lvl w:ilvl="5" w:tentative="1">
+      <w:start w:val="1"/>
+      <w:numFmt w:val="bullet"/>
+      <w:lvlText w:val=""/>
+      <w:lvlJc w:val="left"/>
+      <w:pPr>
+        <w:tabs>
+          <w:tab w:val="num" w:pos="4320"/>
+        </w:tabs>
+        <w:ind w:left="4320" w:hanging="360"/>
+      </w:pPr>
+      <w:rPr>
+        <w:rFonts w:ascii="Wingdings" w:hAnsi="Wingdings" w:hint="default"/>
+        <w:sz w:val="20"/>
+      </w:rPr>
+    </w:lvl>
+    <w:lvl w:ilvl="6" w:tentative="1">
+      <w:start w:val="1"/>
+      <w:numFmt w:val="bullet"/>
+      <w:lvlText w:val=""/>
+      <w:lvlJc w:val="left"/>
+      <w:pPr>
+        <w:tabs>
+          <w:tab w:val="num" w:pos="5040"/>
+        </w:tabs>
+        <w:ind w:left="5040" w:hanging="360"/>
+      </w:pPr>
+      <w:rPr>
+        <w:rFonts w:ascii="Wingdings" w:hAnsi="Wingdings" w:hint="default"/>
+        <w:sz w:val="20"/>
+      </w:rPr>
+    </w:lvl>
+    <w:lvl w:ilvl="7" w:tentative="1">
+      <w:start w:val="1"/>
+      <w:numFmt w:val="bullet"/>
+      <w:lvlText w:val=""/>
+      <w:lvlJc w:val="left"/>
+      <w:pPr>
+        <w:tabs>
+          <w:tab w:val="num" w:pos="5760"/>
+        </w:tabs>
+        <w:ind w:left="5760" w:hanging="360"/>
+      </w:pPr>
+      <w:rPr>
+        <w:rFonts w:ascii="Wingdings" w:hAnsi="Wingdings" w:hint="default"/>
+        <w:sz w:val="20"/>
+      </w:rPr>
+    </w:lvl>
+    <w:lvl w:ilvl="8" w:tentative="1">
+      <w:start w:val="1"/>
+      <w:numFmt w:val="bullet"/>
+      <w:lvlText w:val=""/>
+      <w:lvlJc w:val="left"/>
+      <w:pPr>
+        <w:tabs>
+          <w:tab w:val="num" w:pos="6480"/>
+        </w:tabs>
+        <w:ind w:left="6480" w:hanging="360"/>
+      </w:pPr>
+      <w:rPr>
+        <w:rFonts w:ascii="Wingdings" w:hAnsi="Wingdings" w:hint="default"/>
+        <w:sz w:val="20"/>
+      </w:rPr>
+    </w:lvl>
+  </w:abstractNum>
+  <w:abstractNum w:abstractNumId="13" w15:restartNumberingAfterBreak="0">
     <w:nsid w:val="6FFD0680"/>
     <w:multiLevelType w:val="multilevel"/>
-    <w:tmpl w:val="32A0A3EC"/>
+    <w:tmpl w:val="AF724A96"/>
     <w:lvl w:ilvl="0">
       <w:start w:val="1"/>
       <w:numFmt w:val="bullet"/>
@@ -2106,20 +5744,17 @@
         <w:sz w:val="20"/>
       </w:rPr>
     </w:lvl>
-    <w:lvl w:ilvl="1" w:tentative="1">
-      <w:start w:val="1"/>
-      <w:numFmt w:val="bullet"/>
-      <w:lvlText w:val="o"/>
-      <w:lvlJc w:val="left"/>
-      <w:pPr>
-        <w:tabs>
-          <w:tab w:val="num" w:pos="1440"/>
-        </w:tabs>
+    <w:lvl w:ilvl="1">
+      <w:start w:val="1"/>
+      <w:numFmt w:val="decimal"/>
+      <w:lvlText w:val="%2-"/>
+      <w:lvlJc w:val="left"/>
+      <w:pPr>
         <w:ind w:left="1440" w:hanging="360"/>
       </w:pPr>
       <w:rPr>
-        <w:rFonts w:ascii="Courier New" w:hAnsi="Courier New" w:hint="default"/>
-        <w:sz w:val="20"/>
+        <w:rFonts w:hint="default"/>
+        <w:b/>
       </w:rPr>
     </w:lvl>
     <w:lvl w:ilvl="2" w:tentative="1">
@@ -2235,7 +5870,7 @@
       </w:rPr>
     </w:lvl>
   </w:abstractNum>
-  <w:abstractNum w:abstractNumId="5" w15:restartNumberingAfterBreak="0">
+  <w:abstractNum w:abstractNumId="14" w15:restartNumberingAfterBreak="0">
     <w:nsid w:val="75877FAB"/>
     <w:multiLevelType w:val="multilevel"/>
     <w:tmpl w:val="3C8048E8"/>
@@ -2349,22 +5984,49 @@
     </w:lvl>
   </w:abstractNum>
   <w:num w:numId="1" w16cid:durableId="2010866847">
-    <w:abstractNumId w:val="1"/>
+    <w:abstractNumId w:val="3"/>
   </w:num>
   <w:num w:numId="2" w16cid:durableId="388696275">
     <w:abstractNumId w:val="0"/>
   </w:num>
   <w:num w:numId="3" w16cid:durableId="1559586336">
-    <w:abstractNumId w:val="3"/>
+    <w:abstractNumId w:val="8"/>
   </w:num>
   <w:num w:numId="4" w16cid:durableId="863010032">
+    <w:abstractNumId w:val="7"/>
+  </w:num>
+  <w:num w:numId="5" w16cid:durableId="2137480602">
+    <w:abstractNumId w:val="13"/>
+  </w:num>
+  <w:num w:numId="6" w16cid:durableId="828447545">
+    <w:abstractNumId w:val="14"/>
+  </w:num>
+  <w:num w:numId="7" w16cid:durableId="1736388261">
+    <w:abstractNumId w:val="10"/>
+  </w:num>
+  <w:num w:numId="8" w16cid:durableId="97876124">
+    <w:abstractNumId w:val="5"/>
+  </w:num>
+  <w:num w:numId="9" w16cid:durableId="1702824430">
+    <w:abstractNumId w:val="9"/>
+  </w:num>
+  <w:num w:numId="10" w16cid:durableId="1657224392">
+    <w:abstractNumId w:val="6"/>
+  </w:num>
+  <w:num w:numId="11" w16cid:durableId="602345971">
     <w:abstractNumId w:val="2"/>
   </w:num>
-  <w:num w:numId="5" w16cid:durableId="2137480602">
+  <w:num w:numId="12" w16cid:durableId="1246308174">
+    <w:abstractNumId w:val="11"/>
+  </w:num>
+  <w:num w:numId="13" w16cid:durableId="2001496677">
     <w:abstractNumId w:val="4"/>
   </w:num>
-  <w:num w:numId="6" w16cid:durableId="828447545">
-    <w:abstractNumId w:val="5"/>
+  <w:num w:numId="14" w16cid:durableId="283846998">
+    <w:abstractNumId w:val="12"/>
+  </w:num>
+  <w:num w:numId="15" w16cid:durableId="377167331">
+    <w:abstractNumId w:val="1"/>
   </w:num>
 </w:numbering>
 </file>

</xml_diff>

<commit_message>
add User-Classes and Characteristics
</commit_message>
<xml_diff>
--- a/doc/task.docx
+++ b/doc/task.docx
@@ -3797,10 +3797,8 @@
     <w:p>
       <w:pPr>
         <w:rPr>
-          <w:rFonts w:hint="cs"/>
-          <w:sz w:val="28"/>
-          <w:szCs w:val="28"/>
-          <w:rtl/>
+          <w:sz w:val="28"/>
+          <w:szCs w:val="28"/>
           <w:lang w:bidi="ar-EG"/>
         </w:rPr>
       </w:pPr>
@@ -3863,6 +3861,1169 @@
         </w:drawing>
       </w:r>
     </w:p>
+    <w:p>
+      <w:pPr>
+        <w:rPr>
+          <w:b/>
+          <w:bCs/>
+          <w:sz w:val="40"/>
+          <w:szCs w:val="40"/>
+          <w:rtl/>
+          <w:lang w:bidi="ar-EG"/>
+        </w:rPr>
+      </w:pPr>
+      <w:r>
+        <w:rPr>
+          <w:b/>
+          <w:bCs/>
+          <w:sz w:val="40"/>
+          <w:szCs w:val="40"/>
+          <w:lang w:bidi="ar-EG"/>
+        </w:rPr>
+        <w:lastRenderedPageBreak/>
+        <w:t xml:space="preserve"> </w:t>
+      </w:r>
+      <w:r>
+        <w:rPr>
+          <w:b/>
+          <w:bCs/>
+          <w:sz w:val="40"/>
+          <w:szCs w:val="40"/>
+          <w:lang w:bidi="ar-EG"/>
+        </w:rPr>
+        <w:t>2.3 User Classes and Characteristics</w:t>
+      </w:r>
+    </w:p>
+    <w:p>
+      <w:pPr>
+        <w:rPr>
+          <w:sz w:val="28"/>
+          <w:szCs w:val="28"/>
+          <w:lang w:bidi="ar-EG"/>
+        </w:rPr>
+      </w:pPr>
+      <w:r>
+        <w:rPr>
+          <w:sz w:val="28"/>
+          <w:szCs w:val="28"/>
+          <w:lang w:bidi="ar-EG"/>
+        </w:rPr>
+        <w:t>The Fit</w:t>
+      </w:r>
+      <w:r>
+        <w:rPr>
+          <w:sz w:val="28"/>
+          <w:szCs w:val="28"/>
+          <w:lang w:bidi="ar-EG"/>
+        </w:rPr>
+        <w:t>-</w:t>
+      </w:r>
+      <w:r>
+        <w:rPr>
+          <w:sz w:val="28"/>
+          <w:szCs w:val="28"/>
+          <w:lang w:bidi="ar-EG"/>
+        </w:rPr>
+        <w:t>Track System is designed to support three main user classes, each having specific roles, permissions, and functionalities within the system.</w:t>
+      </w:r>
+      <w:r>
+        <w:rPr>
+          <w:sz w:val="28"/>
+          <w:szCs w:val="28"/>
+          <w:lang w:bidi="ar-EG"/>
+        </w:rPr>
+        <w:br/>
+        <w:t>The user classes are described as follows:</w:t>
+      </w:r>
+    </w:p>
+    <w:p>
+      <w:pPr>
+        <w:rPr>
+          <w:b/>
+          <w:bCs/>
+          <w:sz w:val="28"/>
+          <w:szCs w:val="28"/>
+          <w:lang w:bidi="ar-EG"/>
+        </w:rPr>
+      </w:pPr>
+      <w:r>
+        <w:rPr>
+          <w:rFonts w:ascii="Segoe UI Emoji" w:hAnsi="Segoe UI Emoji" w:cs="Segoe UI Emoji"/>
+          <w:b/>
+          <w:bCs/>
+          <w:sz w:val="28"/>
+          <w:szCs w:val="28"/>
+          <w:lang w:bidi="ar-EG"/>
+        </w:rPr>
+        <w:t>🧍</w:t>
+      </w:r>
+      <w:r>
+        <w:rPr>
+          <w:b/>
+          <w:bCs/>
+          <w:sz w:val="28"/>
+          <w:szCs w:val="28"/>
+          <w:lang w:bidi="ar-EG"/>
+        </w:rPr>
+        <w:t>‍</w:t>
+      </w:r>
+      <w:r>
+        <w:rPr>
+          <w:rFonts w:ascii="Segoe UI Emoji" w:hAnsi="Segoe UI Emoji" w:cs="Segoe UI Emoji"/>
+          <w:b/>
+          <w:bCs/>
+          <w:sz w:val="28"/>
+          <w:szCs w:val="28"/>
+          <w:lang w:bidi="ar-EG"/>
+        </w:rPr>
+        <w:t>♂️</w:t>
+      </w:r>
+      <w:r>
+        <w:rPr>
+          <w:b/>
+          <w:bCs/>
+          <w:sz w:val="28"/>
+          <w:szCs w:val="28"/>
+          <w:lang w:bidi="ar-EG"/>
+        </w:rPr>
+        <w:t xml:space="preserve"> 1. Member (Client User)</w:t>
+      </w:r>
+    </w:p>
+    <w:p>
+      <w:pPr>
+        <w:rPr>
+          <w:sz w:val="28"/>
+          <w:szCs w:val="28"/>
+          <w:lang w:bidi="ar-EG"/>
+        </w:rPr>
+      </w:pPr>
+      <w:r>
+        <w:rPr>
+          <w:b/>
+          <w:bCs/>
+          <w:sz w:val="28"/>
+          <w:szCs w:val="28"/>
+          <w:lang w:bidi="ar-EG"/>
+        </w:rPr>
+        <w:t>Description:</w:t>
+      </w:r>
+      <w:r>
+        <w:rPr>
+          <w:sz w:val="28"/>
+          <w:szCs w:val="28"/>
+          <w:lang w:bidi="ar-EG"/>
+        </w:rPr>
+        <w:br/>
+        <w:t>The member is the end-user who subscribes to the gym or online coaching services. Members use the platform to track their fitness journey, follow assigned workout and nutrition plans, and communicate with their assigned coach or the AI chatbot.</w:t>
+      </w:r>
+    </w:p>
+    <w:p>
+      <w:pPr>
+        <w:rPr>
+          <w:sz w:val="28"/>
+          <w:szCs w:val="28"/>
+          <w:lang w:bidi="ar-EG"/>
+        </w:rPr>
+      </w:pPr>
+      <w:r>
+        <w:rPr>
+          <w:b/>
+          <w:bCs/>
+          <w:sz w:val="28"/>
+          <w:szCs w:val="28"/>
+          <w:lang w:bidi="ar-EG"/>
+        </w:rPr>
+        <w:t>Key Responsibilities:</w:t>
+      </w:r>
+    </w:p>
+    <w:p>
+      <w:pPr>
+        <w:numPr>
+          <w:ilvl w:val="0"/>
+          <w:numId w:val="16"/>
+        </w:numPr>
+        <w:rPr>
+          <w:sz w:val="28"/>
+          <w:szCs w:val="28"/>
+          <w:lang w:bidi="ar-EG"/>
+        </w:rPr>
+      </w:pPr>
+      <w:r>
+        <w:rPr>
+          <w:sz w:val="28"/>
+          <w:szCs w:val="28"/>
+          <w:lang w:bidi="ar-EG"/>
+        </w:rPr>
+        <w:t>Register and manage personal profile.</w:t>
+      </w:r>
+    </w:p>
+    <w:p>
+      <w:pPr>
+        <w:numPr>
+          <w:ilvl w:val="0"/>
+          <w:numId w:val="16"/>
+        </w:numPr>
+        <w:rPr>
+          <w:sz w:val="28"/>
+          <w:szCs w:val="28"/>
+          <w:lang w:bidi="ar-EG"/>
+        </w:rPr>
+      </w:pPr>
+      <w:r>
+        <w:rPr>
+          <w:sz w:val="28"/>
+          <w:szCs w:val="28"/>
+          <w:lang w:bidi="ar-EG"/>
+        </w:rPr>
+        <w:t>Access assigned workout and nutrition plans.</w:t>
+      </w:r>
+    </w:p>
+    <w:p>
+      <w:pPr>
+        <w:numPr>
+          <w:ilvl w:val="0"/>
+          <w:numId w:val="16"/>
+        </w:numPr>
+        <w:rPr>
+          <w:sz w:val="28"/>
+          <w:szCs w:val="28"/>
+          <w:lang w:bidi="ar-EG"/>
+        </w:rPr>
+      </w:pPr>
+      <w:r>
+        <w:rPr>
+          <w:sz w:val="28"/>
+          <w:szCs w:val="28"/>
+          <w:lang w:bidi="ar-EG"/>
+        </w:rPr>
+        <w:t>Log daily progress (exercises, calories, time).</w:t>
+      </w:r>
+    </w:p>
+    <w:p>
+      <w:pPr>
+        <w:numPr>
+          <w:ilvl w:val="0"/>
+          <w:numId w:val="16"/>
+        </w:numPr>
+        <w:rPr>
+          <w:sz w:val="28"/>
+          <w:szCs w:val="28"/>
+          <w:lang w:bidi="ar-EG"/>
+        </w:rPr>
+      </w:pPr>
+      <w:r>
+        <w:rPr>
+          <w:sz w:val="28"/>
+          <w:szCs w:val="28"/>
+          <w:lang w:bidi="ar-EG"/>
+        </w:rPr>
+        <w:t>Chat with coach or AI chatbot for guidance.</w:t>
+      </w:r>
+    </w:p>
+    <w:p>
+      <w:pPr>
+        <w:numPr>
+          <w:ilvl w:val="0"/>
+          <w:numId w:val="16"/>
+        </w:numPr>
+        <w:rPr>
+          <w:sz w:val="28"/>
+          <w:szCs w:val="28"/>
+          <w:lang w:bidi="ar-EG"/>
+        </w:rPr>
+      </w:pPr>
+      <w:r>
+        <w:rPr>
+          <w:sz w:val="28"/>
+          <w:szCs w:val="28"/>
+          <w:lang w:bidi="ar-EG"/>
+        </w:rPr>
+        <w:t>Purchase gym-related products from the e-commerce store.</w:t>
+      </w:r>
+    </w:p>
+    <w:p>
+      <w:pPr>
+        <w:numPr>
+          <w:ilvl w:val="0"/>
+          <w:numId w:val="16"/>
+        </w:numPr>
+        <w:rPr>
+          <w:sz w:val="28"/>
+          <w:szCs w:val="28"/>
+          <w:lang w:bidi="ar-EG"/>
+        </w:rPr>
+      </w:pPr>
+      <w:r>
+        <w:rPr>
+          <w:sz w:val="28"/>
+          <w:szCs w:val="28"/>
+          <w:lang w:bidi="ar-EG"/>
+        </w:rPr>
+        <w:t>Make online payments for subscriptions or purchases.</w:t>
+      </w:r>
+    </w:p>
+    <w:p>
+      <w:pPr>
+        <w:rPr>
+          <w:sz w:val="28"/>
+          <w:szCs w:val="28"/>
+          <w:lang w:bidi="ar-EG"/>
+        </w:rPr>
+      </w:pPr>
+      <w:r>
+        <w:rPr>
+          <w:b/>
+          <w:bCs/>
+          <w:sz w:val="28"/>
+          <w:szCs w:val="28"/>
+          <w:lang w:bidi="ar-EG"/>
+        </w:rPr>
+        <w:t>Technical Knowledge:</w:t>
+      </w:r>
+    </w:p>
+    <w:p>
+      <w:pPr>
+        <w:numPr>
+          <w:ilvl w:val="0"/>
+          <w:numId w:val="17"/>
+        </w:numPr>
+        <w:rPr>
+          <w:sz w:val="28"/>
+          <w:szCs w:val="28"/>
+          <w:lang w:bidi="ar-EG"/>
+        </w:rPr>
+      </w:pPr>
+      <w:r>
+        <w:rPr>
+          <w:sz w:val="28"/>
+          <w:szCs w:val="28"/>
+          <w:lang w:bidi="ar-EG"/>
+        </w:rPr>
+        <w:t>Basic computer/mobile usage skills.</w:t>
+      </w:r>
+    </w:p>
+    <w:p>
+      <w:pPr>
+        <w:numPr>
+          <w:ilvl w:val="0"/>
+          <w:numId w:val="17"/>
+        </w:numPr>
+        <w:rPr>
+          <w:sz w:val="28"/>
+          <w:szCs w:val="28"/>
+          <w:lang w:bidi="ar-EG"/>
+        </w:rPr>
+      </w:pPr>
+      <w:r>
+        <w:rPr>
+          <w:sz w:val="28"/>
+          <w:szCs w:val="28"/>
+          <w:lang w:bidi="ar-EG"/>
+        </w:rPr>
+        <w:t>Familiar with fitness and workout tracking applications.</w:t>
+      </w:r>
+    </w:p>
+    <w:p>
+      <w:pPr>
+        <w:rPr>
+          <w:sz w:val="28"/>
+          <w:szCs w:val="28"/>
+          <w:lang w:bidi="ar-EG"/>
+        </w:rPr>
+      </w:pPr>
+      <w:r>
+        <w:rPr>
+          <w:b/>
+          <w:bCs/>
+          <w:sz w:val="28"/>
+          <w:szCs w:val="28"/>
+          <w:lang w:bidi="ar-EG"/>
+        </w:rPr>
+        <w:t>Access Level:</w:t>
+      </w:r>
+    </w:p>
+    <w:p>
+      <w:pPr>
+        <w:numPr>
+          <w:ilvl w:val="0"/>
+          <w:numId w:val="18"/>
+        </w:numPr>
+        <w:rPr>
+          <w:sz w:val="28"/>
+          <w:szCs w:val="28"/>
+          <w:lang w:bidi="ar-EG"/>
+        </w:rPr>
+      </w:pPr>
+      <w:r>
+        <w:rPr>
+          <w:sz w:val="28"/>
+          <w:szCs w:val="28"/>
+          <w:lang w:bidi="ar-EG"/>
+        </w:rPr>
+        <w:t>Limited access (can only view or edit personal data).</w:t>
+      </w:r>
+    </w:p>
+    <w:p>
+      <w:pPr>
+        <w:rPr>
+          <w:sz w:val="28"/>
+          <w:szCs w:val="28"/>
+          <w:lang w:bidi="ar-EG"/>
+        </w:rPr>
+      </w:pPr>
+    </w:p>
+    <w:p>
+      <w:pPr>
+        <w:rPr>
+          <w:b/>
+          <w:bCs/>
+          <w:sz w:val="40"/>
+          <w:szCs w:val="40"/>
+          <w:lang w:val="en-GB" w:bidi="ar-EG"/>
+        </w:rPr>
+      </w:pPr>
+    </w:p>
+    <w:p>
+      <w:pPr>
+        <w:rPr>
+          <w:b/>
+          <w:bCs/>
+          <w:sz w:val="28"/>
+          <w:szCs w:val="28"/>
+          <w:lang w:bidi="ar-EG"/>
+        </w:rPr>
+      </w:pPr>
+      <w:r>
+        <w:rPr>
+          <w:rFonts w:ascii="Segoe UI Emoji" w:hAnsi="Segoe UI Emoji" w:cs="Segoe UI Emoji"/>
+          <w:b/>
+          <w:bCs/>
+          <w:sz w:val="28"/>
+          <w:szCs w:val="28"/>
+          <w:lang w:bidi="ar-EG"/>
+        </w:rPr>
+        <w:lastRenderedPageBreak/>
+        <w:t>🧑</w:t>
+      </w:r>
+      <w:r>
+        <w:rPr>
+          <w:b/>
+          <w:bCs/>
+          <w:sz w:val="28"/>
+          <w:szCs w:val="28"/>
+          <w:lang w:bidi="ar-EG"/>
+        </w:rPr>
+        <w:t>‍</w:t>
+      </w:r>
+      <w:r>
+        <w:rPr>
+          <w:rFonts w:ascii="Segoe UI Emoji" w:hAnsi="Segoe UI Emoji" w:cs="Segoe UI Emoji"/>
+          <w:b/>
+          <w:bCs/>
+          <w:sz w:val="28"/>
+          <w:szCs w:val="28"/>
+          <w:lang w:bidi="ar-EG"/>
+        </w:rPr>
+        <w:t>🏫</w:t>
+      </w:r>
+      <w:r>
+        <w:rPr>
+          <w:b/>
+          <w:bCs/>
+          <w:sz w:val="28"/>
+          <w:szCs w:val="28"/>
+          <w:lang w:bidi="ar-EG"/>
+        </w:rPr>
+        <w:t xml:space="preserve"> 2. Coach (Trainer User)</w:t>
+      </w:r>
+    </w:p>
+    <w:p>
+      <w:pPr>
+        <w:rPr>
+          <w:sz w:val="28"/>
+          <w:szCs w:val="28"/>
+          <w:lang w:bidi="ar-EG"/>
+        </w:rPr>
+      </w:pPr>
+      <w:r>
+        <w:rPr>
+          <w:b/>
+          <w:bCs/>
+          <w:sz w:val="28"/>
+          <w:szCs w:val="28"/>
+          <w:lang w:bidi="ar-EG"/>
+        </w:rPr>
+        <w:t>Description:</w:t>
+      </w:r>
+      <w:r>
+        <w:rPr>
+          <w:sz w:val="28"/>
+          <w:szCs w:val="28"/>
+          <w:lang w:bidi="ar-EG"/>
+        </w:rPr>
+        <w:br/>
+        <w:t>The coach manages fitness programs for assigned members, providing personalized training and diet plans. Coaches also communicate with members for progress tracking and motivation.</w:t>
+      </w:r>
+    </w:p>
+    <w:p>
+      <w:pPr>
+        <w:rPr>
+          <w:sz w:val="28"/>
+          <w:szCs w:val="28"/>
+          <w:lang w:bidi="ar-EG"/>
+        </w:rPr>
+      </w:pPr>
+      <w:r>
+        <w:rPr>
+          <w:b/>
+          <w:bCs/>
+          <w:sz w:val="28"/>
+          <w:szCs w:val="28"/>
+          <w:lang w:bidi="ar-EG"/>
+        </w:rPr>
+        <w:t>Key Responsibilities:</w:t>
+      </w:r>
+    </w:p>
+    <w:p>
+      <w:pPr>
+        <w:numPr>
+          <w:ilvl w:val="0"/>
+          <w:numId w:val="19"/>
+        </w:numPr>
+        <w:rPr>
+          <w:sz w:val="28"/>
+          <w:szCs w:val="28"/>
+          <w:lang w:bidi="ar-EG"/>
+        </w:rPr>
+      </w:pPr>
+      <w:r>
+        <w:rPr>
+          <w:sz w:val="28"/>
+          <w:szCs w:val="28"/>
+          <w:lang w:bidi="ar-EG"/>
+        </w:rPr>
+        <w:t>Create and assign workout and nutrition plans.</w:t>
+      </w:r>
+    </w:p>
+    <w:p>
+      <w:pPr>
+        <w:numPr>
+          <w:ilvl w:val="0"/>
+          <w:numId w:val="19"/>
+        </w:numPr>
+        <w:rPr>
+          <w:sz w:val="28"/>
+          <w:szCs w:val="28"/>
+          <w:lang w:bidi="ar-EG"/>
+        </w:rPr>
+      </w:pPr>
+      <w:r>
+        <w:rPr>
+          <w:sz w:val="28"/>
+          <w:szCs w:val="28"/>
+          <w:lang w:bidi="ar-EG"/>
+        </w:rPr>
+        <w:t>Monitor member progress and adjust plans as needed.</w:t>
+      </w:r>
+    </w:p>
+    <w:p>
+      <w:pPr>
+        <w:numPr>
+          <w:ilvl w:val="0"/>
+          <w:numId w:val="19"/>
+        </w:numPr>
+        <w:rPr>
+          <w:sz w:val="28"/>
+          <w:szCs w:val="28"/>
+          <w:lang w:bidi="ar-EG"/>
+        </w:rPr>
+      </w:pPr>
+      <w:r>
+        <w:rPr>
+          <w:sz w:val="28"/>
+          <w:szCs w:val="28"/>
+          <w:lang w:bidi="ar-EG"/>
+        </w:rPr>
+        <w:t>Communicate with members via chat or messages.</w:t>
+      </w:r>
+    </w:p>
+    <w:p>
+      <w:pPr>
+        <w:numPr>
+          <w:ilvl w:val="0"/>
+          <w:numId w:val="19"/>
+        </w:numPr>
+        <w:rPr>
+          <w:sz w:val="28"/>
+          <w:szCs w:val="28"/>
+          <w:lang w:bidi="ar-EG"/>
+        </w:rPr>
+      </w:pPr>
+      <w:r>
+        <w:rPr>
+          <w:sz w:val="28"/>
+          <w:szCs w:val="28"/>
+          <w:lang w:bidi="ar-EG"/>
+        </w:rPr>
+        <w:t>Upload training materials, photos, and demonstration videos.</w:t>
+      </w:r>
+    </w:p>
+    <w:p>
+      <w:pPr>
+        <w:numPr>
+          <w:ilvl w:val="0"/>
+          <w:numId w:val="19"/>
+        </w:numPr>
+        <w:rPr>
+          <w:sz w:val="28"/>
+          <w:szCs w:val="28"/>
+          <w:lang w:bidi="ar-EG"/>
+        </w:rPr>
+      </w:pPr>
+      <w:r>
+        <w:rPr>
+          <w:sz w:val="28"/>
+          <w:szCs w:val="28"/>
+          <w:lang w:bidi="ar-EG"/>
+        </w:rPr>
+        <w:t>Generate performance reports for each member.</w:t>
+      </w:r>
+    </w:p>
+    <w:p>
+      <w:pPr>
+        <w:rPr>
+          <w:sz w:val="28"/>
+          <w:szCs w:val="28"/>
+          <w:lang w:bidi="ar-EG"/>
+        </w:rPr>
+      </w:pPr>
+      <w:r>
+        <w:rPr>
+          <w:b/>
+          <w:bCs/>
+          <w:sz w:val="28"/>
+          <w:szCs w:val="28"/>
+          <w:lang w:bidi="ar-EG"/>
+        </w:rPr>
+        <w:t>Technical Knowledge:</w:t>
+      </w:r>
+    </w:p>
+    <w:p>
+      <w:pPr>
+        <w:numPr>
+          <w:ilvl w:val="0"/>
+          <w:numId w:val="20"/>
+        </w:numPr>
+        <w:rPr>
+          <w:sz w:val="28"/>
+          <w:szCs w:val="28"/>
+          <w:lang w:bidi="ar-EG"/>
+        </w:rPr>
+      </w:pPr>
+      <w:r>
+        <w:rPr>
+          <w:sz w:val="28"/>
+          <w:szCs w:val="28"/>
+          <w:lang w:bidi="ar-EG"/>
+        </w:rPr>
+        <w:t>Moderate computer literacy.</w:t>
+      </w:r>
+    </w:p>
+    <w:p>
+      <w:pPr>
+        <w:numPr>
+          <w:ilvl w:val="0"/>
+          <w:numId w:val="20"/>
+        </w:numPr>
+        <w:rPr>
+          <w:sz w:val="28"/>
+          <w:szCs w:val="28"/>
+          <w:lang w:bidi="ar-EG"/>
+        </w:rPr>
+      </w:pPr>
+      <w:r>
+        <w:rPr>
+          <w:sz w:val="28"/>
+          <w:szCs w:val="28"/>
+          <w:lang w:bidi="ar-EG"/>
+        </w:rPr>
+        <w:t>Familiar with fitness and nutrition principles.</w:t>
+      </w:r>
+    </w:p>
+    <w:p>
+      <w:pPr>
+        <w:rPr>
+          <w:sz w:val="28"/>
+          <w:szCs w:val="28"/>
+          <w:lang w:bidi="ar-EG"/>
+        </w:rPr>
+      </w:pPr>
+      <w:r>
+        <w:rPr>
+          <w:b/>
+          <w:bCs/>
+          <w:sz w:val="28"/>
+          <w:szCs w:val="28"/>
+          <w:lang w:bidi="ar-EG"/>
+        </w:rPr>
+        <w:t>Access Level:</w:t>
+      </w:r>
+    </w:p>
+    <w:p>
+      <w:pPr>
+        <w:numPr>
+          <w:ilvl w:val="0"/>
+          <w:numId w:val="21"/>
+        </w:numPr>
+        <w:rPr>
+          <w:sz w:val="28"/>
+          <w:szCs w:val="28"/>
+          <w:lang w:bidi="ar-EG"/>
+        </w:rPr>
+      </w:pPr>
+      <w:r>
+        <w:rPr>
+          <w:sz w:val="28"/>
+          <w:szCs w:val="28"/>
+          <w:lang w:bidi="ar-EG"/>
+        </w:rPr>
+        <w:t>Medium-level access (can view and modify assigned member data).</w:t>
+      </w:r>
+    </w:p>
+    <w:p>
+      <w:pPr>
+        <w:rPr>
+          <w:sz w:val="28"/>
+          <w:szCs w:val="28"/>
+          <w:lang w:bidi="ar-EG"/>
+        </w:rPr>
+      </w:pPr>
+    </w:p>
+    <w:p>
+      <w:pPr>
+        <w:rPr>
+          <w:sz w:val="28"/>
+          <w:szCs w:val="28"/>
+          <w:lang w:bidi="ar-EG"/>
+        </w:rPr>
+      </w:pPr>
+    </w:p>
+    <w:p>
+      <w:pPr>
+        <w:rPr>
+          <w:b/>
+          <w:bCs/>
+          <w:sz w:val="28"/>
+          <w:szCs w:val="28"/>
+          <w:lang w:bidi="ar-EG"/>
+        </w:rPr>
+      </w:pPr>
+      <w:r>
+        <w:rPr>
+          <w:rFonts w:ascii="Segoe UI Emoji" w:hAnsi="Segoe UI Emoji" w:cs="Segoe UI Emoji"/>
+          <w:b/>
+          <w:bCs/>
+          <w:sz w:val="28"/>
+          <w:szCs w:val="28"/>
+          <w:lang w:bidi="ar-EG"/>
+        </w:rPr>
+        <w:t>👨</w:t>
+      </w:r>
+      <w:r>
+        <w:rPr>
+          <w:b/>
+          <w:bCs/>
+          <w:sz w:val="28"/>
+          <w:szCs w:val="28"/>
+          <w:lang w:bidi="ar-EG"/>
+        </w:rPr>
+        <w:t>‍</w:t>
+      </w:r>
+      <w:r>
+        <w:rPr>
+          <w:rFonts w:ascii="Segoe UI Emoji" w:hAnsi="Segoe UI Emoji" w:cs="Segoe UI Emoji"/>
+          <w:b/>
+          <w:bCs/>
+          <w:sz w:val="28"/>
+          <w:szCs w:val="28"/>
+          <w:lang w:bidi="ar-EG"/>
+        </w:rPr>
+        <w:t>💼</w:t>
+      </w:r>
+      <w:r>
+        <w:rPr>
+          <w:b/>
+          <w:bCs/>
+          <w:sz w:val="28"/>
+          <w:szCs w:val="28"/>
+          <w:lang w:bidi="ar-EG"/>
+        </w:rPr>
+        <w:t xml:space="preserve"> 3. Admin (System Administrator)</w:t>
+      </w:r>
+    </w:p>
+    <w:p>
+      <w:pPr>
+        <w:rPr>
+          <w:sz w:val="28"/>
+          <w:szCs w:val="28"/>
+          <w:lang w:bidi="ar-EG"/>
+        </w:rPr>
+      </w:pPr>
+      <w:r>
+        <w:rPr>
+          <w:b/>
+          <w:bCs/>
+          <w:sz w:val="28"/>
+          <w:szCs w:val="28"/>
+          <w:lang w:bidi="ar-EG"/>
+        </w:rPr>
+        <w:t>Description:</w:t>
+      </w:r>
+      <w:r>
+        <w:rPr>
+          <w:sz w:val="28"/>
+          <w:szCs w:val="28"/>
+          <w:lang w:bidi="ar-EG"/>
+        </w:rPr>
+        <w:br/>
+        <w:t>The admin is responsible for managing the overall system operations, users, payments, and reports. Admins have full system privileges and oversee both the gym management and online services.</w:t>
+      </w:r>
+    </w:p>
+    <w:p>
+      <w:pPr>
+        <w:rPr>
+          <w:sz w:val="28"/>
+          <w:szCs w:val="28"/>
+          <w:lang w:bidi="ar-EG"/>
+        </w:rPr>
+      </w:pPr>
+      <w:r>
+        <w:rPr>
+          <w:b/>
+          <w:bCs/>
+          <w:sz w:val="28"/>
+          <w:szCs w:val="28"/>
+          <w:lang w:bidi="ar-EG"/>
+        </w:rPr>
+        <w:t>Key Responsibilities:</w:t>
+      </w:r>
+    </w:p>
+    <w:p>
+      <w:pPr>
+        <w:numPr>
+          <w:ilvl w:val="0"/>
+          <w:numId w:val="22"/>
+        </w:numPr>
+        <w:rPr>
+          <w:sz w:val="28"/>
+          <w:szCs w:val="28"/>
+          <w:lang w:bidi="ar-EG"/>
+        </w:rPr>
+      </w:pPr>
+      <w:r>
+        <w:rPr>
+          <w:sz w:val="28"/>
+          <w:szCs w:val="28"/>
+          <w:lang w:bidi="ar-EG"/>
+        </w:rPr>
+        <w:t>Add, update, or remove users (coaches and members).</w:t>
+      </w:r>
+    </w:p>
+    <w:p>
+      <w:pPr>
+        <w:numPr>
+          <w:ilvl w:val="0"/>
+          <w:numId w:val="22"/>
+        </w:numPr>
+        <w:rPr>
+          <w:sz w:val="28"/>
+          <w:szCs w:val="28"/>
+          <w:lang w:bidi="ar-EG"/>
+        </w:rPr>
+      </w:pPr>
+      <w:r>
+        <w:rPr>
+          <w:sz w:val="28"/>
+          <w:szCs w:val="28"/>
+          <w:lang w:bidi="ar-EG"/>
+        </w:rPr>
+        <w:lastRenderedPageBreak/>
+        <w:t>Manage gym branches, membership plans, and store products.</w:t>
+      </w:r>
+    </w:p>
+    <w:p>
+      <w:pPr>
+        <w:numPr>
+          <w:ilvl w:val="0"/>
+          <w:numId w:val="22"/>
+        </w:numPr>
+        <w:rPr>
+          <w:sz w:val="28"/>
+          <w:szCs w:val="28"/>
+          <w:lang w:bidi="ar-EG"/>
+        </w:rPr>
+      </w:pPr>
+      <w:r>
+        <w:rPr>
+          <w:sz w:val="28"/>
+          <w:szCs w:val="28"/>
+          <w:lang w:bidi="ar-EG"/>
+        </w:rPr>
+        <w:t>Handle payment and billing records.</w:t>
+      </w:r>
+    </w:p>
+    <w:p>
+      <w:pPr>
+        <w:numPr>
+          <w:ilvl w:val="0"/>
+          <w:numId w:val="22"/>
+        </w:numPr>
+        <w:rPr>
+          <w:sz w:val="28"/>
+          <w:szCs w:val="28"/>
+          <w:lang w:bidi="ar-EG"/>
+        </w:rPr>
+      </w:pPr>
+      <w:r>
+        <w:rPr>
+          <w:sz w:val="28"/>
+          <w:szCs w:val="28"/>
+          <w:lang w:bidi="ar-EG"/>
+        </w:rPr>
+        <w:t>Generate reports and analytics on performance and sales.</w:t>
+      </w:r>
+    </w:p>
+    <w:p>
+      <w:pPr>
+        <w:numPr>
+          <w:ilvl w:val="0"/>
+          <w:numId w:val="22"/>
+        </w:numPr>
+        <w:rPr>
+          <w:sz w:val="28"/>
+          <w:szCs w:val="28"/>
+          <w:lang w:bidi="ar-EG"/>
+        </w:rPr>
+      </w:pPr>
+      <w:r>
+        <w:rPr>
+          <w:sz w:val="28"/>
+          <w:szCs w:val="28"/>
+          <w:lang w:bidi="ar-EG"/>
+        </w:rPr>
+        <w:t>Monitor system activity and ensure data accuracy.</w:t>
+      </w:r>
+    </w:p>
+    <w:p>
+      <w:pPr>
+        <w:rPr>
+          <w:sz w:val="28"/>
+          <w:szCs w:val="28"/>
+          <w:lang w:bidi="ar-EG"/>
+        </w:rPr>
+      </w:pPr>
+      <w:r>
+        <w:rPr>
+          <w:b/>
+          <w:bCs/>
+          <w:sz w:val="28"/>
+          <w:szCs w:val="28"/>
+          <w:lang w:bidi="ar-EG"/>
+        </w:rPr>
+        <w:t>Technical Knowledge:</w:t>
+      </w:r>
+    </w:p>
+    <w:p>
+      <w:pPr>
+        <w:numPr>
+          <w:ilvl w:val="0"/>
+          <w:numId w:val="23"/>
+        </w:numPr>
+        <w:rPr>
+          <w:sz w:val="28"/>
+          <w:szCs w:val="28"/>
+          <w:lang w:bidi="ar-EG"/>
+        </w:rPr>
+      </w:pPr>
+      <w:r>
+        <w:rPr>
+          <w:sz w:val="28"/>
+          <w:szCs w:val="28"/>
+          <w:lang w:bidi="ar-EG"/>
+        </w:rPr>
+        <w:t>High-level computer proficiency.</w:t>
+      </w:r>
+    </w:p>
+    <w:p>
+      <w:pPr>
+        <w:numPr>
+          <w:ilvl w:val="0"/>
+          <w:numId w:val="23"/>
+        </w:numPr>
+        <w:rPr>
+          <w:sz w:val="28"/>
+          <w:szCs w:val="28"/>
+          <w:lang w:bidi="ar-EG"/>
+        </w:rPr>
+      </w:pPr>
+      <w:r>
+        <w:rPr>
+          <w:sz w:val="28"/>
+          <w:szCs w:val="28"/>
+          <w:lang w:bidi="ar-EG"/>
+        </w:rPr>
+        <w:t>Familiar with business operations and administrative tools.</w:t>
+      </w:r>
+    </w:p>
+    <w:p>
+      <w:pPr>
+        <w:rPr>
+          <w:sz w:val="28"/>
+          <w:szCs w:val="28"/>
+          <w:lang w:bidi="ar-EG"/>
+        </w:rPr>
+      </w:pPr>
+      <w:r>
+        <w:rPr>
+          <w:b/>
+          <w:bCs/>
+          <w:sz w:val="28"/>
+          <w:szCs w:val="28"/>
+          <w:lang w:bidi="ar-EG"/>
+        </w:rPr>
+        <w:t>Access Level:</w:t>
+      </w:r>
+    </w:p>
+    <w:p>
+      <w:pPr>
+        <w:numPr>
+          <w:ilvl w:val="0"/>
+          <w:numId w:val="24"/>
+        </w:numPr>
+        <w:rPr>
+          <w:sz w:val="28"/>
+          <w:szCs w:val="28"/>
+          <w:lang w:bidi="ar-EG"/>
+        </w:rPr>
+      </w:pPr>
+      <w:r>
+        <w:rPr>
+          <w:sz w:val="28"/>
+          <w:szCs w:val="28"/>
+          <w:lang w:bidi="ar-EG"/>
+        </w:rPr>
+        <w:t>Full access (all administrative and configuration rights).</w:t>
+      </w:r>
+    </w:p>
+    <w:p>
+      <w:pPr>
+        <w:rPr>
+          <w:sz w:val="28"/>
+          <w:szCs w:val="28"/>
+          <w:lang w:bidi="ar-EG"/>
+        </w:rPr>
+      </w:pPr>
+      <w:r>
+        <w:rPr>
+          <w:sz w:val="28"/>
+          <w:szCs w:val="28"/>
+          <w:lang w:bidi="ar-EG"/>
+        </w:rPr>
+        <w:pict w14:anchorId="1A7BFD3B">
+          <v:rect id="_x0000_i1113" style="width:0;height:1.5pt" o:hralign="center" o:hrstd="t" o:hr="t" fillcolor="#a0a0a0" stroked="f"/>
+        </w:pict>
+      </w:r>
+    </w:p>
+    <w:p>
+      <w:pPr>
+        <w:rPr>
+          <w:sz w:val="28"/>
+          <w:szCs w:val="28"/>
+          <w:lang w:bidi="ar-EG"/>
+        </w:rPr>
+      </w:pPr>
+      <w:r>
+        <w:rPr>
+          <w:b/>
+          <w:bCs/>
+          <w:sz w:val="28"/>
+          <w:szCs w:val="28"/>
+          <w:lang w:bidi="ar-EG"/>
+        </w:rPr>
+        <w:t>Summary:</w:t>
+      </w:r>
+      <w:r>
+        <w:rPr>
+          <w:sz w:val="28"/>
+          <w:szCs w:val="28"/>
+          <w:lang w:bidi="ar-EG"/>
+        </w:rPr>
+        <w:br/>
+        <w:t>The Fit</w:t>
+      </w:r>
+      <w:r>
+        <w:rPr>
+          <w:sz w:val="28"/>
+          <w:szCs w:val="28"/>
+          <w:lang w:bidi="ar-EG"/>
+        </w:rPr>
+        <w:t>-</w:t>
+      </w:r>
+      <w:r>
+        <w:rPr>
+          <w:sz w:val="28"/>
+          <w:szCs w:val="28"/>
+          <w:lang w:bidi="ar-EG"/>
+        </w:rPr>
+        <w:t xml:space="preserve">Track system differentiates users based on their </w:t>
+      </w:r>
+      <w:r>
+        <w:rPr>
+          <w:b/>
+          <w:bCs/>
+          <w:sz w:val="28"/>
+          <w:szCs w:val="28"/>
+          <w:lang w:bidi="ar-EG"/>
+        </w:rPr>
+        <w:t>roles, access levels, and responsibilities</w:t>
+      </w:r>
+      <w:r>
+        <w:rPr>
+          <w:sz w:val="28"/>
+          <w:szCs w:val="28"/>
+          <w:lang w:bidi="ar-EG"/>
+        </w:rPr>
+        <w:t>, ensuring data security and an optimized experience for each user type.</w:t>
+      </w:r>
+    </w:p>
+    <w:p>
+      <w:pPr>
+        <w:rPr>
+          <w:sz w:val="28"/>
+          <w:szCs w:val="28"/>
+          <w:lang w:bidi="ar-EG"/>
+        </w:rPr>
+      </w:pPr>
+      <w:r>
+        <w:rPr>
+          <w:sz w:val="28"/>
+          <w:szCs w:val="28"/>
+          <w:lang w:bidi="ar-EG"/>
+        </w:rPr>
+        <w:br w:type="page"/>
+      </w:r>
+    </w:p>
+    <w:p>
+      <w:pPr>
+        <w:rPr>
+          <w:rFonts w:hint="cs"/>
+          <w:sz w:val="28"/>
+          <w:szCs w:val="28"/>
+          <w:rtl/>
+          <w:lang w:bidi="ar-EG"/>
+        </w:rPr>
+      </w:pPr>
+    </w:p>
     <w:sectPr>
       <w:pgSz w:w="12240" w:h="15840"/>
       <w:pgMar w:top="1440" w:right="1440" w:bottom="1440" w:left="1440" w:header="708" w:footer="708" w:gutter="0"/>
@@ -4025,6 +5186,155 @@
     </w:lvl>
   </w:abstractNum>
   <w:abstractNum w:abstractNumId="1" w15:restartNumberingAfterBreak="0">
+    <w:nsid w:val="0B683CB1"/>
+    <w:multiLevelType w:val="multilevel"/>
+    <w:tmpl w:val="308A63FC"/>
+    <w:lvl w:ilvl="0">
+      <w:start w:val="1"/>
+      <w:numFmt w:val="bullet"/>
+      <w:lvlText w:val=""/>
+      <w:lvlJc w:val="left"/>
+      <w:pPr>
+        <w:tabs>
+          <w:tab w:val="num" w:pos="720"/>
+        </w:tabs>
+        <w:ind w:left="720" w:hanging="360"/>
+      </w:pPr>
+      <w:rPr>
+        <w:rFonts w:ascii="Symbol" w:hAnsi="Symbol" w:hint="default"/>
+        <w:sz w:val="20"/>
+      </w:rPr>
+    </w:lvl>
+    <w:lvl w:ilvl="1" w:tentative="1">
+      <w:start w:val="1"/>
+      <w:numFmt w:val="bullet"/>
+      <w:lvlText w:val="o"/>
+      <w:lvlJc w:val="left"/>
+      <w:pPr>
+        <w:tabs>
+          <w:tab w:val="num" w:pos="1440"/>
+        </w:tabs>
+        <w:ind w:left="1440" w:hanging="360"/>
+      </w:pPr>
+      <w:rPr>
+        <w:rFonts w:ascii="Courier New" w:hAnsi="Courier New" w:hint="default"/>
+        <w:sz w:val="20"/>
+      </w:rPr>
+    </w:lvl>
+    <w:lvl w:ilvl="2" w:tentative="1">
+      <w:start w:val="1"/>
+      <w:numFmt w:val="bullet"/>
+      <w:lvlText w:val=""/>
+      <w:lvlJc w:val="left"/>
+      <w:pPr>
+        <w:tabs>
+          <w:tab w:val="num" w:pos="2160"/>
+        </w:tabs>
+        <w:ind w:left="2160" w:hanging="360"/>
+      </w:pPr>
+      <w:rPr>
+        <w:rFonts w:ascii="Wingdings" w:hAnsi="Wingdings" w:hint="default"/>
+        <w:sz w:val="20"/>
+      </w:rPr>
+    </w:lvl>
+    <w:lvl w:ilvl="3" w:tentative="1">
+      <w:start w:val="1"/>
+      <w:numFmt w:val="bullet"/>
+      <w:lvlText w:val=""/>
+      <w:lvlJc w:val="left"/>
+      <w:pPr>
+        <w:tabs>
+          <w:tab w:val="num" w:pos="2880"/>
+        </w:tabs>
+        <w:ind w:left="2880" w:hanging="360"/>
+      </w:pPr>
+      <w:rPr>
+        <w:rFonts w:ascii="Wingdings" w:hAnsi="Wingdings" w:hint="default"/>
+        <w:sz w:val="20"/>
+      </w:rPr>
+    </w:lvl>
+    <w:lvl w:ilvl="4" w:tentative="1">
+      <w:start w:val="1"/>
+      <w:numFmt w:val="bullet"/>
+      <w:lvlText w:val=""/>
+      <w:lvlJc w:val="left"/>
+      <w:pPr>
+        <w:tabs>
+          <w:tab w:val="num" w:pos="3600"/>
+        </w:tabs>
+        <w:ind w:left="3600" w:hanging="360"/>
+      </w:pPr>
+      <w:rPr>
+        <w:rFonts w:ascii="Wingdings" w:hAnsi="Wingdings" w:hint="default"/>
+        <w:sz w:val="20"/>
+      </w:rPr>
+    </w:lvl>
+    <w:lvl w:ilvl="5" w:tentative="1">
+      <w:start w:val="1"/>
+      <w:numFmt w:val="bullet"/>
+      <w:lvlText w:val=""/>
+      <w:lvlJc w:val="left"/>
+      <w:pPr>
+        <w:tabs>
+          <w:tab w:val="num" w:pos="4320"/>
+        </w:tabs>
+        <w:ind w:left="4320" w:hanging="360"/>
+      </w:pPr>
+      <w:rPr>
+        <w:rFonts w:ascii="Wingdings" w:hAnsi="Wingdings" w:hint="default"/>
+        <w:sz w:val="20"/>
+      </w:rPr>
+    </w:lvl>
+    <w:lvl w:ilvl="6" w:tentative="1">
+      <w:start w:val="1"/>
+      <w:numFmt w:val="bullet"/>
+      <w:lvlText w:val=""/>
+      <w:lvlJc w:val="left"/>
+      <w:pPr>
+        <w:tabs>
+          <w:tab w:val="num" w:pos="5040"/>
+        </w:tabs>
+        <w:ind w:left="5040" w:hanging="360"/>
+      </w:pPr>
+      <w:rPr>
+        <w:rFonts w:ascii="Wingdings" w:hAnsi="Wingdings" w:hint="default"/>
+        <w:sz w:val="20"/>
+      </w:rPr>
+    </w:lvl>
+    <w:lvl w:ilvl="7" w:tentative="1">
+      <w:start w:val="1"/>
+      <w:numFmt w:val="bullet"/>
+      <w:lvlText w:val=""/>
+      <w:lvlJc w:val="left"/>
+      <w:pPr>
+        <w:tabs>
+          <w:tab w:val="num" w:pos="5760"/>
+        </w:tabs>
+        <w:ind w:left="5760" w:hanging="360"/>
+      </w:pPr>
+      <w:rPr>
+        <w:rFonts w:ascii="Wingdings" w:hAnsi="Wingdings" w:hint="default"/>
+        <w:sz w:val="20"/>
+      </w:rPr>
+    </w:lvl>
+    <w:lvl w:ilvl="8" w:tentative="1">
+      <w:start w:val="1"/>
+      <w:numFmt w:val="bullet"/>
+      <w:lvlText w:val=""/>
+      <w:lvlJc w:val="left"/>
+      <w:pPr>
+        <w:tabs>
+          <w:tab w:val="num" w:pos="6480"/>
+        </w:tabs>
+        <w:ind w:left="6480" w:hanging="360"/>
+      </w:pPr>
+      <w:rPr>
+        <w:rFonts w:ascii="Wingdings" w:hAnsi="Wingdings" w:hint="default"/>
+        <w:sz w:val="20"/>
+      </w:rPr>
+    </w:lvl>
+  </w:abstractNum>
+  <w:abstractNum w:abstractNumId="2" w15:restartNumberingAfterBreak="0">
     <w:nsid w:val="0BF60B6B"/>
     <w:multiLevelType w:val="multilevel"/>
     <w:tmpl w:val="7F70591E"/>
@@ -4173,7 +5483,156 @@
       </w:rPr>
     </w:lvl>
   </w:abstractNum>
-  <w:abstractNum w:abstractNumId="2" w15:restartNumberingAfterBreak="0">
+  <w:abstractNum w:abstractNumId="3" w15:restartNumberingAfterBreak="0">
+    <w:nsid w:val="0C030589"/>
+    <w:multiLevelType w:val="multilevel"/>
+    <w:tmpl w:val="04022C1C"/>
+    <w:lvl w:ilvl="0">
+      <w:start w:val="1"/>
+      <w:numFmt w:val="bullet"/>
+      <w:lvlText w:val=""/>
+      <w:lvlJc w:val="left"/>
+      <w:pPr>
+        <w:tabs>
+          <w:tab w:val="num" w:pos="720"/>
+        </w:tabs>
+        <w:ind w:left="720" w:hanging="360"/>
+      </w:pPr>
+      <w:rPr>
+        <w:rFonts w:ascii="Symbol" w:hAnsi="Symbol" w:hint="default"/>
+        <w:sz w:val="20"/>
+      </w:rPr>
+    </w:lvl>
+    <w:lvl w:ilvl="1" w:tentative="1">
+      <w:start w:val="1"/>
+      <w:numFmt w:val="bullet"/>
+      <w:lvlText w:val="o"/>
+      <w:lvlJc w:val="left"/>
+      <w:pPr>
+        <w:tabs>
+          <w:tab w:val="num" w:pos="1440"/>
+        </w:tabs>
+        <w:ind w:left="1440" w:hanging="360"/>
+      </w:pPr>
+      <w:rPr>
+        <w:rFonts w:ascii="Courier New" w:hAnsi="Courier New" w:hint="default"/>
+        <w:sz w:val="20"/>
+      </w:rPr>
+    </w:lvl>
+    <w:lvl w:ilvl="2" w:tentative="1">
+      <w:start w:val="1"/>
+      <w:numFmt w:val="bullet"/>
+      <w:lvlText w:val=""/>
+      <w:lvlJc w:val="left"/>
+      <w:pPr>
+        <w:tabs>
+          <w:tab w:val="num" w:pos="2160"/>
+        </w:tabs>
+        <w:ind w:left="2160" w:hanging="360"/>
+      </w:pPr>
+      <w:rPr>
+        <w:rFonts w:ascii="Wingdings" w:hAnsi="Wingdings" w:hint="default"/>
+        <w:sz w:val="20"/>
+      </w:rPr>
+    </w:lvl>
+    <w:lvl w:ilvl="3" w:tentative="1">
+      <w:start w:val="1"/>
+      <w:numFmt w:val="bullet"/>
+      <w:lvlText w:val=""/>
+      <w:lvlJc w:val="left"/>
+      <w:pPr>
+        <w:tabs>
+          <w:tab w:val="num" w:pos="2880"/>
+        </w:tabs>
+        <w:ind w:left="2880" w:hanging="360"/>
+      </w:pPr>
+      <w:rPr>
+        <w:rFonts w:ascii="Wingdings" w:hAnsi="Wingdings" w:hint="default"/>
+        <w:sz w:val="20"/>
+      </w:rPr>
+    </w:lvl>
+    <w:lvl w:ilvl="4" w:tentative="1">
+      <w:start w:val="1"/>
+      <w:numFmt w:val="bullet"/>
+      <w:lvlText w:val=""/>
+      <w:lvlJc w:val="left"/>
+      <w:pPr>
+        <w:tabs>
+          <w:tab w:val="num" w:pos="3600"/>
+        </w:tabs>
+        <w:ind w:left="3600" w:hanging="360"/>
+      </w:pPr>
+      <w:rPr>
+        <w:rFonts w:ascii="Wingdings" w:hAnsi="Wingdings" w:hint="default"/>
+        <w:sz w:val="20"/>
+      </w:rPr>
+    </w:lvl>
+    <w:lvl w:ilvl="5" w:tentative="1">
+      <w:start w:val="1"/>
+      <w:numFmt w:val="bullet"/>
+      <w:lvlText w:val=""/>
+      <w:lvlJc w:val="left"/>
+      <w:pPr>
+        <w:tabs>
+          <w:tab w:val="num" w:pos="4320"/>
+        </w:tabs>
+        <w:ind w:left="4320" w:hanging="360"/>
+      </w:pPr>
+      <w:rPr>
+        <w:rFonts w:ascii="Wingdings" w:hAnsi="Wingdings" w:hint="default"/>
+        <w:sz w:val="20"/>
+      </w:rPr>
+    </w:lvl>
+    <w:lvl w:ilvl="6" w:tentative="1">
+      <w:start w:val="1"/>
+      <w:numFmt w:val="bullet"/>
+      <w:lvlText w:val=""/>
+      <w:lvlJc w:val="left"/>
+      <w:pPr>
+        <w:tabs>
+          <w:tab w:val="num" w:pos="5040"/>
+        </w:tabs>
+        <w:ind w:left="5040" w:hanging="360"/>
+      </w:pPr>
+      <w:rPr>
+        <w:rFonts w:ascii="Wingdings" w:hAnsi="Wingdings" w:hint="default"/>
+        <w:sz w:val="20"/>
+      </w:rPr>
+    </w:lvl>
+    <w:lvl w:ilvl="7" w:tentative="1">
+      <w:start w:val="1"/>
+      <w:numFmt w:val="bullet"/>
+      <w:lvlText w:val=""/>
+      <w:lvlJc w:val="left"/>
+      <w:pPr>
+        <w:tabs>
+          <w:tab w:val="num" w:pos="5760"/>
+        </w:tabs>
+        <w:ind w:left="5760" w:hanging="360"/>
+      </w:pPr>
+      <w:rPr>
+        <w:rFonts w:ascii="Wingdings" w:hAnsi="Wingdings" w:hint="default"/>
+        <w:sz w:val="20"/>
+      </w:rPr>
+    </w:lvl>
+    <w:lvl w:ilvl="8" w:tentative="1">
+      <w:start w:val="1"/>
+      <w:numFmt w:val="bullet"/>
+      <w:lvlText w:val=""/>
+      <w:lvlJc w:val="left"/>
+      <w:pPr>
+        <w:tabs>
+          <w:tab w:val="num" w:pos="6480"/>
+        </w:tabs>
+        <w:ind w:left="6480" w:hanging="360"/>
+      </w:pPr>
+      <w:rPr>
+        <w:rFonts w:ascii="Wingdings" w:hAnsi="Wingdings" w:hint="default"/>
+        <w:sz w:val="20"/>
+      </w:rPr>
+    </w:lvl>
+  </w:abstractNum>
+  <w:abstractNum w:abstractNumId="4" w15:restartNumberingAfterBreak="0">
     <w:nsid w:val="128654FC"/>
     <w:multiLevelType w:val="multilevel"/>
     <w:tmpl w:val="3B3A77CC"/>
@@ -4322,7 +5781,7 @@
       </w:rPr>
     </w:lvl>
   </w:abstractNum>
-  <w:abstractNum w:abstractNumId="3" w15:restartNumberingAfterBreak="0">
+  <w:abstractNum w:abstractNumId="5" w15:restartNumberingAfterBreak="0">
     <w:nsid w:val="17DB689E"/>
     <w:multiLevelType w:val="multilevel"/>
     <w:tmpl w:val="57DAD6FC"/>
@@ -4443,7 +5902,305 @@
       </w:rPr>
     </w:lvl>
   </w:abstractNum>
-  <w:abstractNum w:abstractNumId="4" w15:restartNumberingAfterBreak="0">
+  <w:abstractNum w:abstractNumId="6" w15:restartNumberingAfterBreak="0">
+    <w:nsid w:val="194C3A5F"/>
+    <w:multiLevelType w:val="multilevel"/>
+    <w:tmpl w:val="0B4A846E"/>
+    <w:lvl w:ilvl="0">
+      <w:start w:val="1"/>
+      <w:numFmt w:val="bullet"/>
+      <w:lvlText w:val=""/>
+      <w:lvlJc w:val="left"/>
+      <w:pPr>
+        <w:tabs>
+          <w:tab w:val="num" w:pos="720"/>
+        </w:tabs>
+        <w:ind w:left="720" w:hanging="360"/>
+      </w:pPr>
+      <w:rPr>
+        <w:rFonts w:ascii="Symbol" w:hAnsi="Symbol" w:hint="default"/>
+        <w:sz w:val="20"/>
+      </w:rPr>
+    </w:lvl>
+    <w:lvl w:ilvl="1" w:tentative="1">
+      <w:start w:val="1"/>
+      <w:numFmt w:val="bullet"/>
+      <w:lvlText w:val="o"/>
+      <w:lvlJc w:val="left"/>
+      <w:pPr>
+        <w:tabs>
+          <w:tab w:val="num" w:pos="1440"/>
+        </w:tabs>
+        <w:ind w:left="1440" w:hanging="360"/>
+      </w:pPr>
+      <w:rPr>
+        <w:rFonts w:ascii="Courier New" w:hAnsi="Courier New" w:hint="default"/>
+        <w:sz w:val="20"/>
+      </w:rPr>
+    </w:lvl>
+    <w:lvl w:ilvl="2" w:tentative="1">
+      <w:start w:val="1"/>
+      <w:numFmt w:val="bullet"/>
+      <w:lvlText w:val=""/>
+      <w:lvlJc w:val="left"/>
+      <w:pPr>
+        <w:tabs>
+          <w:tab w:val="num" w:pos="2160"/>
+        </w:tabs>
+        <w:ind w:left="2160" w:hanging="360"/>
+      </w:pPr>
+      <w:rPr>
+        <w:rFonts w:ascii="Wingdings" w:hAnsi="Wingdings" w:hint="default"/>
+        <w:sz w:val="20"/>
+      </w:rPr>
+    </w:lvl>
+    <w:lvl w:ilvl="3" w:tentative="1">
+      <w:start w:val="1"/>
+      <w:numFmt w:val="bullet"/>
+      <w:lvlText w:val=""/>
+      <w:lvlJc w:val="left"/>
+      <w:pPr>
+        <w:tabs>
+          <w:tab w:val="num" w:pos="2880"/>
+        </w:tabs>
+        <w:ind w:left="2880" w:hanging="360"/>
+      </w:pPr>
+      <w:rPr>
+        <w:rFonts w:ascii="Wingdings" w:hAnsi="Wingdings" w:hint="default"/>
+        <w:sz w:val="20"/>
+      </w:rPr>
+    </w:lvl>
+    <w:lvl w:ilvl="4" w:tentative="1">
+      <w:start w:val="1"/>
+      <w:numFmt w:val="bullet"/>
+      <w:lvlText w:val=""/>
+      <w:lvlJc w:val="left"/>
+      <w:pPr>
+        <w:tabs>
+          <w:tab w:val="num" w:pos="3600"/>
+        </w:tabs>
+        <w:ind w:left="3600" w:hanging="360"/>
+      </w:pPr>
+      <w:rPr>
+        <w:rFonts w:ascii="Wingdings" w:hAnsi="Wingdings" w:hint="default"/>
+        <w:sz w:val="20"/>
+      </w:rPr>
+    </w:lvl>
+    <w:lvl w:ilvl="5" w:tentative="1">
+      <w:start w:val="1"/>
+      <w:numFmt w:val="bullet"/>
+      <w:lvlText w:val=""/>
+      <w:lvlJc w:val="left"/>
+      <w:pPr>
+        <w:tabs>
+          <w:tab w:val="num" w:pos="4320"/>
+        </w:tabs>
+        <w:ind w:left="4320" w:hanging="360"/>
+      </w:pPr>
+      <w:rPr>
+        <w:rFonts w:ascii="Wingdings" w:hAnsi="Wingdings" w:hint="default"/>
+        <w:sz w:val="20"/>
+      </w:rPr>
+    </w:lvl>
+    <w:lvl w:ilvl="6" w:tentative="1">
+      <w:start w:val="1"/>
+      <w:numFmt w:val="bullet"/>
+      <w:lvlText w:val=""/>
+      <w:lvlJc w:val="left"/>
+      <w:pPr>
+        <w:tabs>
+          <w:tab w:val="num" w:pos="5040"/>
+        </w:tabs>
+        <w:ind w:left="5040" w:hanging="360"/>
+      </w:pPr>
+      <w:rPr>
+        <w:rFonts w:ascii="Wingdings" w:hAnsi="Wingdings" w:hint="default"/>
+        <w:sz w:val="20"/>
+      </w:rPr>
+    </w:lvl>
+    <w:lvl w:ilvl="7" w:tentative="1">
+      <w:start w:val="1"/>
+      <w:numFmt w:val="bullet"/>
+      <w:lvlText w:val=""/>
+      <w:lvlJc w:val="left"/>
+      <w:pPr>
+        <w:tabs>
+          <w:tab w:val="num" w:pos="5760"/>
+        </w:tabs>
+        <w:ind w:left="5760" w:hanging="360"/>
+      </w:pPr>
+      <w:rPr>
+        <w:rFonts w:ascii="Wingdings" w:hAnsi="Wingdings" w:hint="default"/>
+        <w:sz w:val="20"/>
+      </w:rPr>
+    </w:lvl>
+    <w:lvl w:ilvl="8" w:tentative="1">
+      <w:start w:val="1"/>
+      <w:numFmt w:val="bullet"/>
+      <w:lvlText w:val=""/>
+      <w:lvlJc w:val="left"/>
+      <w:pPr>
+        <w:tabs>
+          <w:tab w:val="num" w:pos="6480"/>
+        </w:tabs>
+        <w:ind w:left="6480" w:hanging="360"/>
+      </w:pPr>
+      <w:rPr>
+        <w:rFonts w:ascii="Wingdings" w:hAnsi="Wingdings" w:hint="default"/>
+        <w:sz w:val="20"/>
+      </w:rPr>
+    </w:lvl>
+  </w:abstractNum>
+  <w:abstractNum w:abstractNumId="7" w15:restartNumberingAfterBreak="0">
+    <w:nsid w:val="21BE270C"/>
+    <w:multiLevelType w:val="multilevel"/>
+    <w:tmpl w:val="691E41C6"/>
+    <w:lvl w:ilvl="0">
+      <w:start w:val="1"/>
+      <w:numFmt w:val="bullet"/>
+      <w:lvlText w:val=""/>
+      <w:lvlJc w:val="left"/>
+      <w:pPr>
+        <w:tabs>
+          <w:tab w:val="num" w:pos="720"/>
+        </w:tabs>
+        <w:ind w:left="720" w:hanging="360"/>
+      </w:pPr>
+      <w:rPr>
+        <w:rFonts w:ascii="Symbol" w:hAnsi="Symbol" w:hint="default"/>
+        <w:sz w:val="20"/>
+      </w:rPr>
+    </w:lvl>
+    <w:lvl w:ilvl="1" w:tentative="1">
+      <w:start w:val="1"/>
+      <w:numFmt w:val="bullet"/>
+      <w:lvlText w:val="o"/>
+      <w:lvlJc w:val="left"/>
+      <w:pPr>
+        <w:tabs>
+          <w:tab w:val="num" w:pos="1440"/>
+        </w:tabs>
+        <w:ind w:left="1440" w:hanging="360"/>
+      </w:pPr>
+      <w:rPr>
+        <w:rFonts w:ascii="Courier New" w:hAnsi="Courier New" w:hint="default"/>
+        <w:sz w:val="20"/>
+      </w:rPr>
+    </w:lvl>
+    <w:lvl w:ilvl="2" w:tentative="1">
+      <w:start w:val="1"/>
+      <w:numFmt w:val="bullet"/>
+      <w:lvlText w:val=""/>
+      <w:lvlJc w:val="left"/>
+      <w:pPr>
+        <w:tabs>
+          <w:tab w:val="num" w:pos="2160"/>
+        </w:tabs>
+        <w:ind w:left="2160" w:hanging="360"/>
+      </w:pPr>
+      <w:rPr>
+        <w:rFonts w:ascii="Wingdings" w:hAnsi="Wingdings" w:hint="default"/>
+        <w:sz w:val="20"/>
+      </w:rPr>
+    </w:lvl>
+    <w:lvl w:ilvl="3" w:tentative="1">
+      <w:start w:val="1"/>
+      <w:numFmt w:val="bullet"/>
+      <w:lvlText w:val=""/>
+      <w:lvlJc w:val="left"/>
+      <w:pPr>
+        <w:tabs>
+          <w:tab w:val="num" w:pos="2880"/>
+        </w:tabs>
+        <w:ind w:left="2880" w:hanging="360"/>
+      </w:pPr>
+      <w:rPr>
+        <w:rFonts w:ascii="Wingdings" w:hAnsi="Wingdings" w:hint="default"/>
+        <w:sz w:val="20"/>
+      </w:rPr>
+    </w:lvl>
+    <w:lvl w:ilvl="4" w:tentative="1">
+      <w:start w:val="1"/>
+      <w:numFmt w:val="bullet"/>
+      <w:lvlText w:val=""/>
+      <w:lvlJc w:val="left"/>
+      <w:pPr>
+        <w:tabs>
+          <w:tab w:val="num" w:pos="3600"/>
+        </w:tabs>
+        <w:ind w:left="3600" w:hanging="360"/>
+      </w:pPr>
+      <w:rPr>
+        <w:rFonts w:ascii="Wingdings" w:hAnsi="Wingdings" w:hint="default"/>
+        <w:sz w:val="20"/>
+      </w:rPr>
+    </w:lvl>
+    <w:lvl w:ilvl="5" w:tentative="1">
+      <w:start w:val="1"/>
+      <w:numFmt w:val="bullet"/>
+      <w:lvlText w:val=""/>
+      <w:lvlJc w:val="left"/>
+      <w:pPr>
+        <w:tabs>
+          <w:tab w:val="num" w:pos="4320"/>
+        </w:tabs>
+        <w:ind w:left="4320" w:hanging="360"/>
+      </w:pPr>
+      <w:rPr>
+        <w:rFonts w:ascii="Wingdings" w:hAnsi="Wingdings" w:hint="default"/>
+        <w:sz w:val="20"/>
+      </w:rPr>
+    </w:lvl>
+    <w:lvl w:ilvl="6" w:tentative="1">
+      <w:start w:val="1"/>
+      <w:numFmt w:val="bullet"/>
+      <w:lvlText w:val=""/>
+      <w:lvlJc w:val="left"/>
+      <w:pPr>
+        <w:tabs>
+          <w:tab w:val="num" w:pos="5040"/>
+        </w:tabs>
+        <w:ind w:left="5040" w:hanging="360"/>
+      </w:pPr>
+      <w:rPr>
+        <w:rFonts w:ascii="Wingdings" w:hAnsi="Wingdings" w:hint="default"/>
+        <w:sz w:val="20"/>
+      </w:rPr>
+    </w:lvl>
+    <w:lvl w:ilvl="7" w:tentative="1">
+      <w:start w:val="1"/>
+      <w:numFmt w:val="bullet"/>
+      <w:lvlText w:val=""/>
+      <w:lvlJc w:val="left"/>
+      <w:pPr>
+        <w:tabs>
+          <w:tab w:val="num" w:pos="5760"/>
+        </w:tabs>
+        <w:ind w:left="5760" w:hanging="360"/>
+      </w:pPr>
+      <w:rPr>
+        <w:rFonts w:ascii="Wingdings" w:hAnsi="Wingdings" w:hint="default"/>
+        <w:sz w:val="20"/>
+      </w:rPr>
+    </w:lvl>
+    <w:lvl w:ilvl="8" w:tentative="1">
+      <w:start w:val="1"/>
+      <w:numFmt w:val="bullet"/>
+      <w:lvlText w:val=""/>
+      <w:lvlJc w:val="left"/>
+      <w:pPr>
+        <w:tabs>
+          <w:tab w:val="num" w:pos="6480"/>
+        </w:tabs>
+        <w:ind w:left="6480" w:hanging="360"/>
+      </w:pPr>
+      <w:rPr>
+        <w:rFonts w:ascii="Wingdings" w:hAnsi="Wingdings" w:hint="default"/>
+        <w:sz w:val="20"/>
+      </w:rPr>
+    </w:lvl>
+  </w:abstractNum>
+  <w:abstractNum w:abstractNumId="8" w15:restartNumberingAfterBreak="0">
     <w:nsid w:val="22512D99"/>
     <w:multiLevelType w:val="multilevel"/>
     <w:tmpl w:val="DF961E8A"/>
@@ -4592,7 +6349,7 @@
       </w:rPr>
     </w:lvl>
   </w:abstractNum>
-  <w:abstractNum w:abstractNumId="5" w15:restartNumberingAfterBreak="0">
+  <w:abstractNum w:abstractNumId="9" w15:restartNumberingAfterBreak="0">
     <w:nsid w:val="26EB4456"/>
     <w:multiLevelType w:val="multilevel"/>
     <w:tmpl w:val="A64AE48A"/>
@@ -4741,7 +6498,7 @@
       </w:rPr>
     </w:lvl>
   </w:abstractNum>
-  <w:abstractNum w:abstractNumId="6" w15:restartNumberingAfterBreak="0">
+  <w:abstractNum w:abstractNumId="10" w15:restartNumberingAfterBreak="0">
     <w:nsid w:val="2BF048D8"/>
     <w:multiLevelType w:val="multilevel"/>
     <w:tmpl w:val="6FD4945A"/>
@@ -4890,7 +6647,7 @@
       </w:rPr>
     </w:lvl>
   </w:abstractNum>
-  <w:abstractNum w:abstractNumId="7" w15:restartNumberingAfterBreak="0">
+  <w:abstractNum w:abstractNumId="11" w15:restartNumberingAfterBreak="0">
     <w:nsid w:val="3F18494B"/>
     <w:multiLevelType w:val="hybridMultilevel"/>
     <w:tmpl w:val="A68CD09E"/>
@@ -4979,7 +6736,7 @@
       </w:pPr>
     </w:lvl>
   </w:abstractNum>
-  <w:abstractNum w:abstractNumId="8" w15:restartNumberingAfterBreak="0">
+  <w:abstractNum w:abstractNumId="12" w15:restartNumberingAfterBreak="0">
     <w:nsid w:val="3FBB2526"/>
     <w:multiLevelType w:val="multilevel"/>
     <w:tmpl w:val="AD2ADADC"/>
@@ -5128,7 +6885,7 @@
       </w:rPr>
     </w:lvl>
   </w:abstractNum>
-  <w:abstractNum w:abstractNumId="9" w15:restartNumberingAfterBreak="0">
+  <w:abstractNum w:abstractNumId="13" w15:restartNumberingAfterBreak="0">
     <w:nsid w:val="558E6BC9"/>
     <w:multiLevelType w:val="multilevel"/>
     <w:tmpl w:val="90BAC220"/>
@@ -5277,7 +7034,7 @@
       </w:rPr>
     </w:lvl>
   </w:abstractNum>
-  <w:abstractNum w:abstractNumId="10" w15:restartNumberingAfterBreak="0">
+  <w:abstractNum w:abstractNumId="14" w15:restartNumberingAfterBreak="0">
     <w:nsid w:val="5645566A"/>
     <w:multiLevelType w:val="multilevel"/>
     <w:tmpl w:val="BBF63E64"/>
@@ -5426,7 +7183,156 @@
       </w:rPr>
     </w:lvl>
   </w:abstractNum>
-  <w:abstractNum w:abstractNumId="11" w15:restartNumberingAfterBreak="0">
+  <w:abstractNum w:abstractNumId="15" w15:restartNumberingAfterBreak="0">
+    <w:nsid w:val="56AE1955"/>
+    <w:multiLevelType w:val="multilevel"/>
+    <w:tmpl w:val="120A6B14"/>
+    <w:lvl w:ilvl="0">
+      <w:start w:val="1"/>
+      <w:numFmt w:val="bullet"/>
+      <w:lvlText w:val=""/>
+      <w:lvlJc w:val="left"/>
+      <w:pPr>
+        <w:tabs>
+          <w:tab w:val="num" w:pos="720"/>
+        </w:tabs>
+        <w:ind w:left="720" w:hanging="360"/>
+      </w:pPr>
+      <w:rPr>
+        <w:rFonts w:ascii="Symbol" w:hAnsi="Symbol" w:hint="default"/>
+        <w:sz w:val="20"/>
+      </w:rPr>
+    </w:lvl>
+    <w:lvl w:ilvl="1" w:tentative="1">
+      <w:start w:val="1"/>
+      <w:numFmt w:val="bullet"/>
+      <w:lvlText w:val="o"/>
+      <w:lvlJc w:val="left"/>
+      <w:pPr>
+        <w:tabs>
+          <w:tab w:val="num" w:pos="1440"/>
+        </w:tabs>
+        <w:ind w:left="1440" w:hanging="360"/>
+      </w:pPr>
+      <w:rPr>
+        <w:rFonts w:ascii="Courier New" w:hAnsi="Courier New" w:hint="default"/>
+        <w:sz w:val="20"/>
+      </w:rPr>
+    </w:lvl>
+    <w:lvl w:ilvl="2" w:tentative="1">
+      <w:start w:val="1"/>
+      <w:numFmt w:val="bullet"/>
+      <w:lvlText w:val=""/>
+      <w:lvlJc w:val="left"/>
+      <w:pPr>
+        <w:tabs>
+          <w:tab w:val="num" w:pos="2160"/>
+        </w:tabs>
+        <w:ind w:left="2160" w:hanging="360"/>
+      </w:pPr>
+      <w:rPr>
+        <w:rFonts w:ascii="Wingdings" w:hAnsi="Wingdings" w:hint="default"/>
+        <w:sz w:val="20"/>
+      </w:rPr>
+    </w:lvl>
+    <w:lvl w:ilvl="3" w:tentative="1">
+      <w:start w:val="1"/>
+      <w:numFmt w:val="bullet"/>
+      <w:lvlText w:val=""/>
+      <w:lvlJc w:val="left"/>
+      <w:pPr>
+        <w:tabs>
+          <w:tab w:val="num" w:pos="2880"/>
+        </w:tabs>
+        <w:ind w:left="2880" w:hanging="360"/>
+      </w:pPr>
+      <w:rPr>
+        <w:rFonts w:ascii="Wingdings" w:hAnsi="Wingdings" w:hint="default"/>
+        <w:sz w:val="20"/>
+      </w:rPr>
+    </w:lvl>
+    <w:lvl w:ilvl="4" w:tentative="1">
+      <w:start w:val="1"/>
+      <w:numFmt w:val="bullet"/>
+      <w:lvlText w:val=""/>
+      <w:lvlJc w:val="left"/>
+      <w:pPr>
+        <w:tabs>
+          <w:tab w:val="num" w:pos="3600"/>
+        </w:tabs>
+        <w:ind w:left="3600" w:hanging="360"/>
+      </w:pPr>
+      <w:rPr>
+        <w:rFonts w:ascii="Wingdings" w:hAnsi="Wingdings" w:hint="default"/>
+        <w:sz w:val="20"/>
+      </w:rPr>
+    </w:lvl>
+    <w:lvl w:ilvl="5" w:tentative="1">
+      <w:start w:val="1"/>
+      <w:numFmt w:val="bullet"/>
+      <w:lvlText w:val=""/>
+      <w:lvlJc w:val="left"/>
+      <w:pPr>
+        <w:tabs>
+          <w:tab w:val="num" w:pos="4320"/>
+        </w:tabs>
+        <w:ind w:left="4320" w:hanging="360"/>
+      </w:pPr>
+      <w:rPr>
+        <w:rFonts w:ascii="Wingdings" w:hAnsi="Wingdings" w:hint="default"/>
+        <w:sz w:val="20"/>
+      </w:rPr>
+    </w:lvl>
+    <w:lvl w:ilvl="6" w:tentative="1">
+      <w:start w:val="1"/>
+      <w:numFmt w:val="bullet"/>
+      <w:lvlText w:val=""/>
+      <w:lvlJc w:val="left"/>
+      <w:pPr>
+        <w:tabs>
+          <w:tab w:val="num" w:pos="5040"/>
+        </w:tabs>
+        <w:ind w:left="5040" w:hanging="360"/>
+      </w:pPr>
+      <w:rPr>
+        <w:rFonts w:ascii="Wingdings" w:hAnsi="Wingdings" w:hint="default"/>
+        <w:sz w:val="20"/>
+      </w:rPr>
+    </w:lvl>
+    <w:lvl w:ilvl="7" w:tentative="1">
+      <w:start w:val="1"/>
+      <w:numFmt w:val="bullet"/>
+      <w:lvlText w:val=""/>
+      <w:lvlJc w:val="left"/>
+      <w:pPr>
+        <w:tabs>
+          <w:tab w:val="num" w:pos="5760"/>
+        </w:tabs>
+        <w:ind w:left="5760" w:hanging="360"/>
+      </w:pPr>
+      <w:rPr>
+        <w:rFonts w:ascii="Wingdings" w:hAnsi="Wingdings" w:hint="default"/>
+        <w:sz w:val="20"/>
+      </w:rPr>
+    </w:lvl>
+    <w:lvl w:ilvl="8" w:tentative="1">
+      <w:start w:val="1"/>
+      <w:numFmt w:val="bullet"/>
+      <w:lvlText w:val=""/>
+      <w:lvlJc w:val="left"/>
+      <w:pPr>
+        <w:tabs>
+          <w:tab w:val="num" w:pos="6480"/>
+        </w:tabs>
+        <w:ind w:left="6480" w:hanging="360"/>
+      </w:pPr>
+      <w:rPr>
+        <w:rFonts w:ascii="Wingdings" w:hAnsi="Wingdings" w:hint="default"/>
+        <w:sz w:val="20"/>
+      </w:rPr>
+    </w:lvl>
+  </w:abstractNum>
+  <w:abstractNum w:abstractNumId="16" w15:restartNumberingAfterBreak="0">
     <w:nsid w:val="578A0129"/>
     <w:multiLevelType w:val="multilevel"/>
     <w:tmpl w:val="54F47686"/>
@@ -5575,7 +7481,305 @@
       </w:rPr>
     </w:lvl>
   </w:abstractNum>
-  <w:abstractNum w:abstractNumId="12" w15:restartNumberingAfterBreak="0">
+  <w:abstractNum w:abstractNumId="17" w15:restartNumberingAfterBreak="0">
+    <w:nsid w:val="5D997290"/>
+    <w:multiLevelType w:val="multilevel"/>
+    <w:tmpl w:val="AD5ACC24"/>
+    <w:lvl w:ilvl="0">
+      <w:start w:val="1"/>
+      <w:numFmt w:val="bullet"/>
+      <w:lvlText w:val=""/>
+      <w:lvlJc w:val="left"/>
+      <w:pPr>
+        <w:tabs>
+          <w:tab w:val="num" w:pos="720"/>
+        </w:tabs>
+        <w:ind w:left="720" w:hanging="360"/>
+      </w:pPr>
+      <w:rPr>
+        <w:rFonts w:ascii="Symbol" w:hAnsi="Symbol" w:hint="default"/>
+        <w:sz w:val="20"/>
+      </w:rPr>
+    </w:lvl>
+    <w:lvl w:ilvl="1" w:tentative="1">
+      <w:start w:val="1"/>
+      <w:numFmt w:val="bullet"/>
+      <w:lvlText w:val="o"/>
+      <w:lvlJc w:val="left"/>
+      <w:pPr>
+        <w:tabs>
+          <w:tab w:val="num" w:pos="1440"/>
+        </w:tabs>
+        <w:ind w:left="1440" w:hanging="360"/>
+      </w:pPr>
+      <w:rPr>
+        <w:rFonts w:ascii="Courier New" w:hAnsi="Courier New" w:hint="default"/>
+        <w:sz w:val="20"/>
+      </w:rPr>
+    </w:lvl>
+    <w:lvl w:ilvl="2" w:tentative="1">
+      <w:start w:val="1"/>
+      <w:numFmt w:val="bullet"/>
+      <w:lvlText w:val=""/>
+      <w:lvlJc w:val="left"/>
+      <w:pPr>
+        <w:tabs>
+          <w:tab w:val="num" w:pos="2160"/>
+        </w:tabs>
+        <w:ind w:left="2160" w:hanging="360"/>
+      </w:pPr>
+      <w:rPr>
+        <w:rFonts w:ascii="Wingdings" w:hAnsi="Wingdings" w:hint="default"/>
+        <w:sz w:val="20"/>
+      </w:rPr>
+    </w:lvl>
+    <w:lvl w:ilvl="3" w:tentative="1">
+      <w:start w:val="1"/>
+      <w:numFmt w:val="bullet"/>
+      <w:lvlText w:val=""/>
+      <w:lvlJc w:val="left"/>
+      <w:pPr>
+        <w:tabs>
+          <w:tab w:val="num" w:pos="2880"/>
+        </w:tabs>
+        <w:ind w:left="2880" w:hanging="360"/>
+      </w:pPr>
+      <w:rPr>
+        <w:rFonts w:ascii="Wingdings" w:hAnsi="Wingdings" w:hint="default"/>
+        <w:sz w:val="20"/>
+      </w:rPr>
+    </w:lvl>
+    <w:lvl w:ilvl="4" w:tentative="1">
+      <w:start w:val="1"/>
+      <w:numFmt w:val="bullet"/>
+      <w:lvlText w:val=""/>
+      <w:lvlJc w:val="left"/>
+      <w:pPr>
+        <w:tabs>
+          <w:tab w:val="num" w:pos="3600"/>
+        </w:tabs>
+        <w:ind w:left="3600" w:hanging="360"/>
+      </w:pPr>
+      <w:rPr>
+        <w:rFonts w:ascii="Wingdings" w:hAnsi="Wingdings" w:hint="default"/>
+        <w:sz w:val="20"/>
+      </w:rPr>
+    </w:lvl>
+    <w:lvl w:ilvl="5" w:tentative="1">
+      <w:start w:val="1"/>
+      <w:numFmt w:val="bullet"/>
+      <w:lvlText w:val=""/>
+      <w:lvlJc w:val="left"/>
+      <w:pPr>
+        <w:tabs>
+          <w:tab w:val="num" w:pos="4320"/>
+        </w:tabs>
+        <w:ind w:left="4320" w:hanging="360"/>
+      </w:pPr>
+      <w:rPr>
+        <w:rFonts w:ascii="Wingdings" w:hAnsi="Wingdings" w:hint="default"/>
+        <w:sz w:val="20"/>
+      </w:rPr>
+    </w:lvl>
+    <w:lvl w:ilvl="6" w:tentative="1">
+      <w:start w:val="1"/>
+      <w:numFmt w:val="bullet"/>
+      <w:lvlText w:val=""/>
+      <w:lvlJc w:val="left"/>
+      <w:pPr>
+        <w:tabs>
+          <w:tab w:val="num" w:pos="5040"/>
+        </w:tabs>
+        <w:ind w:left="5040" w:hanging="360"/>
+      </w:pPr>
+      <w:rPr>
+        <w:rFonts w:ascii="Wingdings" w:hAnsi="Wingdings" w:hint="default"/>
+        <w:sz w:val="20"/>
+      </w:rPr>
+    </w:lvl>
+    <w:lvl w:ilvl="7" w:tentative="1">
+      <w:start w:val="1"/>
+      <w:numFmt w:val="bullet"/>
+      <w:lvlText w:val=""/>
+      <w:lvlJc w:val="left"/>
+      <w:pPr>
+        <w:tabs>
+          <w:tab w:val="num" w:pos="5760"/>
+        </w:tabs>
+        <w:ind w:left="5760" w:hanging="360"/>
+      </w:pPr>
+      <w:rPr>
+        <w:rFonts w:ascii="Wingdings" w:hAnsi="Wingdings" w:hint="default"/>
+        <w:sz w:val="20"/>
+      </w:rPr>
+    </w:lvl>
+    <w:lvl w:ilvl="8" w:tentative="1">
+      <w:start w:val="1"/>
+      <w:numFmt w:val="bullet"/>
+      <w:lvlText w:val=""/>
+      <w:lvlJc w:val="left"/>
+      <w:pPr>
+        <w:tabs>
+          <w:tab w:val="num" w:pos="6480"/>
+        </w:tabs>
+        <w:ind w:left="6480" w:hanging="360"/>
+      </w:pPr>
+      <w:rPr>
+        <w:rFonts w:ascii="Wingdings" w:hAnsi="Wingdings" w:hint="default"/>
+        <w:sz w:val="20"/>
+      </w:rPr>
+    </w:lvl>
+  </w:abstractNum>
+  <w:abstractNum w:abstractNumId="18" w15:restartNumberingAfterBreak="0">
+    <w:nsid w:val="60445027"/>
+    <w:multiLevelType w:val="multilevel"/>
+    <w:tmpl w:val="4CF6E552"/>
+    <w:lvl w:ilvl="0">
+      <w:start w:val="1"/>
+      <w:numFmt w:val="bullet"/>
+      <w:lvlText w:val=""/>
+      <w:lvlJc w:val="left"/>
+      <w:pPr>
+        <w:tabs>
+          <w:tab w:val="num" w:pos="720"/>
+        </w:tabs>
+        <w:ind w:left="720" w:hanging="360"/>
+      </w:pPr>
+      <w:rPr>
+        <w:rFonts w:ascii="Symbol" w:hAnsi="Symbol" w:hint="default"/>
+        <w:sz w:val="20"/>
+      </w:rPr>
+    </w:lvl>
+    <w:lvl w:ilvl="1" w:tentative="1">
+      <w:start w:val="1"/>
+      <w:numFmt w:val="bullet"/>
+      <w:lvlText w:val="o"/>
+      <w:lvlJc w:val="left"/>
+      <w:pPr>
+        <w:tabs>
+          <w:tab w:val="num" w:pos="1440"/>
+        </w:tabs>
+        <w:ind w:left="1440" w:hanging="360"/>
+      </w:pPr>
+      <w:rPr>
+        <w:rFonts w:ascii="Courier New" w:hAnsi="Courier New" w:hint="default"/>
+        <w:sz w:val="20"/>
+      </w:rPr>
+    </w:lvl>
+    <w:lvl w:ilvl="2" w:tentative="1">
+      <w:start w:val="1"/>
+      <w:numFmt w:val="bullet"/>
+      <w:lvlText w:val=""/>
+      <w:lvlJc w:val="left"/>
+      <w:pPr>
+        <w:tabs>
+          <w:tab w:val="num" w:pos="2160"/>
+        </w:tabs>
+        <w:ind w:left="2160" w:hanging="360"/>
+      </w:pPr>
+      <w:rPr>
+        <w:rFonts w:ascii="Wingdings" w:hAnsi="Wingdings" w:hint="default"/>
+        <w:sz w:val="20"/>
+      </w:rPr>
+    </w:lvl>
+    <w:lvl w:ilvl="3" w:tentative="1">
+      <w:start w:val="1"/>
+      <w:numFmt w:val="bullet"/>
+      <w:lvlText w:val=""/>
+      <w:lvlJc w:val="left"/>
+      <w:pPr>
+        <w:tabs>
+          <w:tab w:val="num" w:pos="2880"/>
+        </w:tabs>
+        <w:ind w:left="2880" w:hanging="360"/>
+      </w:pPr>
+      <w:rPr>
+        <w:rFonts w:ascii="Wingdings" w:hAnsi="Wingdings" w:hint="default"/>
+        <w:sz w:val="20"/>
+      </w:rPr>
+    </w:lvl>
+    <w:lvl w:ilvl="4" w:tentative="1">
+      <w:start w:val="1"/>
+      <w:numFmt w:val="bullet"/>
+      <w:lvlText w:val=""/>
+      <w:lvlJc w:val="left"/>
+      <w:pPr>
+        <w:tabs>
+          <w:tab w:val="num" w:pos="3600"/>
+        </w:tabs>
+        <w:ind w:left="3600" w:hanging="360"/>
+      </w:pPr>
+      <w:rPr>
+        <w:rFonts w:ascii="Wingdings" w:hAnsi="Wingdings" w:hint="default"/>
+        <w:sz w:val="20"/>
+      </w:rPr>
+    </w:lvl>
+    <w:lvl w:ilvl="5" w:tentative="1">
+      <w:start w:val="1"/>
+      <w:numFmt w:val="bullet"/>
+      <w:lvlText w:val=""/>
+      <w:lvlJc w:val="left"/>
+      <w:pPr>
+        <w:tabs>
+          <w:tab w:val="num" w:pos="4320"/>
+        </w:tabs>
+        <w:ind w:left="4320" w:hanging="360"/>
+      </w:pPr>
+      <w:rPr>
+        <w:rFonts w:ascii="Wingdings" w:hAnsi="Wingdings" w:hint="default"/>
+        <w:sz w:val="20"/>
+      </w:rPr>
+    </w:lvl>
+    <w:lvl w:ilvl="6" w:tentative="1">
+      <w:start w:val="1"/>
+      <w:numFmt w:val="bullet"/>
+      <w:lvlText w:val=""/>
+      <w:lvlJc w:val="left"/>
+      <w:pPr>
+        <w:tabs>
+          <w:tab w:val="num" w:pos="5040"/>
+        </w:tabs>
+        <w:ind w:left="5040" w:hanging="360"/>
+      </w:pPr>
+      <w:rPr>
+        <w:rFonts w:ascii="Wingdings" w:hAnsi="Wingdings" w:hint="default"/>
+        <w:sz w:val="20"/>
+      </w:rPr>
+    </w:lvl>
+    <w:lvl w:ilvl="7" w:tentative="1">
+      <w:start w:val="1"/>
+      <w:numFmt w:val="bullet"/>
+      <w:lvlText w:val=""/>
+      <w:lvlJc w:val="left"/>
+      <w:pPr>
+        <w:tabs>
+          <w:tab w:val="num" w:pos="5760"/>
+        </w:tabs>
+        <w:ind w:left="5760" w:hanging="360"/>
+      </w:pPr>
+      <w:rPr>
+        <w:rFonts w:ascii="Wingdings" w:hAnsi="Wingdings" w:hint="default"/>
+        <w:sz w:val="20"/>
+      </w:rPr>
+    </w:lvl>
+    <w:lvl w:ilvl="8" w:tentative="1">
+      <w:start w:val="1"/>
+      <w:numFmt w:val="bullet"/>
+      <w:lvlText w:val=""/>
+      <w:lvlJc w:val="left"/>
+      <w:pPr>
+        <w:tabs>
+          <w:tab w:val="num" w:pos="6480"/>
+        </w:tabs>
+        <w:ind w:left="6480" w:hanging="360"/>
+      </w:pPr>
+      <w:rPr>
+        <w:rFonts w:ascii="Wingdings" w:hAnsi="Wingdings" w:hint="default"/>
+        <w:sz w:val="20"/>
+      </w:rPr>
+    </w:lvl>
+  </w:abstractNum>
+  <w:abstractNum w:abstractNumId="19" w15:restartNumberingAfterBreak="0">
     <w:nsid w:val="6B642698"/>
     <w:multiLevelType w:val="multilevel"/>
     <w:tmpl w:val="BA70F120"/>
@@ -5724,7 +7928,305 @@
       </w:rPr>
     </w:lvl>
   </w:abstractNum>
-  <w:abstractNum w:abstractNumId="13" w15:restartNumberingAfterBreak="0">
+  <w:abstractNum w:abstractNumId="20" w15:restartNumberingAfterBreak="0">
+    <w:nsid w:val="6C0011F8"/>
+    <w:multiLevelType w:val="multilevel"/>
+    <w:tmpl w:val="379232E6"/>
+    <w:lvl w:ilvl="0">
+      <w:start w:val="1"/>
+      <w:numFmt w:val="bullet"/>
+      <w:lvlText w:val=""/>
+      <w:lvlJc w:val="left"/>
+      <w:pPr>
+        <w:tabs>
+          <w:tab w:val="num" w:pos="720"/>
+        </w:tabs>
+        <w:ind w:left="720" w:hanging="360"/>
+      </w:pPr>
+      <w:rPr>
+        <w:rFonts w:ascii="Symbol" w:hAnsi="Symbol" w:hint="default"/>
+        <w:sz w:val="20"/>
+      </w:rPr>
+    </w:lvl>
+    <w:lvl w:ilvl="1" w:tentative="1">
+      <w:start w:val="1"/>
+      <w:numFmt w:val="bullet"/>
+      <w:lvlText w:val="o"/>
+      <w:lvlJc w:val="left"/>
+      <w:pPr>
+        <w:tabs>
+          <w:tab w:val="num" w:pos="1440"/>
+        </w:tabs>
+        <w:ind w:left="1440" w:hanging="360"/>
+      </w:pPr>
+      <w:rPr>
+        <w:rFonts w:ascii="Courier New" w:hAnsi="Courier New" w:hint="default"/>
+        <w:sz w:val="20"/>
+      </w:rPr>
+    </w:lvl>
+    <w:lvl w:ilvl="2" w:tentative="1">
+      <w:start w:val="1"/>
+      <w:numFmt w:val="bullet"/>
+      <w:lvlText w:val=""/>
+      <w:lvlJc w:val="left"/>
+      <w:pPr>
+        <w:tabs>
+          <w:tab w:val="num" w:pos="2160"/>
+        </w:tabs>
+        <w:ind w:left="2160" w:hanging="360"/>
+      </w:pPr>
+      <w:rPr>
+        <w:rFonts w:ascii="Wingdings" w:hAnsi="Wingdings" w:hint="default"/>
+        <w:sz w:val="20"/>
+      </w:rPr>
+    </w:lvl>
+    <w:lvl w:ilvl="3" w:tentative="1">
+      <w:start w:val="1"/>
+      <w:numFmt w:val="bullet"/>
+      <w:lvlText w:val=""/>
+      <w:lvlJc w:val="left"/>
+      <w:pPr>
+        <w:tabs>
+          <w:tab w:val="num" w:pos="2880"/>
+        </w:tabs>
+        <w:ind w:left="2880" w:hanging="360"/>
+      </w:pPr>
+      <w:rPr>
+        <w:rFonts w:ascii="Wingdings" w:hAnsi="Wingdings" w:hint="default"/>
+        <w:sz w:val="20"/>
+      </w:rPr>
+    </w:lvl>
+    <w:lvl w:ilvl="4" w:tentative="1">
+      <w:start w:val="1"/>
+      <w:numFmt w:val="bullet"/>
+      <w:lvlText w:val=""/>
+      <w:lvlJc w:val="left"/>
+      <w:pPr>
+        <w:tabs>
+          <w:tab w:val="num" w:pos="3600"/>
+        </w:tabs>
+        <w:ind w:left="3600" w:hanging="360"/>
+      </w:pPr>
+      <w:rPr>
+        <w:rFonts w:ascii="Wingdings" w:hAnsi="Wingdings" w:hint="default"/>
+        <w:sz w:val="20"/>
+      </w:rPr>
+    </w:lvl>
+    <w:lvl w:ilvl="5" w:tentative="1">
+      <w:start w:val="1"/>
+      <w:numFmt w:val="bullet"/>
+      <w:lvlText w:val=""/>
+      <w:lvlJc w:val="left"/>
+      <w:pPr>
+        <w:tabs>
+          <w:tab w:val="num" w:pos="4320"/>
+        </w:tabs>
+        <w:ind w:left="4320" w:hanging="360"/>
+      </w:pPr>
+      <w:rPr>
+        <w:rFonts w:ascii="Wingdings" w:hAnsi="Wingdings" w:hint="default"/>
+        <w:sz w:val="20"/>
+      </w:rPr>
+    </w:lvl>
+    <w:lvl w:ilvl="6" w:tentative="1">
+      <w:start w:val="1"/>
+      <w:numFmt w:val="bullet"/>
+      <w:lvlText w:val=""/>
+      <w:lvlJc w:val="left"/>
+      <w:pPr>
+        <w:tabs>
+          <w:tab w:val="num" w:pos="5040"/>
+        </w:tabs>
+        <w:ind w:left="5040" w:hanging="360"/>
+      </w:pPr>
+      <w:rPr>
+        <w:rFonts w:ascii="Wingdings" w:hAnsi="Wingdings" w:hint="default"/>
+        <w:sz w:val="20"/>
+      </w:rPr>
+    </w:lvl>
+    <w:lvl w:ilvl="7" w:tentative="1">
+      <w:start w:val="1"/>
+      <w:numFmt w:val="bullet"/>
+      <w:lvlText w:val=""/>
+      <w:lvlJc w:val="left"/>
+      <w:pPr>
+        <w:tabs>
+          <w:tab w:val="num" w:pos="5760"/>
+        </w:tabs>
+        <w:ind w:left="5760" w:hanging="360"/>
+      </w:pPr>
+      <w:rPr>
+        <w:rFonts w:ascii="Wingdings" w:hAnsi="Wingdings" w:hint="default"/>
+        <w:sz w:val="20"/>
+      </w:rPr>
+    </w:lvl>
+    <w:lvl w:ilvl="8" w:tentative="1">
+      <w:start w:val="1"/>
+      <w:numFmt w:val="bullet"/>
+      <w:lvlText w:val=""/>
+      <w:lvlJc w:val="left"/>
+      <w:pPr>
+        <w:tabs>
+          <w:tab w:val="num" w:pos="6480"/>
+        </w:tabs>
+        <w:ind w:left="6480" w:hanging="360"/>
+      </w:pPr>
+      <w:rPr>
+        <w:rFonts w:ascii="Wingdings" w:hAnsi="Wingdings" w:hint="default"/>
+        <w:sz w:val="20"/>
+      </w:rPr>
+    </w:lvl>
+  </w:abstractNum>
+  <w:abstractNum w:abstractNumId="21" w15:restartNumberingAfterBreak="0">
+    <w:nsid w:val="6EDE19B7"/>
+    <w:multiLevelType w:val="multilevel"/>
+    <w:tmpl w:val="9410929C"/>
+    <w:lvl w:ilvl="0">
+      <w:start w:val="1"/>
+      <w:numFmt w:val="bullet"/>
+      <w:lvlText w:val=""/>
+      <w:lvlJc w:val="left"/>
+      <w:pPr>
+        <w:tabs>
+          <w:tab w:val="num" w:pos="720"/>
+        </w:tabs>
+        <w:ind w:left="720" w:hanging="360"/>
+      </w:pPr>
+      <w:rPr>
+        <w:rFonts w:ascii="Symbol" w:hAnsi="Symbol" w:hint="default"/>
+        <w:sz w:val="20"/>
+      </w:rPr>
+    </w:lvl>
+    <w:lvl w:ilvl="1" w:tentative="1">
+      <w:start w:val="1"/>
+      <w:numFmt w:val="bullet"/>
+      <w:lvlText w:val="o"/>
+      <w:lvlJc w:val="left"/>
+      <w:pPr>
+        <w:tabs>
+          <w:tab w:val="num" w:pos="1440"/>
+        </w:tabs>
+        <w:ind w:left="1440" w:hanging="360"/>
+      </w:pPr>
+      <w:rPr>
+        <w:rFonts w:ascii="Courier New" w:hAnsi="Courier New" w:hint="default"/>
+        <w:sz w:val="20"/>
+      </w:rPr>
+    </w:lvl>
+    <w:lvl w:ilvl="2" w:tentative="1">
+      <w:start w:val="1"/>
+      <w:numFmt w:val="bullet"/>
+      <w:lvlText w:val=""/>
+      <w:lvlJc w:val="left"/>
+      <w:pPr>
+        <w:tabs>
+          <w:tab w:val="num" w:pos="2160"/>
+        </w:tabs>
+        <w:ind w:left="2160" w:hanging="360"/>
+      </w:pPr>
+      <w:rPr>
+        <w:rFonts w:ascii="Wingdings" w:hAnsi="Wingdings" w:hint="default"/>
+        <w:sz w:val="20"/>
+      </w:rPr>
+    </w:lvl>
+    <w:lvl w:ilvl="3" w:tentative="1">
+      <w:start w:val="1"/>
+      <w:numFmt w:val="bullet"/>
+      <w:lvlText w:val=""/>
+      <w:lvlJc w:val="left"/>
+      <w:pPr>
+        <w:tabs>
+          <w:tab w:val="num" w:pos="2880"/>
+        </w:tabs>
+        <w:ind w:left="2880" w:hanging="360"/>
+      </w:pPr>
+      <w:rPr>
+        <w:rFonts w:ascii="Wingdings" w:hAnsi="Wingdings" w:hint="default"/>
+        <w:sz w:val="20"/>
+      </w:rPr>
+    </w:lvl>
+    <w:lvl w:ilvl="4" w:tentative="1">
+      <w:start w:val="1"/>
+      <w:numFmt w:val="bullet"/>
+      <w:lvlText w:val=""/>
+      <w:lvlJc w:val="left"/>
+      <w:pPr>
+        <w:tabs>
+          <w:tab w:val="num" w:pos="3600"/>
+        </w:tabs>
+        <w:ind w:left="3600" w:hanging="360"/>
+      </w:pPr>
+      <w:rPr>
+        <w:rFonts w:ascii="Wingdings" w:hAnsi="Wingdings" w:hint="default"/>
+        <w:sz w:val="20"/>
+      </w:rPr>
+    </w:lvl>
+    <w:lvl w:ilvl="5" w:tentative="1">
+      <w:start w:val="1"/>
+      <w:numFmt w:val="bullet"/>
+      <w:lvlText w:val=""/>
+      <w:lvlJc w:val="left"/>
+      <w:pPr>
+        <w:tabs>
+          <w:tab w:val="num" w:pos="4320"/>
+        </w:tabs>
+        <w:ind w:left="4320" w:hanging="360"/>
+      </w:pPr>
+      <w:rPr>
+        <w:rFonts w:ascii="Wingdings" w:hAnsi="Wingdings" w:hint="default"/>
+        <w:sz w:val="20"/>
+      </w:rPr>
+    </w:lvl>
+    <w:lvl w:ilvl="6" w:tentative="1">
+      <w:start w:val="1"/>
+      <w:numFmt w:val="bullet"/>
+      <w:lvlText w:val=""/>
+      <w:lvlJc w:val="left"/>
+      <w:pPr>
+        <w:tabs>
+          <w:tab w:val="num" w:pos="5040"/>
+        </w:tabs>
+        <w:ind w:left="5040" w:hanging="360"/>
+      </w:pPr>
+      <w:rPr>
+        <w:rFonts w:ascii="Wingdings" w:hAnsi="Wingdings" w:hint="default"/>
+        <w:sz w:val="20"/>
+      </w:rPr>
+    </w:lvl>
+    <w:lvl w:ilvl="7" w:tentative="1">
+      <w:start w:val="1"/>
+      <w:numFmt w:val="bullet"/>
+      <w:lvlText w:val=""/>
+      <w:lvlJc w:val="left"/>
+      <w:pPr>
+        <w:tabs>
+          <w:tab w:val="num" w:pos="5760"/>
+        </w:tabs>
+        <w:ind w:left="5760" w:hanging="360"/>
+      </w:pPr>
+      <w:rPr>
+        <w:rFonts w:ascii="Wingdings" w:hAnsi="Wingdings" w:hint="default"/>
+        <w:sz w:val="20"/>
+      </w:rPr>
+    </w:lvl>
+    <w:lvl w:ilvl="8" w:tentative="1">
+      <w:start w:val="1"/>
+      <w:numFmt w:val="bullet"/>
+      <w:lvlText w:val=""/>
+      <w:lvlJc w:val="left"/>
+      <w:pPr>
+        <w:tabs>
+          <w:tab w:val="num" w:pos="6480"/>
+        </w:tabs>
+        <w:ind w:left="6480" w:hanging="360"/>
+      </w:pPr>
+      <w:rPr>
+        <w:rFonts w:ascii="Wingdings" w:hAnsi="Wingdings" w:hint="default"/>
+        <w:sz w:val="20"/>
+      </w:rPr>
+    </w:lvl>
+  </w:abstractNum>
+  <w:abstractNum w:abstractNumId="22" w15:restartNumberingAfterBreak="0">
     <w:nsid w:val="6FFD0680"/>
     <w:multiLevelType w:val="multilevel"/>
     <w:tmpl w:val="AF724A96"/>
@@ -5870,7 +8372,7 @@
       </w:rPr>
     </w:lvl>
   </w:abstractNum>
-  <w:abstractNum w:abstractNumId="14" w15:restartNumberingAfterBreak="0">
+  <w:abstractNum w:abstractNumId="23" w15:restartNumberingAfterBreak="0">
     <w:nsid w:val="75877FAB"/>
     <w:multiLevelType w:val="multilevel"/>
     <w:tmpl w:val="3C8048E8"/>
@@ -5984,49 +8486,76 @@
     </w:lvl>
   </w:abstractNum>
   <w:num w:numId="1" w16cid:durableId="2010866847">
-    <w:abstractNumId w:val="3"/>
+    <w:abstractNumId w:val="5"/>
   </w:num>
   <w:num w:numId="2" w16cid:durableId="388696275">
     <w:abstractNumId w:val="0"/>
   </w:num>
   <w:num w:numId="3" w16cid:durableId="1559586336">
+    <w:abstractNumId w:val="12"/>
+  </w:num>
+  <w:num w:numId="4" w16cid:durableId="863010032">
+    <w:abstractNumId w:val="11"/>
+  </w:num>
+  <w:num w:numId="5" w16cid:durableId="2137480602">
+    <w:abstractNumId w:val="22"/>
+  </w:num>
+  <w:num w:numId="6" w16cid:durableId="828447545">
+    <w:abstractNumId w:val="23"/>
+  </w:num>
+  <w:num w:numId="7" w16cid:durableId="1736388261">
+    <w:abstractNumId w:val="14"/>
+  </w:num>
+  <w:num w:numId="8" w16cid:durableId="97876124">
+    <w:abstractNumId w:val="9"/>
+  </w:num>
+  <w:num w:numId="9" w16cid:durableId="1702824430">
+    <w:abstractNumId w:val="13"/>
+  </w:num>
+  <w:num w:numId="10" w16cid:durableId="1657224392">
+    <w:abstractNumId w:val="10"/>
+  </w:num>
+  <w:num w:numId="11" w16cid:durableId="602345971">
+    <w:abstractNumId w:val="4"/>
+  </w:num>
+  <w:num w:numId="12" w16cid:durableId="1246308174">
+    <w:abstractNumId w:val="16"/>
+  </w:num>
+  <w:num w:numId="13" w16cid:durableId="2001496677">
     <w:abstractNumId w:val="8"/>
   </w:num>
-  <w:num w:numId="4" w16cid:durableId="863010032">
-    <w:abstractNumId w:val="7"/>
+  <w:num w:numId="14" w16cid:durableId="283846998">
+    <w:abstractNumId w:val="19"/>
   </w:num>
-  <w:num w:numId="5" w16cid:durableId="2137480602">
-    <w:abstractNumId w:val="13"/>
+  <w:num w:numId="15" w16cid:durableId="377167331">
+    <w:abstractNumId w:val="2"/>
   </w:num>
-  <w:num w:numId="6" w16cid:durableId="828447545">
-    <w:abstractNumId w:val="14"/>
+  <w:num w:numId="16" w16cid:durableId="433017346">
+    <w:abstractNumId w:val="1"/>
   </w:num>
-  <w:num w:numId="7" w16cid:durableId="1736388261">
-    <w:abstractNumId w:val="10"/>
+  <w:num w:numId="17" w16cid:durableId="1059207488">
+    <w:abstractNumId w:val="15"/>
   </w:num>
-  <w:num w:numId="8" w16cid:durableId="97876124">
-    <w:abstractNumId w:val="5"/>
-  </w:num>
-  <w:num w:numId="9" w16cid:durableId="1702824430">
-    <w:abstractNumId w:val="9"/>
-  </w:num>
-  <w:num w:numId="10" w16cid:durableId="1657224392">
+  <w:num w:numId="18" w16cid:durableId="1899901772">
     <w:abstractNumId w:val="6"/>
   </w:num>
-  <w:num w:numId="11" w16cid:durableId="602345971">
-    <w:abstractNumId w:val="2"/>
+  <w:num w:numId="19" w16cid:durableId="2105883544">
+    <w:abstractNumId w:val="18"/>
   </w:num>
-  <w:num w:numId="12" w16cid:durableId="1246308174">
-    <w:abstractNumId w:val="11"/>
+  <w:num w:numId="20" w16cid:durableId="2042972934">
+    <w:abstractNumId w:val="21"/>
   </w:num>
-  <w:num w:numId="13" w16cid:durableId="2001496677">
-    <w:abstractNumId w:val="4"/>
+  <w:num w:numId="21" w16cid:durableId="156969398">
+    <w:abstractNumId w:val="17"/>
   </w:num>
-  <w:num w:numId="14" w16cid:durableId="283846998">
-    <w:abstractNumId w:val="12"/>
+  <w:num w:numId="22" w16cid:durableId="154421839">
+    <w:abstractNumId w:val="20"/>
   </w:num>
-  <w:num w:numId="15" w16cid:durableId="377167331">
-    <w:abstractNumId w:val="1"/>
+  <w:num w:numId="23" w16cid:durableId="1211307490">
+    <w:abstractNumId w:val="3"/>
+  </w:num>
+  <w:num w:numId="24" w16cid:durableId="1871457839">
+    <w:abstractNumId w:val="7"/>
   </w:num>
 </w:numbering>
 </file>
@@ -6431,6 +8960,7 @@
   <w:style w:type="paragraph" w:default="1" w:styleId="Normal">
     <w:name w:val="Normal"/>
     <w:qFormat/>
+    <w:rsid w:val="003E4E2C"/>
   </w:style>
   <w:style w:type="paragraph" w:styleId="Heading1">
     <w:name w:val="heading 1"/>

</xml_diff>

<commit_message>
add proj doc&User doc& assumptions and dependencies
</commit_message>
<xml_diff>
--- a/doc/task.docx
+++ b/doc/task.docx
@@ -6229,6 +6229,870 @@
     <w:p>
       <w:pPr>
         <w:rPr>
+          <w:sz w:val="28"/>
+          <w:szCs w:val="28"/>
+          <w:rtl/>
+          <w:lang w:bidi="ar-EG"/>
+        </w:rPr>
+      </w:pPr>
+    </w:p>
+    <w:p>
+      <w:pPr>
+        <w:rPr>
+          <w:b/>
+          <w:bCs/>
+          <w:sz w:val="40"/>
+          <w:szCs w:val="40"/>
+          <w:lang w:bidi="ar-EG"/>
+        </w:rPr>
+      </w:pPr>
+      <w:r>
+        <w:rPr>
+          <w:b/>
+          <w:bCs/>
+          <w:sz w:val="40"/>
+          <w:szCs w:val="40"/>
+          <w:lang w:bidi="ar-EG"/>
+        </w:rPr>
+        <w:t>2.6 Project Documentation</w:t>
+      </w:r>
+    </w:p>
+    <w:p>
+      <w:pPr>
+        <w:rPr>
+          <w:sz w:val="28"/>
+          <w:szCs w:val="28"/>
+          <w:lang w:bidi="ar-EG"/>
+        </w:rPr>
+      </w:pPr>
+      <w:r>
+        <w:rPr>
+          <w:sz w:val="28"/>
+          <w:szCs w:val="28"/>
+          <w:lang w:bidi="ar-EG"/>
+        </w:rPr>
+        <w:t xml:space="preserve">The </w:t>
+      </w:r>
+      <w:r>
+        <w:rPr>
+          <w:b/>
+          <w:bCs/>
+          <w:sz w:val="28"/>
+          <w:szCs w:val="28"/>
+          <w:lang w:bidi="ar-EG"/>
+        </w:rPr>
+        <w:t>Project Documentation</w:t>
+      </w:r>
+      <w:r>
+        <w:rPr>
+          <w:sz w:val="28"/>
+          <w:szCs w:val="28"/>
+          <w:lang w:bidi="ar-EG"/>
+        </w:rPr>
+        <w:t xml:space="preserve"> section provides details about the documents created by the development team throughout the </w:t>
+      </w:r>
+      <w:r>
+        <w:rPr>
+          <w:b/>
+          <w:bCs/>
+          <w:sz w:val="28"/>
+          <w:szCs w:val="28"/>
+          <w:lang w:bidi="ar-EG"/>
+        </w:rPr>
+        <w:t>Fit</w:t>
+      </w:r>
+      <w:r>
+        <w:rPr>
+          <w:rFonts w:hint="cs"/>
+          <w:b/>
+          <w:bCs/>
+          <w:sz w:val="28"/>
+          <w:szCs w:val="28"/>
+          <w:rtl/>
+          <w:lang w:bidi="ar-EG"/>
+        </w:rPr>
+        <w:t>-</w:t>
+      </w:r>
+      <w:r>
+        <w:rPr>
+          <w:b/>
+          <w:bCs/>
+          <w:sz w:val="28"/>
+          <w:szCs w:val="28"/>
+          <w:lang w:bidi="ar-EG"/>
+        </w:rPr>
+        <w:t>Track System</w:t>
+      </w:r>
+      <w:r>
+        <w:rPr>
+          <w:sz w:val="28"/>
+          <w:szCs w:val="28"/>
+          <w:lang w:bidi="ar-EG"/>
+        </w:rPr>
+        <w:t xml:space="preserve"> project.</w:t>
+      </w:r>
+      <w:r>
+        <w:rPr>
+          <w:sz w:val="28"/>
+          <w:szCs w:val="28"/>
+          <w:lang w:bidi="ar-EG"/>
+        </w:rPr>
+        <w:br/>
+        <w:t xml:space="preserve">It includes both the </w:t>
+      </w:r>
+      <w:r>
+        <w:rPr>
+          <w:b/>
+          <w:bCs/>
+          <w:sz w:val="28"/>
+          <w:szCs w:val="28"/>
+          <w:lang w:bidi="ar-EG"/>
+        </w:rPr>
+        <w:t>Project Charter</w:t>
+      </w:r>
+      <w:r>
+        <w:rPr>
+          <w:sz w:val="28"/>
+          <w:szCs w:val="28"/>
+          <w:lang w:bidi="ar-EG"/>
+        </w:rPr>
+        <w:t xml:space="preserve"> and the </w:t>
+      </w:r>
+      <w:r>
+        <w:rPr>
+          <w:b/>
+          <w:bCs/>
+          <w:sz w:val="28"/>
+          <w:szCs w:val="28"/>
+          <w:lang w:bidi="ar-EG"/>
+        </w:rPr>
+        <w:t>Project Proposal</w:t>
+      </w:r>
+      <w:r>
+        <w:rPr>
+          <w:sz w:val="28"/>
+          <w:szCs w:val="28"/>
+          <w:lang w:bidi="ar-EG"/>
+        </w:rPr>
+        <w:t xml:space="preserve"> documents.</w:t>
+      </w:r>
+    </w:p>
+    <w:p>
+      <w:pPr>
+        <w:numPr>
+          <w:ilvl w:val="0"/>
+          <w:numId w:val="27"/>
+        </w:numPr>
+        <w:rPr>
+          <w:sz w:val="28"/>
+          <w:szCs w:val="28"/>
+          <w:lang w:bidi="ar-EG"/>
+        </w:rPr>
+      </w:pPr>
+      <w:r>
+        <w:rPr>
+          <w:b/>
+          <w:bCs/>
+          <w:sz w:val="28"/>
+          <w:szCs w:val="28"/>
+          <w:lang w:bidi="ar-EG"/>
+        </w:rPr>
+        <w:t>Project Charter:</w:t>
+      </w:r>
+      <w:r>
+        <w:rPr>
+          <w:sz w:val="28"/>
+          <w:szCs w:val="28"/>
+          <w:lang w:bidi="ar-EG"/>
+        </w:rPr>
+        <w:br/>
+        <w:t>This document outlines the key objectives of the project, identifies the main stakeholders, and defines the problem statement. It also specifies the scope, timeline, and responsibilities of each team member involved in developing the Fit</w:t>
+      </w:r>
+      <w:r>
+        <w:rPr>
+          <w:rFonts w:hint="cs"/>
+          <w:sz w:val="28"/>
+          <w:szCs w:val="28"/>
+          <w:rtl/>
+          <w:lang w:bidi="ar-EG"/>
+        </w:rPr>
+        <w:t>-</w:t>
+      </w:r>
+      <w:r>
+        <w:rPr>
+          <w:sz w:val="28"/>
+          <w:szCs w:val="28"/>
+          <w:lang w:bidi="ar-EG"/>
+        </w:rPr>
+        <w:t>Track system.</w:t>
+      </w:r>
+    </w:p>
+    <w:p>
+      <w:pPr>
+        <w:numPr>
+          <w:ilvl w:val="0"/>
+          <w:numId w:val="27"/>
+        </w:numPr>
+        <w:rPr>
+          <w:sz w:val="28"/>
+          <w:szCs w:val="28"/>
+          <w:lang w:bidi="ar-EG"/>
+        </w:rPr>
+      </w:pPr>
+      <w:r>
+        <w:rPr>
+          <w:b/>
+          <w:bCs/>
+          <w:sz w:val="28"/>
+          <w:szCs w:val="28"/>
+          <w:lang w:bidi="ar-EG"/>
+        </w:rPr>
+        <w:t>Project Proposal:</w:t>
+      </w:r>
+      <w:r>
+        <w:rPr>
+          <w:sz w:val="28"/>
+          <w:szCs w:val="28"/>
+          <w:lang w:bidi="ar-EG"/>
+        </w:rPr>
+        <w:br/>
+        <w:t>The proposal explains the client’s requirements, the challenges identified in managing gyms and online coaching, and the system solutions designed to address these problems using the Fit</w:t>
+      </w:r>
+      <w:r>
+        <w:rPr>
+          <w:rFonts w:hint="cs"/>
+          <w:sz w:val="28"/>
+          <w:szCs w:val="28"/>
+          <w:rtl/>
+          <w:lang w:bidi="ar-EG"/>
+        </w:rPr>
+        <w:t>-</w:t>
+      </w:r>
+      <w:r>
+        <w:rPr>
+          <w:sz w:val="28"/>
+          <w:szCs w:val="28"/>
+          <w:lang w:bidi="ar-EG"/>
+        </w:rPr>
+        <w:t>Track platform.</w:t>
+      </w:r>
+    </w:p>
+    <w:p>
+      <w:pPr>
+        <w:rPr>
+          <w:sz w:val="28"/>
+          <w:szCs w:val="28"/>
+          <w:lang w:bidi="ar-EG"/>
+        </w:rPr>
+      </w:pPr>
+      <w:r>
+        <w:rPr>
+          <w:sz w:val="28"/>
+          <w:szCs w:val="28"/>
+          <w:lang w:bidi="ar-EG"/>
+        </w:rPr>
+        <w:pict w14:anchorId="57E4D485">
+          <v:rect id="_x0000_i1143" style="width:0;height:1.5pt" o:hralign="center" o:hrstd="t" o:hr="t" fillcolor="#a0a0a0" stroked="f"/>
+        </w:pict>
+      </w:r>
+    </w:p>
+    <w:p>
+      <w:pPr>
+        <w:rPr>
+          <w:b/>
+          <w:bCs/>
+          <w:sz w:val="40"/>
+          <w:szCs w:val="40"/>
+          <w:lang w:bidi="ar-EG"/>
+        </w:rPr>
+      </w:pPr>
+      <w:r>
+        <w:rPr>
+          <w:b/>
+          <w:bCs/>
+          <w:sz w:val="40"/>
+          <w:szCs w:val="40"/>
+          <w:lang w:bidi="ar-EG"/>
+        </w:rPr>
+        <w:t>2.7 User Documentation</w:t>
+      </w:r>
+    </w:p>
+    <w:p>
+      <w:pPr>
+        <w:rPr>
+          <w:sz w:val="28"/>
+          <w:szCs w:val="28"/>
+          <w:lang w:bidi="ar-EG"/>
+        </w:rPr>
+      </w:pPr>
+      <w:r>
+        <w:rPr>
+          <w:sz w:val="28"/>
+          <w:szCs w:val="28"/>
+          <w:lang w:bidi="ar-EG"/>
+        </w:rPr>
+        <w:t xml:space="preserve">A </w:t>
+      </w:r>
+      <w:r>
+        <w:rPr>
+          <w:b/>
+          <w:bCs/>
+          <w:sz w:val="28"/>
+          <w:szCs w:val="28"/>
+          <w:lang w:bidi="ar-EG"/>
+        </w:rPr>
+        <w:t>User Manual</w:t>
+      </w:r>
+      <w:r>
+        <w:rPr>
+          <w:sz w:val="28"/>
+          <w:szCs w:val="28"/>
+          <w:lang w:bidi="ar-EG"/>
+        </w:rPr>
+        <w:t xml:space="preserve"> will be provided to the client to clearly explain how to interact with the </w:t>
+      </w:r>
+      <w:r>
+        <w:rPr>
+          <w:b/>
+          <w:bCs/>
+          <w:sz w:val="28"/>
+          <w:szCs w:val="28"/>
+          <w:lang w:bidi="ar-EG"/>
+        </w:rPr>
+        <w:t>Fit</w:t>
+      </w:r>
+      <w:r>
+        <w:rPr>
+          <w:rFonts w:hint="cs"/>
+          <w:b/>
+          <w:bCs/>
+          <w:sz w:val="28"/>
+          <w:szCs w:val="28"/>
+          <w:rtl/>
+          <w:lang w:bidi="ar-EG"/>
+        </w:rPr>
+        <w:t>-</w:t>
+      </w:r>
+      <w:r>
+        <w:rPr>
+          <w:b/>
+          <w:bCs/>
+          <w:sz w:val="28"/>
+          <w:szCs w:val="28"/>
+          <w:lang w:bidi="ar-EG"/>
+        </w:rPr>
+        <w:t>Track System</w:t>
+      </w:r>
+      <w:r>
+        <w:rPr>
+          <w:sz w:val="28"/>
+          <w:szCs w:val="28"/>
+          <w:lang w:bidi="ar-EG"/>
+        </w:rPr>
+        <w:t>.</w:t>
+      </w:r>
+      <w:r>
+        <w:rPr>
+          <w:sz w:val="28"/>
+          <w:szCs w:val="28"/>
+          <w:lang w:bidi="ar-EG"/>
+        </w:rPr>
+        <w:br/>
+        <w:t>It will be written in simple, understandable language to hide the internal complexity of the software.</w:t>
+      </w:r>
+      <w:r>
+        <w:rPr>
+          <w:sz w:val="28"/>
+          <w:szCs w:val="28"/>
+          <w:lang w:bidi="ar-EG"/>
+        </w:rPr>
+        <w:br/>
+        <w:t>This documentation will include:</w:t>
+      </w:r>
+    </w:p>
+    <w:p>
+      <w:pPr>
+        <w:numPr>
+          <w:ilvl w:val="0"/>
+          <w:numId w:val="28"/>
+        </w:numPr>
+        <w:rPr>
+          <w:sz w:val="28"/>
+          <w:szCs w:val="28"/>
+          <w:lang w:bidi="ar-EG"/>
+        </w:rPr>
+      </w:pPr>
+      <w:r>
+        <w:rPr>
+          <w:sz w:val="28"/>
+          <w:szCs w:val="28"/>
+          <w:lang w:bidi="ar-EG"/>
+        </w:rPr>
+        <w:lastRenderedPageBreak/>
+        <w:t>Step-by-step instructions for system navigation.</w:t>
+      </w:r>
+    </w:p>
+    <w:p>
+      <w:pPr>
+        <w:numPr>
+          <w:ilvl w:val="0"/>
+          <w:numId w:val="28"/>
+        </w:numPr>
+        <w:rPr>
+          <w:sz w:val="28"/>
+          <w:szCs w:val="28"/>
+          <w:lang w:bidi="ar-EG"/>
+        </w:rPr>
+      </w:pPr>
+      <w:r>
+        <w:rPr>
+          <w:sz w:val="28"/>
+          <w:szCs w:val="28"/>
+          <w:lang w:bidi="ar-EG"/>
+        </w:rPr>
+        <w:t>Screenshots of important modules (dashboard, chatbot, store, etc.).</w:t>
+      </w:r>
+    </w:p>
+    <w:p>
+      <w:pPr>
+        <w:numPr>
+          <w:ilvl w:val="0"/>
+          <w:numId w:val="28"/>
+        </w:numPr>
+        <w:rPr>
+          <w:sz w:val="28"/>
+          <w:szCs w:val="28"/>
+          <w:lang w:bidi="ar-EG"/>
+        </w:rPr>
+      </w:pPr>
+      <w:r>
+        <w:rPr>
+          <w:sz w:val="28"/>
+          <w:szCs w:val="28"/>
+          <w:lang w:bidi="ar-EG"/>
+        </w:rPr>
+        <w:t>Guidance on troubleshooting and user support.</w:t>
+      </w:r>
+    </w:p>
+    <w:p>
+      <w:pPr>
+        <w:rPr>
+          <w:sz w:val="28"/>
+          <w:szCs w:val="28"/>
+          <w:lang w:bidi="ar-EG"/>
+        </w:rPr>
+      </w:pPr>
+      <w:r>
+        <w:rPr>
+          <w:sz w:val="28"/>
+          <w:szCs w:val="28"/>
+          <w:lang w:bidi="ar-EG"/>
+        </w:rPr>
+        <w:t xml:space="preserve">A </w:t>
+      </w:r>
+      <w:r>
+        <w:rPr>
+          <w:b/>
+          <w:bCs/>
+          <w:sz w:val="28"/>
+          <w:szCs w:val="28"/>
+          <w:lang w:bidi="ar-EG"/>
+        </w:rPr>
+        <w:t>digital copy (PDF)</w:t>
+      </w:r>
+      <w:r>
+        <w:rPr>
+          <w:sz w:val="28"/>
+          <w:szCs w:val="28"/>
+          <w:lang w:bidi="ar-EG"/>
+        </w:rPr>
+        <w:t xml:space="preserve"> will be provided, and a </w:t>
+      </w:r>
+      <w:r>
+        <w:rPr>
+          <w:b/>
+          <w:bCs/>
+          <w:sz w:val="28"/>
+          <w:szCs w:val="28"/>
+          <w:lang w:bidi="ar-EG"/>
+        </w:rPr>
+        <w:t>printed manual</w:t>
+      </w:r>
+      <w:r>
+        <w:rPr>
+          <w:sz w:val="28"/>
+          <w:szCs w:val="28"/>
+          <w:lang w:bidi="ar-EG"/>
+        </w:rPr>
+        <w:t xml:space="preserve"> can also be delivered along with the final deployment package.</w:t>
+      </w:r>
+    </w:p>
+    <w:p>
+      <w:pPr>
+        <w:rPr>
+          <w:sz w:val="28"/>
+          <w:szCs w:val="28"/>
+          <w:lang w:bidi="ar-EG"/>
+        </w:rPr>
+      </w:pPr>
+      <w:r>
+        <w:rPr>
+          <w:sz w:val="28"/>
+          <w:szCs w:val="28"/>
+          <w:lang w:bidi="ar-EG"/>
+        </w:rPr>
+        <w:pict w14:anchorId="00B9E4D0">
+          <v:rect id="_x0000_i1144" style="width:0;height:1.5pt" o:hralign="center" o:hrstd="t" o:hr="t" fillcolor="#a0a0a0" stroked="f"/>
+        </w:pict>
+      </w:r>
+    </w:p>
+    <w:p>
+      <w:pPr>
+        <w:rPr>
+          <w:b/>
+          <w:bCs/>
+          <w:sz w:val="40"/>
+          <w:szCs w:val="40"/>
+          <w:lang w:bidi="ar-EG"/>
+        </w:rPr>
+      </w:pPr>
+      <w:r>
+        <w:rPr>
+          <w:b/>
+          <w:bCs/>
+          <w:sz w:val="40"/>
+          <w:szCs w:val="40"/>
+          <w:lang w:bidi="ar-EG"/>
+        </w:rPr>
+        <w:t>2.8 Assumptions and Dependencies</w:t>
+      </w:r>
+    </w:p>
+    <w:p>
+      <w:pPr>
+        <w:rPr>
+          <w:sz w:val="28"/>
+          <w:szCs w:val="28"/>
+          <w:lang w:bidi="ar-EG"/>
+        </w:rPr>
+      </w:pPr>
+      <w:r>
+        <w:rPr>
+          <w:sz w:val="28"/>
+          <w:szCs w:val="28"/>
+          <w:lang w:bidi="ar-EG"/>
+        </w:rPr>
+        <w:t>During development, the following assumptions and dependencies were made:</w:t>
+      </w:r>
+    </w:p>
+    <w:p>
+      <w:pPr>
+        <w:numPr>
+          <w:ilvl w:val="0"/>
+          <w:numId w:val="29"/>
+        </w:numPr>
+        <w:rPr>
+          <w:sz w:val="28"/>
+          <w:szCs w:val="28"/>
+          <w:lang w:bidi="ar-EG"/>
+        </w:rPr>
+      </w:pPr>
+      <w:r>
+        <w:rPr>
+          <w:sz w:val="28"/>
+          <w:szCs w:val="28"/>
+          <w:lang w:bidi="ar-EG"/>
+        </w:rPr>
+        <w:t xml:space="preserve">It is assumed that the </w:t>
+      </w:r>
+      <w:r>
+        <w:rPr>
+          <w:b/>
+          <w:bCs/>
+          <w:sz w:val="28"/>
+          <w:szCs w:val="28"/>
+          <w:lang w:bidi="ar-EG"/>
+        </w:rPr>
+        <w:t>client will provide necessary hosting infrastructure</w:t>
+      </w:r>
+      <w:r>
+        <w:rPr>
+          <w:sz w:val="28"/>
+          <w:szCs w:val="28"/>
+          <w:lang w:bidi="ar-EG"/>
+        </w:rPr>
+        <w:t xml:space="preserve"> (server or cloud platform) for deployment.</w:t>
+      </w:r>
+    </w:p>
+    <w:p>
+      <w:pPr>
+        <w:numPr>
+          <w:ilvl w:val="0"/>
+          <w:numId w:val="29"/>
+        </w:numPr>
+        <w:rPr>
+          <w:sz w:val="28"/>
+          <w:szCs w:val="28"/>
+          <w:lang w:bidi="ar-EG"/>
+        </w:rPr>
+      </w:pPr>
+      <w:r>
+        <w:rPr>
+          <w:sz w:val="28"/>
+          <w:szCs w:val="28"/>
+          <w:lang w:bidi="ar-EG"/>
+        </w:rPr>
+        <w:t xml:space="preserve">The system will run smoothly on operating systems </w:t>
+      </w:r>
+      <w:r>
+        <w:rPr>
+          <w:b/>
+          <w:bCs/>
+          <w:sz w:val="28"/>
+          <w:szCs w:val="28"/>
+          <w:lang w:bidi="ar-EG"/>
+        </w:rPr>
+        <w:t>Windows 10+</w:t>
+      </w:r>
+      <w:r>
+        <w:rPr>
+          <w:sz w:val="28"/>
+          <w:szCs w:val="28"/>
+          <w:lang w:bidi="ar-EG"/>
+        </w:rPr>
+        <w:t xml:space="preserve">, </w:t>
+      </w:r>
+      <w:r>
+        <w:rPr>
+          <w:b/>
+          <w:bCs/>
+          <w:sz w:val="28"/>
+          <w:szCs w:val="28"/>
+          <w:lang w:bidi="ar-EG"/>
+        </w:rPr>
+        <w:t>Linux (Ubuntu 20.04+)</w:t>
+      </w:r>
+      <w:r>
+        <w:rPr>
+          <w:sz w:val="28"/>
+          <w:szCs w:val="28"/>
+          <w:lang w:bidi="ar-EG"/>
+        </w:rPr>
+        <w:t xml:space="preserve">, or </w:t>
+      </w:r>
+      <w:r>
+        <w:rPr>
+          <w:b/>
+          <w:bCs/>
+          <w:sz w:val="28"/>
+          <w:szCs w:val="28"/>
+          <w:lang w:bidi="ar-EG"/>
+        </w:rPr>
+        <w:t>macOS 11+</w:t>
+      </w:r>
+      <w:r>
+        <w:rPr>
+          <w:sz w:val="28"/>
+          <w:szCs w:val="28"/>
+          <w:lang w:bidi="ar-EG"/>
+        </w:rPr>
+        <w:t>.</w:t>
+      </w:r>
+    </w:p>
+    <w:p>
+      <w:pPr>
+        <w:numPr>
+          <w:ilvl w:val="0"/>
+          <w:numId w:val="29"/>
+        </w:numPr>
+        <w:rPr>
+          <w:sz w:val="28"/>
+          <w:szCs w:val="28"/>
+          <w:lang w:bidi="ar-EG"/>
+        </w:rPr>
+      </w:pPr>
+      <w:r>
+        <w:rPr>
+          <w:sz w:val="28"/>
+          <w:szCs w:val="28"/>
+          <w:lang w:bidi="ar-EG"/>
+        </w:rPr>
+        <w:t xml:space="preserve">The client will maintain an </w:t>
+      </w:r>
+      <w:r>
+        <w:rPr>
+          <w:b/>
+          <w:bCs/>
+          <w:sz w:val="28"/>
+          <w:szCs w:val="28"/>
+          <w:lang w:bidi="ar-EG"/>
+        </w:rPr>
+        <w:t>active internet connection</w:t>
+      </w:r>
+      <w:r>
+        <w:rPr>
+          <w:sz w:val="28"/>
+          <w:szCs w:val="28"/>
+          <w:lang w:bidi="ar-EG"/>
+        </w:rPr>
+        <w:t xml:space="preserve"> to support cloud services, API integration, and AI chatbot functionality.</w:t>
+      </w:r>
+    </w:p>
+    <w:p>
+      <w:pPr>
+        <w:numPr>
+          <w:ilvl w:val="0"/>
+          <w:numId w:val="29"/>
+        </w:numPr>
+        <w:rPr>
+          <w:sz w:val="28"/>
+          <w:szCs w:val="28"/>
+          <w:lang w:bidi="ar-EG"/>
+        </w:rPr>
+      </w:pPr>
+      <w:r>
+        <w:rPr>
+          <w:sz w:val="28"/>
+          <w:szCs w:val="28"/>
+          <w:lang w:bidi="ar-EG"/>
+        </w:rPr>
+        <w:t xml:space="preserve">The project depends on third-party services such as </w:t>
+      </w:r>
+      <w:r>
+        <w:rPr>
+          <w:b/>
+          <w:bCs/>
+          <w:sz w:val="28"/>
+          <w:szCs w:val="28"/>
+          <w:lang w:bidi="ar-EG"/>
+        </w:rPr>
+        <w:t>OpenAI API</w:t>
+      </w:r>
+      <w:r>
+        <w:rPr>
+          <w:sz w:val="28"/>
+          <w:szCs w:val="28"/>
+          <w:lang w:bidi="ar-EG"/>
+        </w:rPr>
+        <w:t xml:space="preserve"> and </w:t>
+      </w:r>
+      <w:r>
+        <w:rPr>
+          <w:b/>
+          <w:bCs/>
+          <w:sz w:val="28"/>
+          <w:szCs w:val="28"/>
+          <w:lang w:bidi="ar-EG"/>
+        </w:rPr>
+        <w:t>payment gateways (Stripe or PayPal)</w:t>
+      </w:r>
+      <w:r>
+        <w:rPr>
+          <w:sz w:val="28"/>
+          <w:szCs w:val="28"/>
+          <w:lang w:bidi="ar-EG"/>
+        </w:rPr>
+        <w:t>. Any service downtime may affect performance temporarily.</w:t>
+      </w:r>
+    </w:p>
+    <w:p>
+      <w:pPr>
+        <w:numPr>
+          <w:ilvl w:val="0"/>
+          <w:numId w:val="29"/>
+        </w:numPr>
+        <w:rPr>
+          <w:sz w:val="28"/>
+          <w:szCs w:val="28"/>
+          <w:lang w:bidi="ar-EG"/>
+        </w:rPr>
+      </w:pPr>
+      <w:r>
+        <w:rPr>
+          <w:sz w:val="28"/>
+          <w:szCs w:val="28"/>
+          <w:lang w:bidi="ar-EG"/>
+        </w:rPr>
+        <w:t xml:space="preserve">It is assumed that the </w:t>
+      </w:r>
+      <w:r>
+        <w:rPr>
+          <w:b/>
+          <w:bCs/>
+          <w:sz w:val="28"/>
+          <w:szCs w:val="28"/>
+          <w:lang w:bidi="ar-EG"/>
+        </w:rPr>
+        <w:t>client will not change major system requirements</w:t>
+      </w:r>
+      <w:r>
+        <w:rPr>
+          <w:sz w:val="28"/>
+          <w:szCs w:val="28"/>
+          <w:lang w:bidi="ar-EG"/>
+        </w:rPr>
+        <w:t xml:space="preserve"> during the later development stages.</w:t>
+      </w:r>
+    </w:p>
+    <w:p>
+      <w:pPr>
+        <w:numPr>
+          <w:ilvl w:val="0"/>
+          <w:numId w:val="29"/>
+        </w:numPr>
+        <w:rPr>
+          <w:sz w:val="28"/>
+          <w:szCs w:val="28"/>
+          <w:lang w:bidi="ar-EG"/>
+        </w:rPr>
+      </w:pPr>
+      <w:r>
+        <w:rPr>
+          <w:sz w:val="28"/>
+          <w:szCs w:val="28"/>
+          <w:lang w:bidi="ar-EG"/>
+        </w:rPr>
+        <w:t xml:space="preserve">Future system extensions (e.g., mobile </w:t>
+      </w:r>
+      <w:proofErr w:type="gramStart"/>
+      <w:r>
+        <w:rPr>
+          <w:sz w:val="28"/>
+          <w:szCs w:val="28"/>
+          <w:lang w:bidi="ar-EG"/>
+        </w:rPr>
+        <w:t>app</w:t>
+      </w:r>
+      <w:proofErr w:type="gramEnd"/>
+      <w:r>
+        <w:rPr>
+          <w:sz w:val="28"/>
+          <w:szCs w:val="28"/>
+          <w:lang w:bidi="ar-EG"/>
+        </w:rPr>
+        <w:t xml:space="preserve"> or extra analytics) will depend on </w:t>
+      </w:r>
+      <w:r>
+        <w:rPr>
+          <w:b/>
+          <w:bCs/>
+          <w:sz w:val="28"/>
+          <w:szCs w:val="28"/>
+          <w:lang w:bidi="ar-EG"/>
+        </w:rPr>
+        <w:t>time and budget availability</w:t>
+      </w:r>
+      <w:r>
+        <w:rPr>
+          <w:sz w:val="28"/>
+          <w:szCs w:val="28"/>
+          <w:lang w:bidi="ar-EG"/>
+        </w:rPr>
+        <w:t>.</w:t>
+      </w:r>
+    </w:p>
+    <w:p>
+      <w:pPr>
+        <w:rPr>
           <w:rFonts w:hint="cs"/>
           <w:sz w:val="28"/>
           <w:szCs w:val="28"/>
@@ -6959,6 +7823,155 @@
     </w:lvl>
   </w:abstractNum>
   <w:abstractNum w:abstractNumId="5" w15:restartNumberingAfterBreak="0">
+    <w:nsid w:val="123956D5"/>
+    <w:multiLevelType w:val="multilevel"/>
+    <w:tmpl w:val="F76459FE"/>
+    <w:lvl w:ilvl="0">
+      <w:start w:val="1"/>
+      <w:numFmt w:val="bullet"/>
+      <w:lvlText w:val=""/>
+      <w:lvlJc w:val="left"/>
+      <w:pPr>
+        <w:tabs>
+          <w:tab w:val="num" w:pos="720"/>
+        </w:tabs>
+        <w:ind w:left="720" w:hanging="360"/>
+      </w:pPr>
+      <w:rPr>
+        <w:rFonts w:ascii="Symbol" w:hAnsi="Symbol" w:hint="default"/>
+        <w:sz w:val="20"/>
+      </w:rPr>
+    </w:lvl>
+    <w:lvl w:ilvl="1" w:tentative="1">
+      <w:start w:val="1"/>
+      <w:numFmt w:val="bullet"/>
+      <w:lvlText w:val="o"/>
+      <w:lvlJc w:val="left"/>
+      <w:pPr>
+        <w:tabs>
+          <w:tab w:val="num" w:pos="1440"/>
+        </w:tabs>
+        <w:ind w:left="1440" w:hanging="360"/>
+      </w:pPr>
+      <w:rPr>
+        <w:rFonts w:ascii="Courier New" w:hAnsi="Courier New" w:hint="default"/>
+        <w:sz w:val="20"/>
+      </w:rPr>
+    </w:lvl>
+    <w:lvl w:ilvl="2" w:tentative="1">
+      <w:start w:val="1"/>
+      <w:numFmt w:val="bullet"/>
+      <w:lvlText w:val=""/>
+      <w:lvlJc w:val="left"/>
+      <w:pPr>
+        <w:tabs>
+          <w:tab w:val="num" w:pos="2160"/>
+        </w:tabs>
+        <w:ind w:left="2160" w:hanging="360"/>
+      </w:pPr>
+      <w:rPr>
+        <w:rFonts w:ascii="Wingdings" w:hAnsi="Wingdings" w:hint="default"/>
+        <w:sz w:val="20"/>
+      </w:rPr>
+    </w:lvl>
+    <w:lvl w:ilvl="3" w:tentative="1">
+      <w:start w:val="1"/>
+      <w:numFmt w:val="bullet"/>
+      <w:lvlText w:val=""/>
+      <w:lvlJc w:val="left"/>
+      <w:pPr>
+        <w:tabs>
+          <w:tab w:val="num" w:pos="2880"/>
+        </w:tabs>
+        <w:ind w:left="2880" w:hanging="360"/>
+      </w:pPr>
+      <w:rPr>
+        <w:rFonts w:ascii="Wingdings" w:hAnsi="Wingdings" w:hint="default"/>
+        <w:sz w:val="20"/>
+      </w:rPr>
+    </w:lvl>
+    <w:lvl w:ilvl="4" w:tentative="1">
+      <w:start w:val="1"/>
+      <w:numFmt w:val="bullet"/>
+      <w:lvlText w:val=""/>
+      <w:lvlJc w:val="left"/>
+      <w:pPr>
+        <w:tabs>
+          <w:tab w:val="num" w:pos="3600"/>
+        </w:tabs>
+        <w:ind w:left="3600" w:hanging="360"/>
+      </w:pPr>
+      <w:rPr>
+        <w:rFonts w:ascii="Wingdings" w:hAnsi="Wingdings" w:hint="default"/>
+        <w:sz w:val="20"/>
+      </w:rPr>
+    </w:lvl>
+    <w:lvl w:ilvl="5" w:tentative="1">
+      <w:start w:val="1"/>
+      <w:numFmt w:val="bullet"/>
+      <w:lvlText w:val=""/>
+      <w:lvlJc w:val="left"/>
+      <w:pPr>
+        <w:tabs>
+          <w:tab w:val="num" w:pos="4320"/>
+        </w:tabs>
+        <w:ind w:left="4320" w:hanging="360"/>
+      </w:pPr>
+      <w:rPr>
+        <w:rFonts w:ascii="Wingdings" w:hAnsi="Wingdings" w:hint="default"/>
+        <w:sz w:val="20"/>
+      </w:rPr>
+    </w:lvl>
+    <w:lvl w:ilvl="6" w:tentative="1">
+      <w:start w:val="1"/>
+      <w:numFmt w:val="bullet"/>
+      <w:lvlText w:val=""/>
+      <w:lvlJc w:val="left"/>
+      <w:pPr>
+        <w:tabs>
+          <w:tab w:val="num" w:pos="5040"/>
+        </w:tabs>
+        <w:ind w:left="5040" w:hanging="360"/>
+      </w:pPr>
+      <w:rPr>
+        <w:rFonts w:ascii="Wingdings" w:hAnsi="Wingdings" w:hint="default"/>
+        <w:sz w:val="20"/>
+      </w:rPr>
+    </w:lvl>
+    <w:lvl w:ilvl="7" w:tentative="1">
+      <w:start w:val="1"/>
+      <w:numFmt w:val="bullet"/>
+      <w:lvlText w:val=""/>
+      <w:lvlJc w:val="left"/>
+      <w:pPr>
+        <w:tabs>
+          <w:tab w:val="num" w:pos="5760"/>
+        </w:tabs>
+        <w:ind w:left="5760" w:hanging="360"/>
+      </w:pPr>
+      <w:rPr>
+        <w:rFonts w:ascii="Wingdings" w:hAnsi="Wingdings" w:hint="default"/>
+        <w:sz w:val="20"/>
+      </w:rPr>
+    </w:lvl>
+    <w:lvl w:ilvl="8" w:tentative="1">
+      <w:start w:val="1"/>
+      <w:numFmt w:val="bullet"/>
+      <w:lvlText w:val=""/>
+      <w:lvlJc w:val="left"/>
+      <w:pPr>
+        <w:tabs>
+          <w:tab w:val="num" w:pos="6480"/>
+        </w:tabs>
+        <w:ind w:left="6480" w:hanging="360"/>
+      </w:pPr>
+      <w:rPr>
+        <w:rFonts w:ascii="Wingdings" w:hAnsi="Wingdings" w:hint="default"/>
+        <w:sz w:val="20"/>
+      </w:rPr>
+    </w:lvl>
+  </w:abstractNum>
+  <w:abstractNum w:abstractNumId="6" w15:restartNumberingAfterBreak="0">
     <w:nsid w:val="128654FC"/>
     <w:multiLevelType w:val="multilevel"/>
     <w:tmpl w:val="3B3A77CC"/>
@@ -7107,7 +8120,7 @@
       </w:rPr>
     </w:lvl>
   </w:abstractNum>
-  <w:abstractNum w:abstractNumId="6" w15:restartNumberingAfterBreak="0">
+  <w:abstractNum w:abstractNumId="7" w15:restartNumberingAfterBreak="0">
     <w:nsid w:val="17DB689E"/>
     <w:multiLevelType w:val="multilevel"/>
     <w:tmpl w:val="57DAD6FC"/>
@@ -7228,7 +8241,7 @@
       </w:rPr>
     </w:lvl>
   </w:abstractNum>
-  <w:abstractNum w:abstractNumId="7" w15:restartNumberingAfterBreak="0">
+  <w:abstractNum w:abstractNumId="8" w15:restartNumberingAfterBreak="0">
     <w:nsid w:val="194C3A5F"/>
     <w:multiLevelType w:val="multilevel"/>
     <w:tmpl w:val="0B4A846E"/>
@@ -7377,7 +8390,7 @@
       </w:rPr>
     </w:lvl>
   </w:abstractNum>
-  <w:abstractNum w:abstractNumId="8" w15:restartNumberingAfterBreak="0">
+  <w:abstractNum w:abstractNumId="9" w15:restartNumberingAfterBreak="0">
     <w:nsid w:val="21BE270C"/>
     <w:multiLevelType w:val="multilevel"/>
     <w:tmpl w:val="691E41C6"/>
@@ -7526,7 +8539,7 @@
       </w:rPr>
     </w:lvl>
   </w:abstractNum>
-  <w:abstractNum w:abstractNumId="9" w15:restartNumberingAfterBreak="0">
+  <w:abstractNum w:abstractNumId="10" w15:restartNumberingAfterBreak="0">
     <w:nsid w:val="22512D99"/>
     <w:multiLevelType w:val="multilevel"/>
     <w:tmpl w:val="DF961E8A"/>
@@ -7675,7 +8688,7 @@
       </w:rPr>
     </w:lvl>
   </w:abstractNum>
-  <w:abstractNum w:abstractNumId="10" w15:restartNumberingAfterBreak="0">
+  <w:abstractNum w:abstractNumId="11" w15:restartNumberingAfterBreak="0">
     <w:nsid w:val="26EB4456"/>
     <w:multiLevelType w:val="multilevel"/>
     <w:tmpl w:val="A64AE48A"/>
@@ -7824,7 +8837,120 @@
       </w:rPr>
     </w:lvl>
   </w:abstractNum>
-  <w:abstractNum w:abstractNumId="11" w15:restartNumberingAfterBreak="0">
+  <w:abstractNum w:abstractNumId="12" w15:restartNumberingAfterBreak="0">
+    <w:nsid w:val="28272C08"/>
+    <w:multiLevelType w:val="multilevel"/>
+    <w:tmpl w:val="AF861D66"/>
+    <w:lvl w:ilvl="0">
+      <w:start w:val="1"/>
+      <w:numFmt w:val="decimal"/>
+      <w:lvlText w:val="%1."/>
+      <w:lvlJc w:val="left"/>
+      <w:pPr>
+        <w:tabs>
+          <w:tab w:val="num" w:pos="720"/>
+        </w:tabs>
+        <w:ind w:left="720" w:hanging="360"/>
+      </w:pPr>
+    </w:lvl>
+    <w:lvl w:ilvl="1" w:tentative="1">
+      <w:start w:val="1"/>
+      <w:numFmt w:val="decimal"/>
+      <w:lvlText w:val="%2."/>
+      <w:lvlJc w:val="left"/>
+      <w:pPr>
+        <w:tabs>
+          <w:tab w:val="num" w:pos="1440"/>
+        </w:tabs>
+        <w:ind w:left="1440" w:hanging="360"/>
+      </w:pPr>
+    </w:lvl>
+    <w:lvl w:ilvl="2" w:tentative="1">
+      <w:start w:val="1"/>
+      <w:numFmt w:val="decimal"/>
+      <w:lvlText w:val="%3."/>
+      <w:lvlJc w:val="left"/>
+      <w:pPr>
+        <w:tabs>
+          <w:tab w:val="num" w:pos="2160"/>
+        </w:tabs>
+        <w:ind w:left="2160" w:hanging="360"/>
+      </w:pPr>
+    </w:lvl>
+    <w:lvl w:ilvl="3" w:tentative="1">
+      <w:start w:val="1"/>
+      <w:numFmt w:val="decimal"/>
+      <w:lvlText w:val="%4."/>
+      <w:lvlJc w:val="left"/>
+      <w:pPr>
+        <w:tabs>
+          <w:tab w:val="num" w:pos="2880"/>
+        </w:tabs>
+        <w:ind w:left="2880" w:hanging="360"/>
+      </w:pPr>
+    </w:lvl>
+    <w:lvl w:ilvl="4" w:tentative="1">
+      <w:start w:val="1"/>
+      <w:numFmt w:val="decimal"/>
+      <w:lvlText w:val="%5."/>
+      <w:lvlJc w:val="left"/>
+      <w:pPr>
+        <w:tabs>
+          <w:tab w:val="num" w:pos="3600"/>
+        </w:tabs>
+        <w:ind w:left="3600" w:hanging="360"/>
+      </w:pPr>
+    </w:lvl>
+    <w:lvl w:ilvl="5" w:tentative="1">
+      <w:start w:val="1"/>
+      <w:numFmt w:val="decimal"/>
+      <w:lvlText w:val="%6."/>
+      <w:lvlJc w:val="left"/>
+      <w:pPr>
+        <w:tabs>
+          <w:tab w:val="num" w:pos="4320"/>
+        </w:tabs>
+        <w:ind w:left="4320" w:hanging="360"/>
+      </w:pPr>
+    </w:lvl>
+    <w:lvl w:ilvl="6" w:tentative="1">
+      <w:start w:val="1"/>
+      <w:numFmt w:val="decimal"/>
+      <w:lvlText w:val="%7."/>
+      <w:lvlJc w:val="left"/>
+      <w:pPr>
+        <w:tabs>
+          <w:tab w:val="num" w:pos="5040"/>
+        </w:tabs>
+        <w:ind w:left="5040" w:hanging="360"/>
+      </w:pPr>
+    </w:lvl>
+    <w:lvl w:ilvl="7" w:tentative="1">
+      <w:start w:val="1"/>
+      <w:numFmt w:val="decimal"/>
+      <w:lvlText w:val="%8."/>
+      <w:lvlJc w:val="left"/>
+      <w:pPr>
+        <w:tabs>
+          <w:tab w:val="num" w:pos="5760"/>
+        </w:tabs>
+        <w:ind w:left="5760" w:hanging="360"/>
+      </w:pPr>
+    </w:lvl>
+    <w:lvl w:ilvl="8" w:tentative="1">
+      <w:start w:val="1"/>
+      <w:numFmt w:val="decimal"/>
+      <w:lvlText w:val="%9."/>
+      <w:lvlJc w:val="left"/>
+      <w:pPr>
+        <w:tabs>
+          <w:tab w:val="num" w:pos="6480"/>
+        </w:tabs>
+        <w:ind w:left="6480" w:hanging="360"/>
+      </w:pPr>
+    </w:lvl>
+  </w:abstractNum>
+  <w:abstractNum w:abstractNumId="13" w15:restartNumberingAfterBreak="0">
     <w:nsid w:val="2BF048D8"/>
     <w:multiLevelType w:val="multilevel"/>
     <w:tmpl w:val="6FD4945A"/>
@@ -7973,7 +9099,156 @@
       </w:rPr>
     </w:lvl>
   </w:abstractNum>
-  <w:abstractNum w:abstractNumId="12" w15:restartNumberingAfterBreak="0">
+  <w:abstractNum w:abstractNumId="14" w15:restartNumberingAfterBreak="0">
+    <w:nsid w:val="2E4A7E5C"/>
+    <w:multiLevelType w:val="multilevel"/>
+    <w:tmpl w:val="E048CCC0"/>
+    <w:lvl w:ilvl="0">
+      <w:start w:val="1"/>
+      <w:numFmt w:val="bullet"/>
+      <w:lvlText w:val=""/>
+      <w:lvlJc w:val="left"/>
+      <w:pPr>
+        <w:tabs>
+          <w:tab w:val="num" w:pos="720"/>
+        </w:tabs>
+        <w:ind w:left="720" w:hanging="360"/>
+      </w:pPr>
+      <w:rPr>
+        <w:rFonts w:ascii="Symbol" w:hAnsi="Symbol" w:hint="default"/>
+        <w:sz w:val="20"/>
+      </w:rPr>
+    </w:lvl>
+    <w:lvl w:ilvl="1" w:tentative="1">
+      <w:start w:val="1"/>
+      <w:numFmt w:val="bullet"/>
+      <w:lvlText w:val="o"/>
+      <w:lvlJc w:val="left"/>
+      <w:pPr>
+        <w:tabs>
+          <w:tab w:val="num" w:pos="1440"/>
+        </w:tabs>
+        <w:ind w:left="1440" w:hanging="360"/>
+      </w:pPr>
+      <w:rPr>
+        <w:rFonts w:ascii="Courier New" w:hAnsi="Courier New" w:hint="default"/>
+        <w:sz w:val="20"/>
+      </w:rPr>
+    </w:lvl>
+    <w:lvl w:ilvl="2" w:tentative="1">
+      <w:start w:val="1"/>
+      <w:numFmt w:val="bullet"/>
+      <w:lvlText w:val=""/>
+      <w:lvlJc w:val="left"/>
+      <w:pPr>
+        <w:tabs>
+          <w:tab w:val="num" w:pos="2160"/>
+        </w:tabs>
+        <w:ind w:left="2160" w:hanging="360"/>
+      </w:pPr>
+      <w:rPr>
+        <w:rFonts w:ascii="Wingdings" w:hAnsi="Wingdings" w:hint="default"/>
+        <w:sz w:val="20"/>
+      </w:rPr>
+    </w:lvl>
+    <w:lvl w:ilvl="3" w:tentative="1">
+      <w:start w:val="1"/>
+      <w:numFmt w:val="bullet"/>
+      <w:lvlText w:val=""/>
+      <w:lvlJc w:val="left"/>
+      <w:pPr>
+        <w:tabs>
+          <w:tab w:val="num" w:pos="2880"/>
+        </w:tabs>
+        <w:ind w:left="2880" w:hanging="360"/>
+      </w:pPr>
+      <w:rPr>
+        <w:rFonts w:ascii="Wingdings" w:hAnsi="Wingdings" w:hint="default"/>
+        <w:sz w:val="20"/>
+      </w:rPr>
+    </w:lvl>
+    <w:lvl w:ilvl="4" w:tentative="1">
+      <w:start w:val="1"/>
+      <w:numFmt w:val="bullet"/>
+      <w:lvlText w:val=""/>
+      <w:lvlJc w:val="left"/>
+      <w:pPr>
+        <w:tabs>
+          <w:tab w:val="num" w:pos="3600"/>
+        </w:tabs>
+        <w:ind w:left="3600" w:hanging="360"/>
+      </w:pPr>
+      <w:rPr>
+        <w:rFonts w:ascii="Wingdings" w:hAnsi="Wingdings" w:hint="default"/>
+        <w:sz w:val="20"/>
+      </w:rPr>
+    </w:lvl>
+    <w:lvl w:ilvl="5" w:tentative="1">
+      <w:start w:val="1"/>
+      <w:numFmt w:val="bullet"/>
+      <w:lvlText w:val=""/>
+      <w:lvlJc w:val="left"/>
+      <w:pPr>
+        <w:tabs>
+          <w:tab w:val="num" w:pos="4320"/>
+        </w:tabs>
+        <w:ind w:left="4320" w:hanging="360"/>
+      </w:pPr>
+      <w:rPr>
+        <w:rFonts w:ascii="Wingdings" w:hAnsi="Wingdings" w:hint="default"/>
+        <w:sz w:val="20"/>
+      </w:rPr>
+    </w:lvl>
+    <w:lvl w:ilvl="6" w:tentative="1">
+      <w:start w:val="1"/>
+      <w:numFmt w:val="bullet"/>
+      <w:lvlText w:val=""/>
+      <w:lvlJc w:val="left"/>
+      <w:pPr>
+        <w:tabs>
+          <w:tab w:val="num" w:pos="5040"/>
+        </w:tabs>
+        <w:ind w:left="5040" w:hanging="360"/>
+      </w:pPr>
+      <w:rPr>
+        <w:rFonts w:ascii="Wingdings" w:hAnsi="Wingdings" w:hint="default"/>
+        <w:sz w:val="20"/>
+      </w:rPr>
+    </w:lvl>
+    <w:lvl w:ilvl="7" w:tentative="1">
+      <w:start w:val="1"/>
+      <w:numFmt w:val="bullet"/>
+      <w:lvlText w:val=""/>
+      <w:lvlJc w:val="left"/>
+      <w:pPr>
+        <w:tabs>
+          <w:tab w:val="num" w:pos="5760"/>
+        </w:tabs>
+        <w:ind w:left="5760" w:hanging="360"/>
+      </w:pPr>
+      <w:rPr>
+        <w:rFonts w:ascii="Wingdings" w:hAnsi="Wingdings" w:hint="default"/>
+        <w:sz w:val="20"/>
+      </w:rPr>
+    </w:lvl>
+    <w:lvl w:ilvl="8" w:tentative="1">
+      <w:start w:val="1"/>
+      <w:numFmt w:val="bullet"/>
+      <w:lvlText w:val=""/>
+      <w:lvlJc w:val="left"/>
+      <w:pPr>
+        <w:tabs>
+          <w:tab w:val="num" w:pos="6480"/>
+        </w:tabs>
+        <w:ind w:left="6480" w:hanging="360"/>
+      </w:pPr>
+      <w:rPr>
+        <w:rFonts w:ascii="Wingdings" w:hAnsi="Wingdings" w:hint="default"/>
+        <w:sz w:val="20"/>
+      </w:rPr>
+    </w:lvl>
+  </w:abstractNum>
+  <w:abstractNum w:abstractNumId="15" w15:restartNumberingAfterBreak="0">
     <w:nsid w:val="3F18494B"/>
     <w:multiLevelType w:val="hybridMultilevel"/>
     <w:tmpl w:val="A68CD09E"/>
@@ -8062,7 +9337,7 @@
       </w:pPr>
     </w:lvl>
   </w:abstractNum>
-  <w:abstractNum w:abstractNumId="13" w15:restartNumberingAfterBreak="0">
+  <w:abstractNum w:abstractNumId="16" w15:restartNumberingAfterBreak="0">
     <w:nsid w:val="3FBB2526"/>
     <w:multiLevelType w:val="multilevel"/>
     <w:tmpl w:val="AD2ADADC"/>
@@ -8211,7 +9486,7 @@
       </w:rPr>
     </w:lvl>
   </w:abstractNum>
-  <w:abstractNum w:abstractNumId="14" w15:restartNumberingAfterBreak="0">
+  <w:abstractNum w:abstractNumId="17" w15:restartNumberingAfterBreak="0">
     <w:nsid w:val="558E6BC9"/>
     <w:multiLevelType w:val="multilevel"/>
     <w:tmpl w:val="90BAC220"/>
@@ -8360,7 +9635,7 @@
       </w:rPr>
     </w:lvl>
   </w:abstractNum>
-  <w:abstractNum w:abstractNumId="15" w15:restartNumberingAfterBreak="0">
+  <w:abstractNum w:abstractNumId="18" w15:restartNumberingAfterBreak="0">
     <w:nsid w:val="5645566A"/>
     <w:multiLevelType w:val="multilevel"/>
     <w:tmpl w:val="BBF63E64"/>
@@ -8509,7 +9784,7 @@
       </w:rPr>
     </w:lvl>
   </w:abstractNum>
-  <w:abstractNum w:abstractNumId="16" w15:restartNumberingAfterBreak="0">
+  <w:abstractNum w:abstractNumId="19" w15:restartNumberingAfterBreak="0">
     <w:nsid w:val="56AE1955"/>
     <w:multiLevelType w:val="multilevel"/>
     <w:tmpl w:val="120A6B14"/>
@@ -8658,7 +9933,7 @@
       </w:rPr>
     </w:lvl>
   </w:abstractNum>
-  <w:abstractNum w:abstractNumId="17" w15:restartNumberingAfterBreak="0">
+  <w:abstractNum w:abstractNumId="20" w15:restartNumberingAfterBreak="0">
     <w:nsid w:val="578A0129"/>
     <w:multiLevelType w:val="multilevel"/>
     <w:tmpl w:val="54F47686"/>
@@ -8807,7 +10082,7 @@
       </w:rPr>
     </w:lvl>
   </w:abstractNum>
-  <w:abstractNum w:abstractNumId="18" w15:restartNumberingAfterBreak="0">
+  <w:abstractNum w:abstractNumId="21" w15:restartNumberingAfterBreak="0">
     <w:nsid w:val="5D997290"/>
     <w:multiLevelType w:val="multilevel"/>
     <w:tmpl w:val="AD5ACC24"/>
@@ -8956,7 +10231,7 @@
       </w:rPr>
     </w:lvl>
   </w:abstractNum>
-  <w:abstractNum w:abstractNumId="19" w15:restartNumberingAfterBreak="0">
+  <w:abstractNum w:abstractNumId="22" w15:restartNumberingAfterBreak="0">
     <w:nsid w:val="60445027"/>
     <w:multiLevelType w:val="multilevel"/>
     <w:tmpl w:val="4CF6E552"/>
@@ -9105,7 +10380,7 @@
       </w:rPr>
     </w:lvl>
   </w:abstractNum>
-  <w:abstractNum w:abstractNumId="20" w15:restartNumberingAfterBreak="0">
+  <w:abstractNum w:abstractNumId="23" w15:restartNumberingAfterBreak="0">
     <w:nsid w:val="6129322E"/>
     <w:multiLevelType w:val="multilevel"/>
     <w:tmpl w:val="7F6CD5E6"/>
@@ -9222,7 +10497,7 @@
       </w:pPr>
     </w:lvl>
   </w:abstractNum>
-  <w:abstractNum w:abstractNumId="21" w15:restartNumberingAfterBreak="0">
+  <w:abstractNum w:abstractNumId="24" w15:restartNumberingAfterBreak="0">
     <w:nsid w:val="6B642698"/>
     <w:multiLevelType w:val="multilevel"/>
     <w:tmpl w:val="BA70F120"/>
@@ -9371,7 +10646,7 @@
       </w:rPr>
     </w:lvl>
   </w:abstractNum>
-  <w:abstractNum w:abstractNumId="22" w15:restartNumberingAfterBreak="0">
+  <w:abstractNum w:abstractNumId="25" w15:restartNumberingAfterBreak="0">
     <w:nsid w:val="6C0011F8"/>
     <w:multiLevelType w:val="multilevel"/>
     <w:tmpl w:val="379232E6"/>
@@ -9520,7 +10795,7 @@
       </w:rPr>
     </w:lvl>
   </w:abstractNum>
-  <w:abstractNum w:abstractNumId="23" w15:restartNumberingAfterBreak="0">
+  <w:abstractNum w:abstractNumId="26" w15:restartNumberingAfterBreak="0">
     <w:nsid w:val="6EDE19B7"/>
     <w:multiLevelType w:val="multilevel"/>
     <w:tmpl w:val="9410929C"/>
@@ -9669,7 +10944,7 @@
       </w:rPr>
     </w:lvl>
   </w:abstractNum>
-  <w:abstractNum w:abstractNumId="24" w15:restartNumberingAfterBreak="0">
+  <w:abstractNum w:abstractNumId="27" w15:restartNumberingAfterBreak="0">
     <w:nsid w:val="6FFD0680"/>
     <w:multiLevelType w:val="multilevel"/>
     <w:tmpl w:val="AF724A96"/>
@@ -9815,7 +11090,7 @@
       </w:rPr>
     </w:lvl>
   </w:abstractNum>
-  <w:abstractNum w:abstractNumId="25" w15:restartNumberingAfterBreak="0">
+  <w:abstractNum w:abstractNumId="28" w15:restartNumberingAfterBreak="0">
     <w:nsid w:val="75877FAB"/>
     <w:multiLevelType w:val="multilevel"/>
     <w:tmpl w:val="3C8048E8"/>
@@ -9929,46 +11204,46 @@
     </w:lvl>
   </w:abstractNum>
   <w:num w:numId="1" w16cid:durableId="2010866847">
-    <w:abstractNumId w:val="6"/>
+    <w:abstractNumId w:val="7"/>
   </w:num>
   <w:num w:numId="2" w16cid:durableId="388696275">
     <w:abstractNumId w:val="1"/>
   </w:num>
   <w:num w:numId="3" w16cid:durableId="1559586336">
+    <w:abstractNumId w:val="16"/>
+  </w:num>
+  <w:num w:numId="4" w16cid:durableId="863010032">
+    <w:abstractNumId w:val="15"/>
+  </w:num>
+  <w:num w:numId="5" w16cid:durableId="2137480602">
+    <w:abstractNumId w:val="27"/>
+  </w:num>
+  <w:num w:numId="6" w16cid:durableId="828447545">
+    <w:abstractNumId w:val="28"/>
+  </w:num>
+  <w:num w:numId="7" w16cid:durableId="1736388261">
+    <w:abstractNumId w:val="18"/>
+  </w:num>
+  <w:num w:numId="8" w16cid:durableId="97876124">
+    <w:abstractNumId w:val="11"/>
+  </w:num>
+  <w:num w:numId="9" w16cid:durableId="1702824430">
+    <w:abstractNumId w:val="17"/>
+  </w:num>
+  <w:num w:numId="10" w16cid:durableId="1657224392">
     <w:abstractNumId w:val="13"/>
   </w:num>
-  <w:num w:numId="4" w16cid:durableId="863010032">
-    <w:abstractNumId w:val="12"/>
+  <w:num w:numId="11" w16cid:durableId="602345971">
+    <w:abstractNumId w:val="6"/>
   </w:num>
-  <w:num w:numId="5" w16cid:durableId="2137480602">
-    <w:abstractNumId w:val="24"/>
+  <w:num w:numId="12" w16cid:durableId="1246308174">
+    <w:abstractNumId w:val="20"/>
   </w:num>
-  <w:num w:numId="6" w16cid:durableId="828447545">
-    <w:abstractNumId w:val="25"/>
-  </w:num>
-  <w:num w:numId="7" w16cid:durableId="1736388261">
-    <w:abstractNumId w:val="15"/>
-  </w:num>
-  <w:num w:numId="8" w16cid:durableId="97876124">
+  <w:num w:numId="13" w16cid:durableId="2001496677">
     <w:abstractNumId w:val="10"/>
   </w:num>
-  <w:num w:numId="9" w16cid:durableId="1702824430">
-    <w:abstractNumId w:val="14"/>
-  </w:num>
-  <w:num w:numId="10" w16cid:durableId="1657224392">
-    <w:abstractNumId w:val="11"/>
-  </w:num>
-  <w:num w:numId="11" w16cid:durableId="602345971">
-    <w:abstractNumId w:val="5"/>
-  </w:num>
-  <w:num w:numId="12" w16cid:durableId="1246308174">
-    <w:abstractNumId w:val="17"/>
-  </w:num>
-  <w:num w:numId="13" w16cid:durableId="2001496677">
-    <w:abstractNumId w:val="9"/>
-  </w:num>
   <w:num w:numId="14" w16cid:durableId="283846998">
-    <w:abstractNumId w:val="21"/>
+    <w:abstractNumId w:val="24"/>
   </w:num>
   <w:num w:numId="15" w16cid:durableId="377167331">
     <w:abstractNumId w:val="3"/>
@@ -9977,34 +11252,43 @@
     <w:abstractNumId w:val="2"/>
   </w:num>
   <w:num w:numId="17" w16cid:durableId="1059207488">
-    <w:abstractNumId w:val="16"/>
+    <w:abstractNumId w:val="19"/>
   </w:num>
   <w:num w:numId="18" w16cid:durableId="1899901772">
-    <w:abstractNumId w:val="7"/>
+    <w:abstractNumId w:val="8"/>
   </w:num>
   <w:num w:numId="19" w16cid:durableId="2105883544">
-    <w:abstractNumId w:val="19"/>
+    <w:abstractNumId w:val="22"/>
   </w:num>
   <w:num w:numId="20" w16cid:durableId="2042972934">
-    <w:abstractNumId w:val="23"/>
+    <w:abstractNumId w:val="26"/>
   </w:num>
   <w:num w:numId="21" w16cid:durableId="156969398">
-    <w:abstractNumId w:val="18"/>
+    <w:abstractNumId w:val="21"/>
   </w:num>
   <w:num w:numId="22" w16cid:durableId="154421839">
-    <w:abstractNumId w:val="22"/>
+    <w:abstractNumId w:val="25"/>
   </w:num>
   <w:num w:numId="23" w16cid:durableId="1211307490">
     <w:abstractNumId w:val="4"/>
   </w:num>
   <w:num w:numId="24" w16cid:durableId="1871457839">
-    <w:abstractNumId w:val="8"/>
+    <w:abstractNumId w:val="9"/>
   </w:num>
   <w:num w:numId="25" w16cid:durableId="324280771">
     <w:abstractNumId w:val="0"/>
   </w:num>
   <w:num w:numId="26" w16cid:durableId="1008017940">
-    <w:abstractNumId w:val="20"/>
+    <w:abstractNumId w:val="23"/>
+  </w:num>
+  <w:num w:numId="27" w16cid:durableId="873267593">
+    <w:abstractNumId w:val="14"/>
+  </w:num>
+  <w:num w:numId="28" w16cid:durableId="1690453350">
+    <w:abstractNumId w:val="5"/>
+  </w:num>
+  <w:num w:numId="29" w16cid:durableId="399403716">
+    <w:abstractNumId w:val="12"/>
   </w:num>
 </w:numbering>
 </file>

</xml_diff>